<commit_message>
Psicoanálisis: Word del 2.º parcial con el formato nuevo
Las 8 guías del parcial se vuelven a exportar con la plantilla nueva:
márgenes estrechos con 3 cm para notas, texto justificado, tablas a la
izquierda, recuadros de color e índice.

Co-Authored-By: Claude Opus 5.5 <noreply@anthropic.com>
</commit_message>
<xml_diff>
--- a/2do Año/Psicoanálisis/3_Guias_de_Estudio/C13_EstructuraYTiemposDeLaNeurosis_Guia.docx
+++ b/2do Año/Psicoanálisis/3_Guias_de_Estudio/C13_EstructuraYTiemposDeLaNeurosis_Guia.docx
@@ -2,6 +2,32 @@
 <file path=word/document.xml><?xml version="1.0" encoding="utf-8"?>
 <w:document xmlns:w="http://schemas.openxmlformats.org/wordprocessingml/2006/main" xmlns:m="http://schemas.openxmlformats.org/officeDocument/2006/math" xmlns:r="http://schemas.openxmlformats.org/officeDocument/2006/relationships" xmlns:o="urn:schemas-microsoft-com:office:office" xmlns:v="urn:schemas-microsoft-com:vml" xmlns:w10="urn:schemas-microsoft-com:office:word" xmlns:a="http://schemas.openxmlformats.org/drawingml/2006/main" xmlns:pic="http://schemas.openxmlformats.org/drawingml/2006/picture" xmlns:wp="http://schemas.openxmlformats.org/drawingml/2006/wordprocessingDrawing">
   <w:body>
+    <w:sdt>
+      <w:sdtPr>
+        <w:docPartObj>
+          <w:docPartGallery w:val="Table of Contents"/>
+          <w:docPartUnique/>
+        </w:docPartObj>
+      </w:sdtPr>
+      <w:sdtContent>
+        <w:p>
+          <w:pPr>
+            <w:pStyle w:val="TOCHeading"/>
+          </w:pPr>
+          <w:r>
+            <w:t xml:space="preserve">Índice</w:t>
+          </w:r>
+        </w:p>
+        <w:p>
+          <w:r>
+            <w:fldChar w:fldCharType="begin" w:dirty="true"/>
+            <w:instrText xml:space="preserve">TOC \o "1-2" \h \z \u</w:instrText>
+            <w:fldChar w:fldCharType="separate"/>
+            <w:fldChar w:fldCharType="end"/>
+          </w:r>
+        </w:p>
+      </w:sdtContent>
+    </w:sdt>
     <w:bookmarkStart w:id="48" w:name="c13-estructura-y-tiempos-de-la-neurosis"/>
     <w:p>
       <w:pPr>
@@ -13,7 +39,7 @@
     </w:p>
     <w:p>
       <w:pPr>
-        <w:pStyle w:val="BlockText"/>
+        <w:pStyle w:val="RecuadroFuente"/>
       </w:pPr>
       <w:r>
         <w:rPr>
@@ -111,7 +137,7 @@
     </w:p>
     <w:p>
       <w:pPr>
-        <w:pStyle w:val="BlockText"/>
+        <w:pStyle w:val="RecuadroFuente"/>
       </w:pPr>
       <w:r>
         <w:rPr>
@@ -173,7 +199,7 @@
     </w:p>
     <w:p>
       <w:pPr>
-        <w:pStyle w:val="BlockText"/>
+        <w:pStyle w:val="RecuadroIdea"/>
       </w:pPr>
       <w:r>
         <w:rPr>
@@ -1181,6 +1207,7 @@
     <w:p>
       <w:pPr>
         <w:pStyle w:val="Heading2"/>
+        <w:pageBreakBefore/>
       </w:pPr>
       <w:r>
         <w:t xml:space="preserve">1. Primera pregunta — La fórmula canónica: los tiempos de la neurosis</w:t>
@@ -2107,6 +2134,7 @@
           <w:p>
             <w:pPr>
               <w:pStyle w:val="Compact"/>
+              <w:jc w:val="left"/>
             </w:pPr>
           </w:p>
         </w:tc>
@@ -2115,6 +2143,7 @@
           <w:p>
             <w:pPr>
               <w:pStyle w:val="Compact"/>
+              <w:jc w:val="left"/>
             </w:pPr>
             <w:r>
               <w:rPr>
@@ -2130,6 +2159,7 @@
           <w:p>
             <w:pPr>
               <w:pStyle w:val="Compact"/>
+              <w:jc w:val="left"/>
             </w:pPr>
             <w:r>
               <w:rPr>
@@ -2145,6 +2175,7 @@
           <w:p>
             <w:pPr>
               <w:pStyle w:val="Compact"/>
+              <w:jc w:val="left"/>
             </w:pPr>
             <w:r>
               <w:rPr>
@@ -2162,6 +2193,7 @@
           <w:p>
             <w:pPr>
               <w:pStyle w:val="Compact"/>
+              <w:jc w:val="left"/>
             </w:pPr>
             <w:r>
               <w:t xml:space="preserve">Qué hace el yo</w:t>
@@ -2173,6 +2205,7 @@
           <w:p>
             <w:pPr>
               <w:pStyle w:val="Compact"/>
+              <w:jc w:val="left"/>
             </w:pPr>
             <w:r>
               <w:t xml:space="preserve">Traspone a lo corporal la suma de excitación (</w:t>
@@ -2194,6 +2227,7 @@
           <w:p>
             <w:pPr>
               <w:pStyle w:val="Compact"/>
+              <w:jc w:val="left"/>
             </w:pPr>
             <w:r>
               <w:t xml:space="preserve">El afecto liberado permanece en lo psíquico y se adhiere a otras representaciones no inconciliables:</w:t>
@@ -2221,6 +2255,7 @@
           <w:p>
             <w:pPr>
               <w:pStyle w:val="Compact"/>
+              <w:jc w:val="left"/>
             </w:pPr>
             <w:r>
               <w:t xml:space="preserve">El yo</w:t>
@@ -2260,6 +2295,7 @@
           <w:p>
             <w:pPr>
               <w:pStyle w:val="Compact"/>
+              <w:jc w:val="left"/>
             </w:pPr>
             <w:r>
               <w:t xml:space="preserve">Condición</w:t>
@@ -2271,6 +2307,7 @@
           <w:p>
             <w:pPr>
               <w:pStyle w:val="Compact"/>
+              <w:jc w:val="left"/>
             </w:pPr>
             <w:r>
               <w:rPr>
@@ -2292,6 +2329,7 @@
           <w:p>
             <w:pPr>
               <w:pStyle w:val="Compact"/>
+              <w:jc w:val="left"/>
             </w:pPr>
             <w:r>
               <w:t xml:space="preserve">Ausencia de capacidad convertidora en persona predispuesta (p. 9)</w:t>
@@ -2303,6 +2341,7 @@
           <w:p>
             <w:pPr>
               <w:pStyle w:val="Compact"/>
+              <w:jc w:val="left"/>
             </w:pPr>
             <w:r>
               <w:t xml:space="preserve">«Predisposición patológica de grado más alto» (p. 16)</w:t>
@@ -2316,6 +2355,7 @@
           <w:p>
             <w:pPr>
               <w:pStyle w:val="Compact"/>
+              <w:jc w:val="left"/>
             </w:pPr>
             <w:r>
               <w:t xml:space="preserve">Qué queda</w:t>
@@ -2327,6 +2367,7 @@
           <w:p>
             <w:pPr>
               <w:pStyle w:val="Compact"/>
+              <w:jc w:val="left"/>
             </w:pPr>
             <w:r>
               <w:rPr>
@@ -2364,6 +2405,7 @@
           <w:p>
             <w:pPr>
               <w:pStyle w:val="Compact"/>
+              <w:jc w:val="left"/>
             </w:pPr>
             <w:r>
               <w:t xml:space="preserve">La representación reprimida forma también el núcleo de un grupo psíquico segundo, accesible incluso sin hipnosis (p. 12)</w:t>
@@ -2375,6 +2417,7 @@
           <w:p>
             <w:pPr>
               <w:pStyle w:val="Compact"/>
+              <w:jc w:val="left"/>
             </w:pPr>
             <w:r>
               <w:t xml:space="preserve">El contenido de la psicosis «consiste justamente en realzar aquella representación que estuvo amenazada» (p. 16)</w:t>
@@ -2388,6 +2431,7 @@
           <w:p>
             <w:pPr>
               <w:pStyle w:val="Compact"/>
+              <w:jc w:val="left"/>
             </w:pPr>
             <w:r>
               <w:t xml:space="preserve">Ventaja para el yo</w:t>
@@ -2399,6 +2443,7 @@
           <w:p>
             <w:pPr>
               <w:pStyle w:val="Compact"/>
+              <w:jc w:val="left"/>
             </w:pPr>
             <w:r>
               <w:t xml:space="preserve">Queda «exento de contradicción», pero paga el lastre del símbolo (p. 7)</w:t>
@@ -2410,6 +2455,7 @@
           <w:p>
             <w:pPr>
               <w:pStyle w:val="Compact"/>
+              <w:jc w:val="left"/>
             </w:pPr>
             <w:r>
               <w:rPr>
@@ -2431,6 +2477,7 @@
           <w:p>
             <w:pPr>
               <w:pStyle w:val="Compact"/>
+              <w:jc w:val="left"/>
             </w:pPr>
             <w:r>
               <w:t xml:space="preserve">Escapa de la representación, pero se desase también «total o parcialmente de la realidad objetiva» (p. 16)</w:t>
@@ -2444,6 +2491,7 @@
           <w:p>
             <w:pPr>
               <w:pStyle w:val="Compact"/>
+              <w:jc w:val="left"/>
             </w:pPr>
             <w:r>
               <w:t xml:space="preserve">Efecto</w:t>
@@ -2455,6 +2503,7 @@
           <w:p>
             <w:pPr>
               <w:pStyle w:val="Compact"/>
+              <w:jc w:val="left"/>
             </w:pPr>
             <w:r>
               <w:t xml:space="preserve">Estado lábil: la excitación vuelve a la representación y se descarga en</w:t>
@@ -2482,6 +2531,7 @@
           <w:p>
             <w:pPr>
               <w:pStyle w:val="Compact"/>
+              <w:jc w:val="left"/>
             </w:pPr>
             <w:r>
               <w:t xml:space="preserve">Síntomas menos llamativos porque «la alteración íntegra ha permanecido en el ámbito psíquico» (p. 12)</w:t>
@@ -2493,6 +2543,7 @@
           <w:p>
             <w:pPr>
               <w:pStyle w:val="Compact"/>
+              <w:jc w:val="left"/>
             </w:pPr>
             <w:r>
               <w:t xml:space="preserve">«Confusión alucinatoria»: vivida como un «dichoso sueño» (pp. 15-16)</w:t>
@@ -3293,7 +3344,7 @@
     </w:p>
     <w:p>
       <w:pPr>
-        <w:pStyle w:val="BlockText"/>
+        <w:pStyle w:val="RecuadroClave"/>
       </w:pPr>
       <w:r>
         <w:t xml:space="preserve">🔑</w:t>
@@ -3361,6 +3412,7 @@
     <w:p>
       <w:pPr>
         <w:pStyle w:val="Heading2"/>
+        <w:pageBreakBefore/>
       </w:pPr>
       <w:r>
         <w:t xml:space="preserve">2. Segunda pregunta — Estructura y tiempos: las series complementarias</w:t>
@@ -4849,7 +4901,7 @@
     </w:p>
     <w:p>
       <w:pPr>
-        <w:pStyle w:val="BlockText"/>
+        <w:pStyle w:val="RecuadroClave"/>
       </w:pPr>
       <w:r>
         <w:t xml:space="preserve">🔑</w:t>
@@ -4933,6 +4985,7 @@
     <w:p>
       <w:pPr>
         <w:pStyle w:val="Heading2"/>
+        <w:pageBreakBefore/>
       </w:pPr>
       <w:r>
         <w:t xml:space="preserve">3. Tercera pregunta — El lugar del síntoma y los caminos de su formación</w:t>
@@ -6485,7 +6538,7 @@
     </w:p>
     <w:p>
       <w:pPr>
-        <w:pStyle w:val="BlockText"/>
+        <w:pStyle w:val="RecuadroClave"/>
       </w:pPr>
       <w:r>
         <w:t xml:space="preserve">🔑</w:t>
@@ -6534,6 +6587,7 @@
     <w:p>
       <w:pPr>
         <w:pStyle w:val="Heading2"/>
+        <w:pageBreakBefore/>
       </w:pPr>
       <w:r>
         <w:t xml:space="preserve">4. Estructura, defensa y diagnóstico (marco de la clase, T01 pp. 1-4 y apuntes)</w:t>
@@ -6867,6 +6921,7 @@
           <w:p>
             <w:pPr>
               <w:pStyle w:val="Compact"/>
+              <w:jc w:val="left"/>
             </w:pPr>
             <w:r>
               <w:t xml:space="preserve">Estructura</w:t>
@@ -6878,6 +6933,7 @@
           <w:p>
             <w:pPr>
               <w:pStyle w:val="Compact"/>
+              <w:jc w:val="left"/>
             </w:pPr>
             <w:r>
               <w:t xml:space="preserve">Mecanismo de defensa constitutivo</w:t>
@@ -6889,6 +6945,7 @@
           <w:p>
             <w:pPr>
               <w:pStyle w:val="Compact"/>
+              <w:jc w:val="left"/>
             </w:pPr>
             <w:r>
               <w:t xml:space="preserve">Tus apuntes</w:t>
@@ -6902,6 +6959,7 @@
           <w:p>
             <w:pPr>
               <w:pStyle w:val="Compact"/>
+              <w:jc w:val="left"/>
             </w:pPr>
             <w:r>
               <w:rPr>
@@ -6917,6 +6975,7 @@
           <w:p>
             <w:pPr>
               <w:pStyle w:val="Compact"/>
+              <w:jc w:val="left"/>
             </w:pPr>
             <w:r>
               <w:t xml:space="preserve">Represión (metáfora paterna)</w:t>
@@ -6928,6 +6987,7 @@
           <w:p>
             <w:pPr>
               <w:pStyle w:val="Compact"/>
+              <w:jc w:val="left"/>
             </w:pPr>
             <w:r>
               <w:t xml:space="preserve">Tiene deseo, el deseo del Otro; se ubica en el Otro en falta</w:t>
@@ -6941,6 +7001,7 @@
           <w:p>
             <w:pPr>
               <w:pStyle w:val="Compact"/>
+              <w:jc w:val="left"/>
             </w:pPr>
             <w:r>
               <w:rPr>
@@ -6956,6 +7017,7 @@
           <w:p>
             <w:pPr>
               <w:pStyle w:val="Compact"/>
+              <w:jc w:val="left"/>
             </w:pPr>
             <w:r>
               <w:t xml:space="preserve">Forclusión del Nombre-del-Padre (no inscripción de la «ley»)</w:t>
@@ -6967,6 +7029,7 @@
           <w:p>
             <w:pPr>
               <w:pStyle w:val="Compact"/>
+              <w:jc w:val="left"/>
             </w:pPr>
             <w:r>
               <w:t xml:space="preserve">Ve el goce del Otro como algo que lo invade (de ahí voces imaginarias)</w:t>
@@ -6980,6 +7043,7 @@
           <w:p>
             <w:pPr>
               <w:pStyle w:val="Compact"/>
+              <w:jc w:val="left"/>
             </w:pPr>
             <w:r>
               <w:rPr>
@@ -6995,6 +7059,7 @@
           <w:p>
             <w:pPr>
               <w:pStyle w:val="Compact"/>
+              <w:jc w:val="left"/>
             </w:pPr>
             <w:r>
               <w:t xml:space="preserve">Desmentida</w:t>
@@ -7006,6 +7071,7 @@
           <w:p>
             <w:pPr>
               <w:pStyle w:val="Compact"/>
+              <w:jc w:val="left"/>
             </w:pPr>
             <w:r>
               <w:t xml:space="preserve">Pretende sostener un goce eficaz donde hay falta</w:t>
@@ -7069,6 +7135,7 @@
     <w:p>
       <w:pPr>
         <w:pStyle w:val="Heading2"/>
+        <w:pageBreakBefore/>
       </w:pPr>
       <w:r>
         <w:t xml:space="preserve">Diagrama</w:t>
@@ -7446,6 +7513,7 @@
           <w:p>
             <w:pPr>
               <w:pStyle w:val="Compact"/>
+              <w:jc w:val="left"/>
             </w:pPr>
             <w:r>
               <w:t xml:space="preserve">Va hacia / viene de</w:t>
@@ -7457,6 +7525,7 @@
           <w:p>
             <w:pPr>
               <w:pStyle w:val="Compact"/>
+              <w:jc w:val="left"/>
             </w:pPr>
             <w:r>
               <w:t xml:space="preserve">Cómo se conecta</w:t>
@@ -7470,6 +7539,7 @@
           <w:p>
             <w:pPr>
               <w:pStyle w:val="Compact"/>
+              <w:jc w:val="left"/>
             </w:pPr>
             <w:r>
               <w:rPr>
@@ -7484,6 +7554,7 @@
           <w:p>
             <w:pPr>
               <w:pStyle w:val="Compact"/>
+              <w:jc w:val="left"/>
             </w:pPr>
             <w:r>
               <w:t xml:space="preserve">La defensa, de la represión de 1894 a la ampliación de 1926</w:t>
@@ -7497,6 +7568,7 @@
           <w:p>
             <w:pPr>
               <w:pStyle w:val="Compact"/>
+              <w:jc w:val="left"/>
             </w:pPr>
             <w:r>
               <w:rPr>
@@ -7511,6 +7583,7 @@
           <w:p>
             <w:pPr>
               <w:pStyle w:val="Compact"/>
+              <w:jc w:val="left"/>
             </w:pPr>
             <w:r>
               <w:t xml:space="preserve">El síntoma como respuesta a la angustia; la fantasía como eslabón (T04) retomada por Lacan</w:t>
@@ -7524,6 +7597,7 @@
           <w:p>
             <w:pPr>
               <w:pStyle w:val="Compact"/>
+              <w:jc w:val="left"/>
             </w:pPr>
             <w:r>
               <w:rPr>
@@ -7538,6 +7612,7 @@
           <w:p>
             <w:pPr>
               <w:pStyle w:val="Compact"/>
+              <w:jc w:val="left"/>
             </w:pPr>
             <w:r>
               <w:t xml:space="preserve">Los destinos del afecto de 1894 se vuelven modalidades clínicas</w:t>
@@ -7551,6 +7626,7 @@
           <w:p>
             <w:pPr>
               <w:pStyle w:val="Compact"/>
+              <w:jc w:val="left"/>
             </w:pPr>
             <w:r>
               <w:rPr>
@@ -7565,6 +7641,7 @@
           <w:p>
             <w:pPr>
               <w:pStyle w:val="Compact"/>
+              <w:jc w:val="left"/>
             </w:pPr>
             <w:r>
               <w:t xml:space="preserve">La</w:t>
@@ -7594,6 +7671,7 @@
           <w:p>
             <w:pPr>
               <w:pStyle w:val="Compact"/>
+              <w:jc w:val="left"/>
             </w:pPr>
             <w:r>
               <w:rPr>
@@ -7608,6 +7686,7 @@
           <w:p>
             <w:pPr>
               <w:pStyle w:val="Compact"/>
+              <w:jc w:val="left"/>
             </w:pPr>
             <w:r>
               <w:t xml:space="preserve">Complejo nuclear de las neurosis, fantasías primordiales</w:t>
@@ -7646,6 +7725,7 @@
           <w:p>
             <w:pPr>
               <w:pStyle w:val="Compact"/>
+              <w:jc w:val="left"/>
             </w:pPr>
             <w:r>
               <w:t xml:space="preserve">Término</w:t>
@@ -7657,6 +7737,7 @@
           <w:p>
             <w:pPr>
               <w:pStyle w:val="Compact"/>
+              <w:jc w:val="left"/>
             </w:pPr>
             <w:r>
               <w:t xml:space="preserve">Definición breve</w:t>
@@ -7670,6 +7751,7 @@
           <w:p>
             <w:pPr>
               <w:pStyle w:val="Compact"/>
+              <w:jc w:val="left"/>
             </w:pPr>
             <w:r>
               <w:rPr>
@@ -7701,6 +7783,7 @@
           <w:p>
             <w:pPr>
               <w:pStyle w:val="Compact"/>
+              <w:jc w:val="left"/>
             </w:pPr>
             <w:r>
               <w:t xml:space="preserve">Carácter de una representación/vivencia que despierta un afecto tan penoso que el yo no puede conciliarla con su vida de representaciones (T02, p. 5)</w:t>
@@ -7714,6 +7797,7 @@
           <w:p>
             <w:pPr>
               <w:pStyle w:val="Compact"/>
+              <w:jc w:val="left"/>
             </w:pPr>
             <w:r>
               <w:rPr>
@@ -7729,6 +7813,7 @@
           <w:p>
             <w:pPr>
               <w:pStyle w:val="Compact"/>
+              <w:jc w:val="left"/>
             </w:pPr>
             <w:r>
               <w:t xml:space="preserve">Operación del yo contra la representación inconciliable; primero concepto freudiano (1894), luego equivalente a represión, ampliado en 1926 (T03, p. 1)</w:t>
@@ -7742,6 +7827,7 @@
           <w:p>
             <w:pPr>
               <w:pStyle w:val="Compact"/>
+              <w:jc w:val="left"/>
             </w:pPr>
             <w:r>
               <w:rPr>
@@ -7757,6 +7843,7 @@
           <w:p>
             <w:pPr>
               <w:pStyle w:val="Compact"/>
+              <w:jc w:val="left"/>
             </w:pPr>
             <w:r>
               <w:t xml:space="preserve">Trasposición de la suma de excitación a lo corporal; rasgo característico de la histeria (T02, pp. 6-8)</w:t>
@@ -7770,6 +7857,7 @@
           <w:p>
             <w:pPr>
               <w:pStyle w:val="Compact"/>
+              <w:jc w:val="left"/>
             </w:pPr>
             <w:r>
               <w:rPr>
@@ -7785,6 +7873,7 @@
           <w:p>
             <w:pPr>
               <w:pStyle w:val="Compact"/>
+              <w:jc w:val="left"/>
             </w:pPr>
             <w:r>
               <w:t xml:space="preserve">Adhesión del afecto liberado a otra representación no inconciliable; origen de la representación obsesiva (T02, p. 9)</w:t>
@@ -7798,6 +7887,7 @@
           <w:p>
             <w:pPr>
               <w:pStyle w:val="Compact"/>
+              <w:jc w:val="left"/>
             </w:pPr>
             <w:r>
               <w:rPr>
@@ -7829,6 +7919,7 @@
           <w:p>
             <w:pPr>
               <w:pStyle w:val="Compact"/>
+              <w:jc w:val="left"/>
             </w:pPr>
             <w:r>
               <w:t xml:space="preserve">Rechazo de la representación con su afecto; conduce a psicosis alucinatoria (T02, p. 15)</w:t>
@@ -7842,6 +7933,7 @@
           <w:p>
             <w:pPr>
               <w:pStyle w:val="Compact"/>
+              <w:jc w:val="left"/>
             </w:pPr>
             <w:r>
               <w:rPr>
@@ -7857,6 +7949,7 @@
           <w:p>
             <w:pPr>
               <w:pStyle w:val="Compact"/>
+              <w:jc w:val="left"/>
             </w:pPr>
             <w:r>
               <w:t xml:space="preserve">Marca constitutiva de la defensa (Manuscrito K), independiente de síntomas clínicos (T01, p. 4)</w:t>
@@ -7870,6 +7963,7 @@
           <w:p>
             <w:pPr>
               <w:pStyle w:val="Compact"/>
+              <w:jc w:val="left"/>
             </w:pPr>
             <w:r>
               <w:rPr>
@@ -7885,6 +7979,7 @@
           <w:p>
             <w:pPr>
               <w:pStyle w:val="Compact"/>
+              <w:jc w:val="left"/>
             </w:pPr>
             <w:r>
               <w:t xml:space="preserve">Acceso a la conciencia de lo reprimido por un sustituto (T03, p. 3)</w:t>
@@ -7898,6 +7993,7 @@
           <w:p>
             <w:pPr>
               <w:pStyle w:val="Compact"/>
+              <w:jc w:val="left"/>
             </w:pPr>
             <w:r>
               <w:rPr>
@@ -7913,6 +8009,7 @@
           <w:p>
             <w:pPr>
               <w:pStyle w:val="Compact"/>
+              <w:jc w:val="left"/>
             </w:pPr>
             <w:r>
               <w:t xml:space="preserve">Esquema causal: constitución + vivenciar infantil → fijación; fijación + vivenciar accidental → neurosis (T04)</w:t>
@@ -7926,6 +8023,7 @@
           <w:p>
             <w:pPr>
               <w:pStyle w:val="Compact"/>
+              <w:jc w:val="left"/>
             </w:pPr>
             <w:r>
               <w:rPr>
@@ -7941,6 +8039,7 @@
           <w:p>
             <w:pPr>
               <w:pStyle w:val="Compact"/>
+              <w:jc w:val="left"/>
             </w:pPr>
             <w:r>
               <w:t xml:space="preserve">Inmovilización de un monto de libido en un punto del desarrollo (T03, p. 4; T04)</w:t>
@@ -7954,6 +8053,7 @@
           <w:p>
             <w:pPr>
               <w:pStyle w:val="Compact"/>
+              <w:jc w:val="left"/>
             </w:pPr>
             <w:r>
               <w:rPr>
@@ -7969,6 +8069,7 @@
           <w:p>
             <w:pPr>
               <w:pStyle w:val="Compact"/>
+              <w:jc w:val="left"/>
             </w:pPr>
             <w:r>
               <w:t xml:space="preserve">«Mal funcionamiento»: una colocación libidinal antes posible deja de serlo (T01, p. 36)</w:t>
@@ -7982,6 +8083,7 @@
           <w:p>
             <w:pPr>
               <w:pStyle w:val="Compact"/>
+              <w:jc w:val="left"/>
             </w:pPr>
             <w:r>
               <w:rPr>
@@ -7997,6 +8099,7 @@
           <w:p>
             <w:pPr>
               <w:pStyle w:val="Compact"/>
+              <w:jc w:val="left"/>
             </w:pPr>
             <w:r>
               <w:t xml:space="preserve">Retorno a modos de funcionamiento y satisfacción anteriores (T03, p. 3)</w:t>
@@ -8010,6 +8113,7 @@
           <w:p>
             <w:pPr>
               <w:pStyle w:val="Compact"/>
+              <w:jc w:val="left"/>
             </w:pPr>
             <w:r>
               <w:rPr>
@@ -8025,6 +8129,7 @@
           <w:p>
             <w:pPr>
               <w:pStyle w:val="Compact"/>
+              <w:jc w:val="left"/>
             </w:pPr>
             <w:r>
               <w:t xml:space="preserve">Extrañamiento de la libido de la satisfacción real y sobreinvestidura de fantasías (T04)</w:t>
@@ -8038,6 +8143,7 @@
           <w:p>
             <w:pPr>
               <w:pStyle w:val="Compact"/>
+              <w:jc w:val="left"/>
             </w:pPr>
             <w:r>
               <w:rPr>
@@ -8053,6 +8159,7 @@
           <w:p>
             <w:pPr>
               <w:pStyle w:val="Compact"/>
+              <w:jc w:val="left"/>
             </w:pPr>
             <w:r>
               <w:t xml:space="preserve">Realidad de la fantasía, decisiva en el mundo de las neurosis (T04)</w:t>
@@ -8066,6 +8173,7 @@
           <w:p>
             <w:pPr>
               <w:pStyle w:val="Compact"/>
+              <w:jc w:val="left"/>
             </w:pPr>
             <w:r>
               <w:rPr>
@@ -8081,6 +8189,7 @@
           <w:p>
             <w:pPr>
               <w:pStyle w:val="Compact"/>
+              <w:jc w:val="left"/>
             </w:pPr>
             <w:r>
               <w:t xml:space="preserve">Seducción, escena primordial, castración: patrimonio filogenético (T04)</w:t>
@@ -8255,7 +8364,10 @@
     <w:bookmarkEnd w:id="47"/>
     <w:bookmarkEnd w:id="48"/>
     <w:sectPr>
-      <w:pgMar w:bottom="1134" w:left="1247" w:right="1247" w:top="1134"/>
+      <w:headerReference r:id="rIdHdr1" w:type="default"/>
+      <w:footerReference r:id="rIdFtr1" w:type="default"/>
+      <w:pgSz w:h="16838" w:w="11906"/>
+      <w:pgMar w:bottom="720" w:footer="397" w:gutter="0" w:header="397" w:left="720" w:right="1701" w:top="720"/>
     </w:sectPr>
   </w:body>
 </w:document>
@@ -8265,6 +8377,49 @@
 <w:comments xmlns:w="http://schemas.openxmlformats.org/wordprocessingml/2006/main" xmlns:m="http://schemas.openxmlformats.org/officeDocument/2006/math" xmlns:r="http://schemas.openxmlformats.org/officeDocument/2006/relationships" xmlns:o="urn:schemas-microsoft-com:office:office" xmlns:v="urn:schemas-microsoft-com:vml" xmlns:w10="urn:schemas-microsoft-com:office:word" xmlns:a="http://schemas.openxmlformats.org/drawingml/2006/main" xmlns:pic="http://schemas.openxmlformats.org/drawingml/2006/picture" xmlns:wp="http://schemas.openxmlformats.org/drawingml/2006/wordprocessingDrawing"/>
 </file>
 
+<file path=word/footer1.xml><?xml version="1.0" encoding="utf-8"?>
+<w:ftr xmlns:w="http://schemas.openxmlformats.org/wordprocessingml/2006/main" xmlns:r="http://schemas.openxmlformats.org/officeDocument/2006/relationships">
+  <w:p>
+    <w:pPr>
+      <w:pStyle w:val="PieGuia"/>
+    </w:pPr>
+    <w:r>
+      <w:fldChar w:fldCharType="begin"/>
+    </w:r>
+    <w:r>
+      <w:instrText xml:space="preserve"> PAGE </w:instrText>
+    </w:r>
+    <w:r>
+      <w:fldChar w:fldCharType="separate"/>
+    </w:r>
+    <w:r>
+      <w:t>1</w:t>
+    </w:r>
+    <w:r>
+      <w:fldChar w:fldCharType="end"/>
+    </w:r>
+    <w:r>
+      <w:t xml:space="preserve"> / </w:t>
+    </w:r>
+    <w:r>
+      <w:fldChar w:fldCharType="begin"/>
+    </w:r>
+    <w:r>
+      <w:instrText xml:space="preserve"> NUMPAGES </w:instrText>
+    </w:r>
+    <w:r>
+      <w:fldChar w:fldCharType="separate"/>
+    </w:r>
+    <w:r>
+      <w:t>1</w:t>
+    </w:r>
+    <w:r>
+      <w:fldChar w:fldCharType="end"/>
+    </w:r>
+  </w:p>
+</w:ftr>
+</file>
+
 <file path=word/footnotes.xml><?xml version="1.0" encoding="utf-8"?>
 <w:footnotes xmlns:w="http://schemas.openxmlformats.org/wordprocessingml/2006/main" xmlns:m="http://schemas.openxmlformats.org/officeDocument/2006/math" xmlns:r="http://schemas.openxmlformats.org/officeDocument/2006/relationships" xmlns:o="urn:schemas-microsoft-com:office:office" xmlns:v="urn:schemas-microsoft-com:vml" xmlns:w10="urn:schemas-microsoft-com:office:word" xmlns:a="http://schemas.openxmlformats.org/drawingml/2006/main" xmlns:pic="http://schemas.openxmlformats.org/drawingml/2006/picture" xmlns:wp="http://schemas.openxmlformats.org/drawingml/2006/wordprocessingDrawing">
   <w:footnote w:type="continuationSeparator" w:id="0">
@@ -8282,6 +8437,19 @@
     </w:p>
   </w:footnote>
 </w:footnotes>
+</file>
+
+<file path=word/header1.xml><?xml version="1.0" encoding="utf-8"?>
+<w:hdr xmlns:w="http://schemas.openxmlformats.org/wordprocessingml/2006/main" xmlns:r="http://schemas.openxmlformats.org/officeDocument/2006/relationships">
+  <w:p>
+    <w:pPr>
+      <w:pStyle w:val="EncabezadoGuia"/>
+    </w:pPr>
+    <w:r>
+      <w:t xml:space="preserve">C13 — Estructura y tiempos de la neurosis</w:t>
+    </w:r>
+  </w:p>
+</w:hdr>
 </file>
 
 <file path=word/numbering.xml><?xml version="1.0" encoding="utf-8"?>
@@ -8756,6 +8924,7 @@
     <w:qFormat/>
     <w:pPr>
       <w:spacing w:after="120" w:line="276" w:lineRule="auto"/>
+      <w:jc w:val="both"/>
     </w:pPr>
     <w:rPr>
       <w:rFonts w:ascii="Calibri" w:hAnsi="Calibri"/>
@@ -8813,7 +8982,7 @@
       <w:keepNext/>
       <w:keepLines/>
       <w:spacing w:after="80" w:before="200"/>
-      <w:jc w:val="center"/>
+      <w:jc w:val="left"/>
     </w:pPr>
     <w:rPr>
       <w:rFonts w:ascii="Calibri" w:asciiTheme="majorHAnsi" w:cstheme="majorBidi" w:eastAsiaTheme="majorEastAsia" w:hAnsi="Calibri" w:hAnsiTheme="majorHAnsi"/>
@@ -8833,7 +9002,7 @@
       <w:keepNext/>
       <w:keepLines/>
       <w:spacing w:after="240" w:before="240"/>
-      <w:jc w:val="center"/>
+      <w:jc w:val="left"/>
     </w:pPr>
     <w:rPr>
       <w:sz w:val="30"/>
@@ -8847,7 +9016,7 @@
     <w:pPr>
       <w:keepNext/>
       <w:keepLines/>
-      <w:jc w:val="center"/>
+      <w:jc w:val="left"/>
     </w:pPr>
   </w:style>
   <w:style w:styleId="Date" w:type="paragraph">
@@ -8857,7 +9026,7 @@
     <w:pPr>
       <w:keepNext/>
       <w:keepLines/>
-      <w:jc w:val="center"/>
+      <w:jc w:val="left"/>
     </w:pPr>
   </w:style>
   <w:style w:customStyle="1" w:styleId="AbstractTitle" w:type="paragraph">
@@ -8868,8 +9037,8 @@
     <w:pPr>
       <w:keepNext/>
       <w:keepLines/>
-      <w:jc w:val="center"/>
       <w:spacing w:after="0" w:before="300"/>
+      <w:jc w:val="left"/>
     </w:pPr>
     <w:rPr>
       <w:sz w:val="20"/>
@@ -8912,6 +9081,7 @@
       <w:keepNext/>
       <w:keepLines/>
       <w:spacing w:after="80" w:before="280"/>
+      <w:jc w:val="left"/>
       <w:outlineLvl w:val="0"/>
     </w:pPr>
     <w:rPr>
@@ -8934,6 +9104,7 @@
       <w:keepNext/>
       <w:keepLines/>
       <w:spacing w:after="80" w:before="280"/>
+      <w:jc w:val="left"/>
       <w:outlineLvl w:val="1"/>
     </w:pPr>
     <w:rPr>
@@ -8956,6 +9127,7 @@
       <w:keepNext/>
       <w:keepLines/>
       <w:spacing w:after="80" w:before="200"/>
+      <w:jc w:val="left"/>
       <w:outlineLvl w:val="2"/>
     </w:pPr>
     <w:rPr>
@@ -8978,6 +9150,7 @@
       <w:keepNext/>
       <w:keepLines/>
       <w:spacing w:after="80" w:before="200"/>
+      <w:jc w:val="left"/>
       <w:outlineLvl w:val="3"/>
     </w:pPr>
     <w:rPr>
@@ -9001,6 +9174,7 @@
       <w:keepNext/>
       <w:keepLines/>
       <w:spacing w:after="0" w:before="200"/>
+      <w:jc w:val="left"/>
       <w:outlineLvl w:val="4"/>
     </w:pPr>
     <w:rPr>
@@ -9022,6 +9196,7 @@
       <w:keepNext/>
       <w:keepLines/>
       <w:spacing w:after="0" w:before="200"/>
+      <w:jc w:val="left"/>
       <w:outlineLvl w:val="5"/>
     </w:pPr>
     <w:rPr>
@@ -9042,6 +9217,7 @@
       <w:keepNext/>
       <w:keepLines/>
       <w:spacing w:after="0" w:before="200"/>
+      <w:jc w:val="left"/>
       <w:outlineLvl w:val="6"/>
     </w:pPr>
     <w:rPr>
@@ -9062,6 +9238,7 @@
       <w:keepNext/>
       <w:keepLines/>
       <w:spacing w:after="0" w:before="200"/>
+      <w:jc w:val="left"/>
       <w:outlineLvl w:val="7"/>
     </w:pPr>
     <w:rPr>
@@ -9082,6 +9259,7 @@
       <w:keepNext/>
       <w:keepLines/>
       <w:spacing w:after="0" w:before="200"/>
+      <w:jc w:val="left"/>
       <w:outlineLvl w:val="8"/>
     </w:pPr>
     <w:rPr>
@@ -9099,6 +9277,9 @@
     <w:unhideWhenUsed/>
     <w:qFormat/>
     <w:pPr>
+      <w:pBdr>
+        <w:left w:color="C9D1D9" w:space="8" w:sz="12" w:val="single"/>
+      </w:pBdr>
       <w:spacing w:after="100" w:before="100"/>
       <w:ind w:firstLine="0" w:left="454" w:right="480"/>
     </w:pPr>
@@ -9175,6 +9356,7 @@
     <w:link w:val="BodyTextChar"/>
     <w:pPr>
       <w:spacing w:after="120" w:before="0"/>
+      <w:jc w:val="left"/>
     </w:pPr>
     <w:rPr>
       <w:i/>
@@ -9187,6 +9369,7 @@
     <w:basedOn w:val="Caption"/>
     <w:pPr>
       <w:keepNext/>
+      <w:jc w:val="left"/>
     </w:pPr>
     <w:rPr>
       <w:color w:val="5D6B78"/>
@@ -9196,6 +9379,9 @@
   <w:style w:customStyle="1" w:styleId="ImageCaption" w:type="paragraph">
     <w:name w:val="Image Caption"/>
     <w:basedOn w:val="Caption"/>
+    <w:pPr>
+      <w:jc w:val="left"/>
+    </w:pPr>
     <w:rPr>
       <w:color w:val="5D6B78"/>
       <w:sz w:val="18"/>
@@ -9204,12 +9390,16 @@
   <w:style w:customStyle="1" w:styleId="Figure" w:type="paragraph">
     <w:name w:val="Figure"/>
     <w:basedOn w:val="Normal"/>
+    <w:pPr>
+      <w:jc w:val="center"/>
+    </w:pPr>
   </w:style>
   <w:style w:customStyle="1" w:styleId="CaptionedFigure" w:type="paragraph">
     <w:name w:val="Captioned Figure"/>
     <w:basedOn w:val="Figure"/>
     <w:pPr>
       <w:keepNext/>
+      <w:jc w:val="center"/>
     </w:pPr>
   </w:style>
   <w:style w:customStyle="1" w:styleId="BodyTextChar" w:type="character">
@@ -9252,6 +9442,7 @@
     <w:qFormat/>
     <w:pPr>
       <w:spacing w:before="240" w:line="259" w:lineRule="auto"/>
+      <w:jc w:val="left"/>
       <w:outlineLvl w:val="9"/>
     </w:pPr>
     <w:rPr>
@@ -9259,6 +9450,187 @@
       <w:b w:val="0"/>
       <w:bCs w:val="0"/>
       <w:color w:themeColor="accent1" w:themeShade="BF" w:val="365F91"/>
+    </w:rPr>
+  </w:style>
+  <w:style w:customStyle="1" w:styleId="RecuadroIdea" w:type="paragraph">
+    <w:name w:val="Recuadro Idea"/>
+    <w:basedOn w:val="BodyText"/>
+    <w:uiPriority w:val="10"/>
+    <w:qFormat/>
+    <w:pPr>
+      <w:pBdr>
+        <w:top w:color="EAF2FC" w:space="4" w:sz="4" w:val="single"/>
+        <w:left w:color="2F6DB5" w:space="8" w:sz="24" w:val="single"/>
+        <w:bottom w:color="EAF2FC" w:space="4" w:sz="4" w:val="single"/>
+        <w:right w:color="EAF2FC" w:space="8" w:sz="4" w:val="single"/>
+      </w:pBdr>
+      <w:shd w:color="auto" w:fill="EAF2FC" w:val="clear"/>
+      <w:spacing w:after="40" w:before="40" w:line="264" w:lineRule="auto"/>
+      <w:ind w:left="227" w:right="227"/>
+    </w:pPr>
+    <w:rPr>
+      <w:color w:val="14202B"/>
+      <w:sz w:val="21"/>
+      <w:szCs w:val="21"/>
+    </w:rPr>
+  </w:style>
+  <w:style w:customStyle="1" w:styleId="RecuadroClave" w:type="paragraph">
+    <w:name w:val="Recuadro Clave"/>
+    <w:basedOn w:val="BodyText"/>
+    <w:uiPriority w:val="10"/>
+    <w:qFormat/>
+    <w:pPr>
+      <w:pBdr>
+        <w:top w:color="FFF6DC" w:space="4" w:sz="4" w:val="single"/>
+        <w:left w:color="D9A21B" w:space="8" w:sz="24" w:val="single"/>
+        <w:bottom w:color="FFF6DC" w:space="4" w:sz="4" w:val="single"/>
+        <w:right w:color="FFF6DC" w:space="8" w:sz="4" w:val="single"/>
+      </w:pBdr>
+      <w:shd w:color="auto" w:fill="FFF6DC" w:val="clear"/>
+      <w:spacing w:after="40" w:before="40" w:line="264" w:lineRule="auto"/>
+      <w:ind w:left="227" w:right="227"/>
+    </w:pPr>
+    <w:rPr>
+      <w:color w:val="14202B"/>
+      <w:sz w:val="21"/>
+      <w:szCs w:val="21"/>
+    </w:rPr>
+  </w:style>
+  <w:style w:customStyle="1" w:styleId="RecuadroParcial" w:type="paragraph">
+    <w:name w:val="Recuadro Parcial"/>
+    <w:basedOn w:val="BodyText"/>
+    <w:uiPriority w:val="10"/>
+    <w:qFormat/>
+    <w:pPr>
+      <w:pBdr>
+        <w:top w:color="E8F5EC" w:space="4" w:sz="4" w:val="single"/>
+        <w:left w:color="2E8B57" w:space="8" w:sz="24" w:val="single"/>
+        <w:bottom w:color="E8F5EC" w:space="4" w:sz="4" w:val="single"/>
+        <w:right w:color="E8F5EC" w:space="8" w:sz="4" w:val="single"/>
+      </w:pBdr>
+      <w:shd w:color="auto" w:fill="E8F5EC" w:val="clear"/>
+      <w:spacing w:after="40" w:before="40" w:line="264" w:lineRule="auto"/>
+      <w:ind w:left="227" w:right="227"/>
+    </w:pPr>
+    <w:rPr>
+      <w:color w:val="14202B"/>
+      <w:sz w:val="21"/>
+      <w:szCs w:val="21"/>
+    </w:rPr>
+  </w:style>
+  <w:style w:customStyle="1" w:styleId="RecuadroEsqueleto" w:type="paragraph">
+    <w:name w:val="Recuadro Esqueleto"/>
+    <w:basedOn w:val="BodyText"/>
+    <w:uiPriority w:val="10"/>
+    <w:qFormat/>
+    <w:pPr>
+      <w:pBdr>
+        <w:top w:color="E3F2F1" w:space="4" w:sz="4" w:val="single"/>
+        <w:left w:color="0F6B66" w:space="8" w:sz="24" w:val="single"/>
+        <w:bottom w:color="E3F2F1" w:space="4" w:sz="4" w:val="single"/>
+        <w:right w:color="E3F2F1" w:space="8" w:sz="4" w:val="single"/>
+      </w:pBdr>
+      <w:shd w:color="auto" w:fill="E3F2F1" w:val="clear"/>
+      <w:spacing w:after="40" w:before="40" w:line="264" w:lineRule="auto"/>
+      <w:ind w:left="227" w:right="227"/>
+    </w:pPr>
+    <w:rPr>
+      <w:color w:val="14202B"/>
+      <w:sz w:val="21"/>
+      <w:szCs w:val="21"/>
+    </w:rPr>
+  </w:style>
+  <w:style w:customStyle="1" w:styleId="RecuadroAtencion" w:type="paragraph">
+    <w:name w:val="Recuadro Atencion"/>
+    <w:basedOn w:val="BodyText"/>
+    <w:uiPriority w:val="10"/>
+    <w:qFormat/>
+    <w:pPr>
+      <w:pBdr>
+        <w:top w:color="FDECEA" w:space="4" w:sz="4" w:val="single"/>
+        <w:left w:color="C0392B" w:space="8" w:sz="24" w:val="single"/>
+        <w:bottom w:color="FDECEA" w:space="4" w:sz="4" w:val="single"/>
+        <w:right w:color="FDECEA" w:space="8" w:sz="4" w:val="single"/>
+      </w:pBdr>
+      <w:shd w:color="auto" w:fill="FDECEA" w:val="clear"/>
+      <w:spacing w:after="40" w:before="40" w:line="264" w:lineRule="auto"/>
+      <w:ind w:left="227" w:right="227"/>
+    </w:pPr>
+    <w:rPr>
+      <w:color w:val="14202B"/>
+      <w:sz w:val="21"/>
+      <w:szCs w:val="21"/>
+    </w:rPr>
+  </w:style>
+  <w:style w:customStyle="1" w:styleId="RecuadroComplemento" w:type="paragraph">
+    <w:name w:val="Recuadro Complemento"/>
+    <w:basedOn w:val="BodyText"/>
+    <w:uiPriority w:val="10"/>
+    <w:qFormat/>
+    <w:pPr>
+      <w:pBdr>
+        <w:top w:color="F2F4F6" w:space="4" w:sz="4" w:val="single"/>
+        <w:left w:color="8A96A3" w:space="8" w:sz="24" w:val="single"/>
+        <w:bottom w:color="F2F4F6" w:space="4" w:sz="4" w:val="single"/>
+        <w:right w:color="F2F4F6" w:space="8" w:sz="4" w:val="single"/>
+      </w:pBdr>
+      <w:shd w:color="auto" w:fill="F2F4F6" w:val="clear"/>
+      <w:spacing w:after="40" w:before="40" w:line="264" w:lineRule="auto"/>
+      <w:ind w:left="227" w:right="227"/>
+    </w:pPr>
+    <w:rPr>
+      <w:color w:val="3D4A57"/>
+      <w:sz w:val="21"/>
+      <w:szCs w:val="21"/>
+    </w:rPr>
+  </w:style>
+  <w:style w:customStyle="1" w:styleId="RecuadroFuente" w:type="paragraph">
+    <w:name w:val="Recuadro Fuente"/>
+    <w:basedOn w:val="BodyText"/>
+    <w:uiPriority w:val="10"/>
+    <w:qFormat/>
+    <w:pPr>
+      <w:pBdr>
+        <w:top w:color="F7F8FA" w:space="4" w:sz="4" w:val="single"/>
+        <w:left w:color="C9D1D9" w:space="8" w:sz="24" w:val="single"/>
+        <w:bottom w:color="F7F8FA" w:space="4" w:sz="4" w:val="single"/>
+        <w:right w:color="F7F8FA" w:space="8" w:sz="4" w:val="single"/>
+      </w:pBdr>
+      <w:shd w:color="auto" w:fill="F7F8FA" w:val="clear"/>
+      <w:spacing w:after="40" w:before="40" w:line="264" w:lineRule="auto"/>
+      <w:ind w:left="227" w:right="227"/>
+    </w:pPr>
+    <w:rPr>
+      <w:color w:val="3D4A57"/>
+      <w:sz w:val="19"/>
+      <w:szCs w:val="19"/>
+    </w:rPr>
+  </w:style>
+  <w:style w:customStyle="1" w:styleId="EncabezadoGuia" w:type="paragraph">
+    <w:name w:val="Encabezado guia"/>
+    <w:basedOn w:val="Normal"/>
+    <w:pPr>
+      <w:pBdr>
+        <w:bottom w:color="C9D1D9" w:space="2" w:sz="4" w:val="single"/>
+      </w:pBdr>
+      <w:jc w:val="right"/>
+      <w:spacing w:after="0"/>
+    </w:pPr>
+    <w:rPr>
+      <w:color w:val="5D6B78"/>
+      <w:sz w:val="17"/>
+    </w:rPr>
+  </w:style>
+  <w:style w:customStyle="1" w:styleId="PieGuia" w:type="paragraph">
+    <w:name w:val="Pie guia"/>
+    <w:basedOn w:val="Normal"/>
+    <w:pPr>
+      <w:jc w:val="center"/>
+      <w:spacing w:after="0"/>
+    </w:pPr>
+    <w:rPr>
+      <w:color w:val="5D6B78"/>
+      <w:sz w:val="17"/>
     </w:rPr>
   </w:style>
   <w:style w:type="paragraph" w:customStyle="1" w:styleId="SourceCode">

</xml_diff>

<commit_message>
Psicoanálisis: guías del 2.º parcial en APA, con esqueletos y "no confundir"
Las 8 guías del parcial (Transversal_ConceptoDeDefensa, C13 a C21_23):
- Citas convertidas a APA 7 (antes "T02, p. 5"; ahora
  "Freud, 1894/1996, p. 5") y recuadro "Fuentes" con las referencias
  completas. Se quita "Cómo se cita".
- Las 36 preguntas tienen esqueleto de respuesta y recuadro
  "No confundir".
- El "Para el parcial" del hilo conductor pasa a ser un recuadro.
- Los 432 flashcards citan en APA; se conservan las claves, así que Anki
  actualiza las tarjetas sin perder el historial.
- Se regeneran los Word.

Los datos de edición salen de cómo los cita la propia cátedra (Freud en
Amorrortu 1996; Lacan en Siglo XXI 2009 y Paidós 1993/2006; Amigo y
Heinrich en Homo Sapiens). Donde la fuente no trae el año se usa "s. f.".

Co-Authored-By: Claude Opus 5.5 <noreply@anthropic.com>
</commit_message>
<xml_diff>
--- a/2do Año/Psicoanálisis/3_Guias_de_Estudio/C13_EstructuraYTiemposDeLaNeurosis_Guia.docx
+++ b/2do Año/Psicoanálisis/3_Guias_de_Estudio/C13_EstructuraYTiemposDeLaNeurosis_Guia.docx
@@ -46,13 +46,21 @@
           <w:b/>
           <w:bCs/>
         </w:rPr>
-        <w:t xml:space="preserve">Fuente:</w:t>
-      </w:r>
-      <w:r>
-        <w:t xml:space="preserve"> </w:t>
-      </w:r>
-      <w:r>
-        <w:t xml:space="preserve">Belucci,</w:t>
+        <w:t xml:space="preserve">Fuentes</w:t>
+      </w:r>
+      <w:r>
+        <w:t xml:space="preserve"> </w:t>
+      </w:r>
+      <w:r>
+        <w:t xml:space="preserve">(normas APA 7):</w:t>
+      </w:r>
+    </w:p>
+    <w:p>
+      <w:pPr>
+        <w:pStyle w:val="RecuadroFuente"/>
+      </w:pPr>
+      <w:r>
+        <w:t xml:space="preserve">• Belucci, G. (s. f.-c).</w:t>
       </w:r>
       <w:r>
         <w:t xml:space="preserve"> </w:t>
@@ -62,13 +70,21 @@
           <w:i/>
           <w:iCs/>
         </w:rPr>
-        <w:t xml:space="preserve">Introducción al diagnóstico de estructura</w:t>
-      </w:r>
-      <w:r>
-        <w:t xml:space="preserve"> </w:t>
-      </w:r>
-      <w:r>
-        <w:t xml:space="preserve">(T01, ficha de cátedra, 2014) · Freud,</w:t>
+        <w:t xml:space="preserve">Sobre el concepto de defensa</w:t>
+      </w:r>
+      <w:r>
+        <w:t xml:space="preserve"> </w:t>
+      </w:r>
+      <w:r>
+        <w:t xml:space="preserve">[Ficha de cátedra]. Universidad Favaloro. [Texto T03 del programa]</w:t>
+      </w:r>
+    </w:p>
+    <w:p>
+      <w:pPr>
+        <w:pStyle w:val="RecuadroFuente"/>
+      </w:pPr>
+      <w:r>
+        <w:t xml:space="preserve">• Belucci, G. (2014b).</w:t>
       </w:r>
       <w:r>
         <w:t xml:space="preserve"> </w:t>
@@ -78,13 +94,21 @@
           <w:i/>
           <w:iCs/>
         </w:rPr>
-        <w:t xml:space="preserve">Las neuropsicosis de defensa</w:t>
-      </w:r>
-      <w:r>
-        <w:t xml:space="preserve"> </w:t>
-      </w:r>
-      <w:r>
-        <w:t xml:space="preserve">(T02, 1894) · Belucci,</w:t>
+        <w:t xml:space="preserve">Introducción al diagnóstico de estructura</w:t>
+      </w:r>
+      <w:r>
+        <w:t xml:space="preserve"> </w:t>
+      </w:r>
+      <w:r>
+        <w:t xml:space="preserve">[Ficha de cátedra]. Universidad Favaloro. [Texto T01 del programa]</w:t>
+      </w:r>
+    </w:p>
+    <w:p>
+      <w:pPr>
+        <w:pStyle w:val="RecuadroFuente"/>
+      </w:pPr>
+      <w:r>
+        <w:t xml:space="preserve">• Freud, S. (1996). Las neuropsicosis de defensa. En J. Strachey (Ed.),</w:t>
       </w:r>
       <w:r>
         <w:t xml:space="preserve"> </w:t>
@@ -94,13 +118,21 @@
           <w:i/>
           <w:iCs/>
         </w:rPr>
-        <w:t xml:space="preserve">Sobre el concepto de defensa</w:t>
-      </w:r>
-      <w:r>
-        <w:t xml:space="preserve"> </w:t>
-      </w:r>
-      <w:r>
-        <w:t xml:space="preserve">(T03) · Freud,</w:t>
+        <w:t xml:space="preserve">Obras completas</w:t>
+      </w:r>
+      <w:r>
+        <w:t xml:space="preserve"> </w:t>
+      </w:r>
+      <w:r>
+        <w:t xml:space="preserve">(J. L. Etcheverry, Trad., Vol. 3). Amorrortu. (Obra original publicada en 1894) [Texto T02 del programa]</w:t>
+      </w:r>
+    </w:p>
+    <w:p>
+      <w:pPr>
+        <w:pStyle w:val="RecuadroFuente"/>
+      </w:pPr>
+      <w:r>
+        <w:t xml:space="preserve">• Freud, S. (1996b). 23.ª conferencia. Los caminos de la formación de síntoma. En J. Strachey (Ed.),</w:t>
       </w:r>
       <w:r>
         <w:t xml:space="preserve"> </w:t>
@@ -110,17 +142,19 @@
           <w:i/>
           <w:iCs/>
         </w:rPr>
-        <w:t xml:space="preserve">23.ª Conferencia. Los caminos de la formación de síntoma</w:t>
-      </w:r>
-      <w:r>
-        <w:t xml:space="preserve"> </w:t>
-      </w:r>
-      <w:r>
-        <w:t xml:space="preserve">(T04, 1917) · tus apuntes de la clase 13 (3/8/2026) ·</w:t>
-      </w:r>
-      <w:r>
-        <w:t xml:space="preserve"> </w:t>
-      </w:r>
+        <w:t xml:space="preserve">Obras completas</w:t>
+      </w:r>
+      <w:r>
+        <w:t xml:space="preserve"> </w:t>
+      </w:r>
+      <w:r>
+        <w:t xml:space="preserve">(J. L. Etcheverry, Trad., Vol. 16). Amorrortu. (Obra original publicada en 1917) [Texto T04 del programa]</w:t>
+      </w:r>
+    </w:p>
+    <w:p>
+      <w:pPr>
+        <w:pStyle w:val="RecuadroFuente"/>
+      </w:pPr>
       <w:r>
         <w:rPr>
           <w:b/>
@@ -134,38 +168,39 @@
       <w:r>
         <w:t xml:space="preserve">Psicoanálisis, 2.º año, Favaloro (Belucci / Balcarce).</w:t>
       </w:r>
-    </w:p>
-    <w:p>
-      <w:pPr>
-        <w:pStyle w:val="RecuadroFuente"/>
-      </w:pPr>
-      <w:r>
-        <w:rPr>
-          <w:b/>
-          <w:bCs/>
-        </w:rPr>
-        <w:t xml:space="preserve">Cómo se cita:</w:t>
-      </w:r>
-      <w:r>
-        <w:t xml:space="preserve"> </w:t>
-      </w:r>
-      <w:r>
-        <w:t xml:space="preserve">«p. N» es la marca</w:t>
-      </w:r>
-      <w:r>
-        <w:t xml:space="preserve"> </w:t>
-      </w:r>
-      <w:r>
-        <w:rPr>
-          <w:rStyle w:val="VerbatimChar"/>
-        </w:rPr>
-        <w:t xml:space="preserve">## Página N</w:t>
-      </w:r>
-      <w:r>
-        <w:t xml:space="preserve"> </w:t>
-      </w:r>
-      <w:r>
-        <w:t xml:space="preserve">del texto extraído (en T02 coincide con el PDF de la cátedra; en T04 el texto no tiene marcas de página y se cita por tema). Lo que no está en los textos de la clase sino en la teoría de Freud que Belucci menciona (Manuscrito K,</w:t>
+      <w:r>
+        <w:t xml:space="preserve"> </w:t>
+      </w:r>
+      <w:r>
+        <w:rPr>
+          <w:b/>
+          <w:bCs/>
+        </w:rPr>
+        <w:t xml:space="preserve">Apuntes de clase:</w:t>
+      </w:r>
+      <w:r>
+        <w:t xml:space="preserve"> </w:t>
+      </w:r>
+      <w:r>
+        <w:t xml:space="preserve">apuntes propios de la clase 13 (3/8/2026).</w:t>
+      </w:r>
+    </w:p>
+    <w:p>
+      <w:pPr>
+        <w:pStyle w:val="RecuadroIdea"/>
+      </w:pPr>
+      <w:r>
+        <w:rPr>
+          <w:b/>
+          <w:bCs/>
+        </w:rPr>
+        <w:t xml:space="preserve">Idea-fuerza:</w:t>
+      </w:r>
+      <w:r>
+        <w:t xml:space="preserve"> </w:t>
+      </w:r>
+      <w:r>
+        <w:t xml:space="preserve">la neurosis no es un accidente ni un defecto: es una</w:t>
       </w:r>
       <w:r>
         <w:t xml:space="preserve"> </w:t>
@@ -175,44 +210,13 @@
           <w:i/>
           <w:iCs/>
         </w:rPr>
-        <w:t xml:space="preserve">Nuevas puntualizaciones</w:t>
-      </w:r>
-      <w:r>
-        <w:t xml:space="preserve">) va marcado</w:t>
-      </w:r>
-      <w:r>
-        <w:t xml:space="preserve"> </w:t>
-      </w:r>
-      <w:r>
-        <w:rPr>
-          <w:b/>
-          <w:bCs/>
-        </w:rPr>
-        <w:t xml:space="preserve">▸ Complemento</w:t>
-      </w:r>
-      <w:r>
-        <w:t xml:space="preserve"> </w:t>
-      </w:r>
-      <w:r>
-        <w:t xml:space="preserve">para que lo contrastes con tu cuaderno.</w:t>
-      </w:r>
-    </w:p>
-    <w:p>
-      <w:pPr>
-        <w:pStyle w:val="RecuadroIdea"/>
-      </w:pPr>
-      <w:r>
-        <w:rPr>
-          <w:b/>
-          <w:bCs/>
-        </w:rPr>
-        <w:t xml:space="preserve">Idea-fuerza:</w:t>
-      </w:r>
-      <w:r>
-        <w:t xml:space="preserve"> </w:t>
-      </w:r>
-      <w:r>
-        <w:t xml:space="preserve">la neurosis no es un accidente ni un defecto: es una</w:t>
+        <w:t xml:space="preserve">condición de estructura</w:t>
+      </w:r>
+      <w:r>
+        <w:t xml:space="preserve"> </w:t>
+      </w:r>
+      <w:r>
+        <w:t xml:space="preserve">(la falta en el Otro inscripta por la Ley paterna y tramitada por la represión) que se vuelve</w:t>
       </w:r>
       <w:r>
         <w:t xml:space="preserve"> </w:t>
@@ -222,55 +226,301 @@
           <w:i/>
           <w:iCs/>
         </w:rPr>
-        <w:t xml:space="preserve">condición de estructura</w:t>
-      </w:r>
-      <w:r>
-        <w:t xml:space="preserve"> </w:t>
-      </w:r>
-      <w:r>
-        <w:t xml:space="preserve">(la falta en el Otro inscripta por la Ley paterna y tramitada por la represión) que se vuelve</w:t>
-      </w:r>
-      <w:r>
-        <w:t xml:space="preserve"> </w:t>
+        <w:t xml:space="preserve">padecimiento</w:t>
+      </w:r>
+      <w:r>
+        <w:t xml:space="preserve"> </w:t>
+      </w:r>
+      <w:r>
+        <w:t xml:space="preserve">solo cuando algo hace fracasar las soluciones del sujeto (</w:t>
       </w:r>
       <w:r>
         <w:rPr>
           <w:i/>
           <w:iCs/>
         </w:rPr>
-        <w:t xml:space="preserve">padecimiento</w:t>
-      </w:r>
-      <w:r>
-        <w:t xml:space="preserve"> </w:t>
-      </w:r>
-      <w:r>
-        <w:t xml:space="preserve">solo cuando algo hace fracasar las soluciones del sujeto (</w:t>
+        <w:t xml:space="preserve">Versagung</w:t>
+      </w:r>
+      <w:r>
+        <w:t xml:space="preserve">). Freud lo piensa en dos momentos: primero como una</w:t>
+      </w:r>
+      <w:r>
+        <w:t xml:space="preserve"> </w:t>
+      </w:r>
+      <w:r>
+        <w:rPr>
+          <w:b/>
+          <w:bCs/>
+        </w:rPr>
+        <w:t xml:space="preserve">historia en tiempos</w:t>
+      </w:r>
+      <w:r>
+        <w:t xml:space="preserve"> </w:t>
+      </w:r>
+      <w:r>
+        <w:t xml:space="preserve">(dos escenas, defensa, retorno de lo reprimido: 1894-96) y después como un</w:t>
+      </w:r>
+      <w:r>
+        <w:t xml:space="preserve"> </w:t>
+      </w:r>
+      <w:r>
+        <w:rPr>
+          <w:b/>
+          <w:bCs/>
+        </w:rPr>
+        <w:t xml:space="preserve">encadenamiento de causas</w:t>
+      </w:r>
+      <w:r>
+        <w:t xml:space="preserve"> </w:t>
+      </w:r>
+      <w:r>
+        <w:t xml:space="preserve">(las series complementarias: constitución + vivenciar infantil → fijación; fijación + vivenciar accidental → neurosis: 1917). El síntoma es el punto de llegada: una satisfacción sustitutiva, de compromiso entre la libido y la defensa.</w:t>
+      </w:r>
+    </w:p>
+    <w:bookmarkStart w:id="9" w:name="Xebe78a99765903a6a585a2843142a551a43737b"/>
+    <w:p>
+      <w:pPr>
+        <w:pStyle w:val="Heading2"/>
+      </w:pPr>
+      <w:r>
+        <w:t xml:space="preserve">Hilo conductor: cómo se conectan los temas de esta guía</w:t>
+      </w:r>
+    </w:p>
+    <w:p>
+      <w:pPr>
+        <w:pStyle w:val="FirstParagraph"/>
+      </w:pPr>
+      <w:r>
+        <w:t xml:space="preserve">La clase responde a una pregunta de fondo:</w:t>
+      </w:r>
+      <w:r>
+        <w:t xml:space="preserve"> </w:t>
+      </w:r>
+      <w:r>
+        <w:rPr>
+          <w:b/>
+          <w:bCs/>
+        </w:rPr>
+        <w:t xml:space="preserve">¿cómo se llega a ser neurótico y cómo se llega a padecer una neurosis?</w:t>
+      </w:r>
+      <w:r>
+        <w:t xml:space="preserve"> </w:t>
+      </w:r>
+      <w:r>
+        <w:t xml:space="preserve">Freud contesta primero con una</w:t>
+      </w:r>
+      <w:r>
+        <w:t xml:space="preserve"> </w:t>
+      </w:r>
+      <w:r>
+        <w:rPr>
+          <w:b/>
+          <w:bCs/>
+        </w:rPr>
+        <w:t xml:space="preserve">historia</w:t>
+      </w:r>
+      <w:r>
+        <w:t xml:space="preserve"> </w:t>
+      </w:r>
+      <w:r>
+        <w:t xml:space="preserve">y después con una</w:t>
+      </w:r>
+      <w:r>
+        <w:t xml:space="preserve"> </w:t>
+      </w:r>
+      <w:r>
+        <w:rPr>
+          <w:b/>
+          <w:bCs/>
+        </w:rPr>
+        <w:t xml:space="preserve">estructura de causas</w:t>
+      </w:r>
+      <w:r>
+        <w:t xml:space="preserve">, y el síntoma es el punto de llegada de ambas.</w:t>
+      </w:r>
+    </w:p>
+    <w:p>
+      <w:pPr>
+        <w:pStyle w:val="BodyText"/>
+      </w:pPr>
+      <w:r>
+        <w:t xml:space="preserve">La</w:t>
+      </w:r>
+      <w:r>
+        <w:t xml:space="preserve"> </w:t>
+      </w:r>
+      <w:r>
+        <w:rPr>
+          <w:b/>
+          <w:bCs/>
+        </w:rPr>
+        <w:t xml:space="preserve">historia</w:t>
+      </w:r>
+      <w:r>
+        <w:t xml:space="preserve"> </w:t>
+      </w:r>
+      <w:r>
+        <w:t xml:space="preserve">(pregunta 1) viene de 1894-96. Parte de la</w:t>
+      </w:r>
+      <w:r>
+        <w:t xml:space="preserve"> </w:t>
+      </w:r>
+      <w:r>
+        <w:rPr>
+          <w:b/>
+          <w:bCs/>
+        </w:rPr>
+        <w:t xml:space="preserve">defensa</w:t>
+      </w:r>
+      <w:r>
+        <w:t xml:space="preserve">: el yo se encuentra con una representación inconciliable, le arranca el afecto y la deja reprimida. Eso se ordena en la</w:t>
+      </w:r>
+      <w:r>
+        <w:t xml:space="preserve"> </w:t>
+      </w:r>
+      <w:r>
+        <w:rPr>
+          <w:b/>
+          <w:bCs/>
+        </w:rPr>
+        <w:t xml:space="preserve">fórmula canónica</w:t>
+      </w:r>
+      <w:r>
+        <w:t xml:space="preserve">: una</w:t>
+      </w:r>
+      <w:r>
+        <w:t xml:space="preserve"> </w:t>
+      </w:r>
+      <w:r>
+        <w:rPr>
+          <w:b/>
+          <w:bCs/>
+        </w:rPr>
+        <w:t xml:space="preserve">primera escena</w:t>
+      </w:r>
+      <w:r>
+        <w:t xml:space="preserve"> </w:t>
+      </w:r>
+      <w:r>
+        <w:t xml:space="preserve">que, cuando ocurre, no es traumática; un tiempo de</w:t>
+      </w:r>
+      <w:r>
+        <w:t xml:space="preserve"> </w:t>
+      </w:r>
+      <w:r>
+        <w:rPr>
+          <w:b/>
+          <w:bCs/>
+        </w:rPr>
+        <w:t xml:space="preserve">latencia</w:t>
+      </w:r>
+      <w:r>
+        <w:t xml:space="preserve">; una</w:t>
+      </w:r>
+      <w:r>
+        <w:t xml:space="preserve"> </w:t>
+      </w:r>
+      <w:r>
+        <w:rPr>
+          <w:b/>
+          <w:bCs/>
+        </w:rPr>
+        <w:t xml:space="preserve">segunda escena</w:t>
+      </w:r>
+      <w:r>
+        <w:t xml:space="preserve"> </w:t>
+      </w:r>
+      <w:r>
+        <w:t xml:space="preserve">que,</w:t>
+      </w:r>
+      <w:r>
+        <w:t xml:space="preserve"> </w:t>
       </w:r>
       <w:r>
         <w:rPr>
           <w:i/>
           <w:iCs/>
         </w:rPr>
-        <w:t xml:space="preserve">Versagung</w:t>
-      </w:r>
-      <w:r>
-        <w:t xml:space="preserve">). Freud lo piensa en dos momentos: primero como una</w:t>
-      </w:r>
-      <w:r>
-        <w:t xml:space="preserve"> </w:t>
-      </w:r>
-      <w:r>
-        <w:rPr>
-          <w:b/>
-          <w:bCs/>
-        </w:rPr>
-        <w:t xml:space="preserve">historia en tiempos</w:t>
-      </w:r>
-      <w:r>
-        <w:t xml:space="preserve"> </w:t>
-      </w:r>
-      <w:r>
-        <w:t xml:space="preserve">(dos escenas, defensa, retorno de lo reprimido: 1894-96) y después como un</w:t>
+        <w:t xml:space="preserve">a posteriori</w:t>
+      </w:r>
+      <w:r>
+        <w:t xml:space="preserve">, vuelve traumática a la primera; la</w:t>
+      </w:r>
+      <w:r>
+        <w:t xml:space="preserve"> </w:t>
+      </w:r>
+      <w:r>
+        <w:rPr>
+          <w:b/>
+          <w:bCs/>
+        </w:rPr>
+        <w:t xml:space="preserve">defensa</w:t>
+      </w:r>
+      <w:r>
+        <w:t xml:space="preserve"> </w:t>
+      </w:r>
+      <w:r>
+        <w:t xml:space="preserve">y su marca (el</w:t>
+      </w:r>
+      <w:r>
+        <w:t xml:space="preserve"> </w:t>
+      </w:r>
+      <w:r>
+        <w:rPr>
+          <w:b/>
+          <w:bCs/>
+        </w:rPr>
+        <w:t xml:space="preserve">síntoma defensivo primario</w:t>
+      </w:r>
+      <w:r>
+        <w:t xml:space="preserve">: asco en la histeria, escrupulosidad en la obsesión); un período de</w:t>
+      </w:r>
+      <w:r>
+        <w:t xml:space="preserve"> </w:t>
+      </w:r>
+      <w:r>
+        <w:rPr>
+          <w:b/>
+          <w:bCs/>
+        </w:rPr>
+        <w:t xml:space="preserve">salud aparente</w:t>
+      </w:r>
+      <w:r>
+        <w:t xml:space="preserve">; y el</w:t>
+      </w:r>
+      <w:r>
+        <w:t xml:space="preserve"> </w:t>
+      </w:r>
+      <w:r>
+        <w:rPr>
+          <w:b/>
+          <w:bCs/>
+        </w:rPr>
+        <w:t xml:space="preserve">retorno de lo reprimido</w:t>
+      </w:r>
+      <w:r>
+        <w:t xml:space="preserve">, que difiere en la histeria (conversión) y en la obsesión (enlace falso). Lo importante de este primer modelo es que la neurosis aparece como</w:t>
+      </w:r>
+      <w:r>
+        <w:t xml:space="preserve"> </w:t>
+      </w:r>
+      <w:r>
+        <w:rPr>
+          <w:b/>
+          <w:bCs/>
+        </w:rPr>
+        <w:t xml:space="preserve">una secuencia temporal</w:t>
+      </w:r>
+      <w:r>
+        <w:t xml:space="preserve">, con un momento en que no hay síntoma aunque la condición ya esté.</w:t>
+      </w:r>
+    </w:p>
+    <w:p>
+      <w:pPr>
+        <w:pStyle w:val="BodyText"/>
+      </w:pPr>
+      <w:r>
+        <w:t xml:space="preserve">En 1917 Freud cambia la lógica (pregunta 2): ya no una secuencia sino un</w:t>
       </w:r>
       <w:r>
         <w:t xml:space="preserve"> </w:t>
@@ -283,248 +533,151 @@
         <w:t xml:space="preserve">encadenamiento de causas</w:t>
       </w:r>
       <w:r>
-        <w:t xml:space="preserve"> </w:t>
-      </w:r>
-      <w:r>
-        <w:t xml:space="preserve">(las series complementarias: constitución + vivenciar infantil → fijación; fijación + vivenciar accidental → neurosis: 1917). El síntoma es el punto de llegada: una satisfacción sustitutiva, de compromiso entre la libido y la defensa.</w:t>
-      </w:r>
-    </w:p>
-    <w:bookmarkStart w:id="9" w:name="Xebe78a99765903a6a585a2843142a551a43737b"/>
-    <w:p>
-      <w:pPr>
-        <w:pStyle w:val="Heading2"/>
-      </w:pPr>
-      <w:r>
-        <w:t xml:space="preserve">Hilo conductor: cómo se conectan los temas de esta guía</w:t>
-      </w:r>
-    </w:p>
-    <w:p>
-      <w:pPr>
-        <w:pStyle w:val="FirstParagraph"/>
-      </w:pPr>
-      <w:r>
-        <w:t xml:space="preserve">La clase responde a una pregunta de fondo:</w:t>
-      </w:r>
-      <w:r>
-        <w:t xml:space="preserve"> </w:t>
-      </w:r>
-      <w:r>
-        <w:rPr>
-          <w:b/>
-          <w:bCs/>
-        </w:rPr>
-        <w:t xml:space="preserve">¿cómo se llega a ser neurótico y cómo se llega a padecer una neurosis?</w:t>
-      </w:r>
-      <w:r>
-        <w:t xml:space="preserve"> </w:t>
-      </w:r>
-      <w:r>
-        <w:t xml:space="preserve">Freud contesta primero con una</w:t>
-      </w:r>
-      <w:r>
-        <w:t xml:space="preserve"> </w:t>
-      </w:r>
-      <w:r>
-        <w:rPr>
-          <w:b/>
-          <w:bCs/>
-        </w:rPr>
-        <w:t xml:space="preserve">historia</w:t>
-      </w:r>
-      <w:r>
-        <w:t xml:space="preserve"> </w:t>
-      </w:r>
-      <w:r>
-        <w:t xml:space="preserve">y después con una</w:t>
-      </w:r>
-      <w:r>
-        <w:t xml:space="preserve"> </w:t>
-      </w:r>
-      <w:r>
-        <w:rPr>
-          <w:b/>
-          <w:bCs/>
-        </w:rPr>
-        <w:t xml:space="preserve">estructura de causas</w:t>
-      </w:r>
-      <w:r>
-        <w:t xml:space="preserve">, y el síntoma es el punto de llegada de ambas.</w:t>
-      </w:r>
-    </w:p>
-    <w:p>
-      <w:pPr>
-        <w:pStyle w:val="BodyText"/>
-      </w:pPr>
-      <w:r>
-        <w:t xml:space="preserve">La</w:t>
-      </w:r>
-      <w:r>
-        <w:t xml:space="preserve"> </w:t>
-      </w:r>
-      <w:r>
-        <w:rPr>
-          <w:b/>
-          <w:bCs/>
-        </w:rPr>
-        <w:t xml:space="preserve">historia</w:t>
-      </w:r>
-      <w:r>
-        <w:t xml:space="preserve"> </w:t>
-      </w:r>
-      <w:r>
-        <w:t xml:space="preserve">(pregunta 1) viene de 1894-96. Parte de la</w:t>
-      </w:r>
-      <w:r>
-        <w:t xml:space="preserve"> </w:t>
-      </w:r>
-      <w:r>
-        <w:rPr>
-          <w:b/>
-          <w:bCs/>
-        </w:rPr>
-        <w:t xml:space="preserve">defensa</w:t>
-      </w:r>
-      <w:r>
-        <w:t xml:space="preserve">: el yo se encuentra con una representación inconciliable, le arranca el afecto y la deja reprimida. Eso se ordena en la</w:t>
-      </w:r>
-      <w:r>
-        <w:t xml:space="preserve"> </w:t>
-      </w:r>
-      <w:r>
-        <w:rPr>
-          <w:b/>
-          <w:bCs/>
-        </w:rPr>
-        <w:t xml:space="preserve">fórmula canónica</w:t>
-      </w:r>
-      <w:r>
-        <w:t xml:space="preserve">: una</w:t>
-      </w:r>
-      <w:r>
-        <w:t xml:space="preserve"> </w:t>
-      </w:r>
-      <w:r>
-        <w:rPr>
-          <w:b/>
-          <w:bCs/>
-        </w:rPr>
-        <w:t xml:space="preserve">primera escena</w:t>
-      </w:r>
-      <w:r>
-        <w:t xml:space="preserve"> </w:t>
-      </w:r>
-      <w:r>
-        <w:t xml:space="preserve">que, cuando ocurre, no es traumática; un tiempo de</w:t>
-      </w:r>
-      <w:r>
-        <w:t xml:space="preserve"> </w:t>
-      </w:r>
-      <w:r>
-        <w:rPr>
-          <w:b/>
-          <w:bCs/>
-        </w:rPr>
-        <w:t xml:space="preserve">latencia</w:t>
-      </w:r>
-      <w:r>
-        <w:t xml:space="preserve">; una</w:t>
-      </w:r>
-      <w:r>
-        <w:t xml:space="preserve"> </w:t>
-      </w:r>
-      <w:r>
-        <w:rPr>
-          <w:b/>
-          <w:bCs/>
-        </w:rPr>
-        <w:t xml:space="preserve">segunda escena</w:t>
-      </w:r>
-      <w:r>
-        <w:t xml:space="preserve"> </w:t>
-      </w:r>
-      <w:r>
-        <w:t xml:space="preserve">que,</w:t>
-      </w:r>
-      <w:r>
-        <w:t xml:space="preserve"> </w:t>
-      </w:r>
-      <w:r>
-        <w:rPr>
+        <w:t xml:space="preserve">, las</w:t>
+      </w:r>
+      <w:r>
+        <w:t xml:space="preserve"> </w:t>
+      </w:r>
+      <w:r>
+        <w:rPr>
+          <w:b/>
+          <w:bCs/>
+        </w:rPr>
+        <w:t xml:space="preserve">series complementarias</w:t>
+      </w:r>
+      <w:r>
+        <w:t xml:space="preserve">. La neurosis resulta de una</w:t>
+      </w:r>
+      <w:r>
+        <w:t xml:space="preserve"> </w:t>
+      </w:r>
+      <w:r>
+        <w:rPr>
+          <w:b/>
+          <w:bCs/>
+        </w:rPr>
+        <w:t xml:space="preserve">predisposición</w:t>
+      </w:r>
+      <w:r>
+        <w:t xml:space="preserve"> </w:t>
+      </w:r>
+      <w:r>
+        <w:t xml:space="preserve">(por</w:t>
+      </w:r>
+      <w:r>
+        <w:t xml:space="preserve"> </w:t>
+      </w:r>
+      <w:r>
+        <w:rPr>
+          <w:b/>
+          <w:bCs/>
+        </w:rPr>
+        <w:t xml:space="preserve">fijación</w:t>
+      </w:r>
+      <w:r>
+        <w:t xml:space="preserve"> </w:t>
+      </w:r>
+      <w:r>
+        <w:t xml:space="preserve">de la libido) más un</w:t>
+      </w:r>
+      <w:r>
+        <w:t xml:space="preserve"> </w:t>
+      </w:r>
+      <w:r>
+        <w:rPr>
+          <w:b/>
+          <w:bCs/>
+        </w:rPr>
+        <w:t xml:space="preserve">vivenciar accidental</w:t>
+      </w:r>
+      <w:r>
+        <w:t xml:space="preserve">; y la fijación, a su vez, resulta de la</w:t>
+      </w:r>
+      <w:r>
+        <w:t xml:space="preserve"> </w:t>
+      </w:r>
+      <w:r>
+        <w:rPr>
+          <w:b/>
+          <w:bCs/>
+        </w:rPr>
+        <w:t xml:space="preserve">constitución sexual</w:t>
+      </w:r>
+      <w:r>
+        <w:t xml:space="preserve"> </w:t>
+      </w:r>
+      <w:r>
+        <w:t xml:space="preserve">más el</w:t>
+      </w:r>
+      <w:r>
+        <w:t xml:space="preserve"> </w:t>
+      </w:r>
+      <w:r>
+        <w:rPr>
+          <w:b/>
+          <w:bCs/>
+        </w:rPr>
+        <w:t xml:space="preserve">vivenciar infantil</w:t>
+      </w:r>
+      <w:r>
+        <w:t xml:space="preserve">. Aquí aparece la distinción que ordena el resto de la clase: la</w:t>
+      </w:r>
+      <w:r>
+        <w:t xml:space="preserve"> </w:t>
+      </w:r>
+      <w:r>
+        <w:rPr>
+          <w:b/>
+          <w:bCs/>
+        </w:rPr>
+        <w:t xml:space="preserve">condición neurótica</w:t>
+      </w:r>
+      <w:r>
+        <w:t xml:space="preserve"> </w:t>
+      </w:r>
+      <w:r>
+        <w:t xml:space="preserve">(la estructura) no es lo mismo que el</w:t>
+      </w:r>
+      <w:r>
+        <w:t xml:space="preserve"> </w:t>
+      </w:r>
+      <w:r>
+        <w:rPr>
+          <w:b/>
+          <w:bCs/>
+        </w:rPr>
+        <w:t xml:space="preserve">padecimiento</w:t>
+      </w:r>
+      <w:r>
+        <w:t xml:space="preserve">, que se desencadena cuando algo hace fracasar las soluciones del sujeto, la</w:t>
+      </w:r>
+      <w:r>
+        <w:t xml:space="preserve"> </w:t>
+      </w:r>
+      <w:r>
+        <w:rPr>
+          <w:b/>
+          <w:bCs/>
           <w:i/>
           <w:iCs/>
         </w:rPr>
-        <w:t xml:space="preserve">a posteriori</w:t>
-      </w:r>
-      <w:r>
-        <w:t xml:space="preserve">, vuelve traumática a la primera; la</w:t>
-      </w:r>
-      <w:r>
-        <w:t xml:space="preserve"> </w:t>
-      </w:r>
-      <w:r>
-        <w:rPr>
-          <w:b/>
-          <w:bCs/>
-        </w:rPr>
-        <w:t xml:space="preserve">defensa</w:t>
-      </w:r>
-      <w:r>
-        <w:t xml:space="preserve"> </w:t>
-      </w:r>
-      <w:r>
-        <w:t xml:space="preserve">y su marca (el</w:t>
-      </w:r>
-      <w:r>
-        <w:t xml:space="preserve"> </w:t>
-      </w:r>
-      <w:r>
-        <w:rPr>
-          <w:b/>
-          <w:bCs/>
-        </w:rPr>
-        <w:t xml:space="preserve">síntoma defensivo primario</w:t>
-      </w:r>
-      <w:r>
-        <w:t xml:space="preserve">: asco en la histeria, escrupulosidad en la obsesión); un período de</w:t>
-      </w:r>
-      <w:r>
-        <w:t xml:space="preserve"> </w:t>
-      </w:r>
-      <w:r>
-        <w:rPr>
-          <w:b/>
-          <w:bCs/>
-        </w:rPr>
-        <w:t xml:space="preserve">salud aparente</w:t>
-      </w:r>
-      <w:r>
-        <w:t xml:space="preserve">; y el</w:t>
-      </w:r>
-      <w:r>
-        <w:t xml:space="preserve"> </w:t>
-      </w:r>
-      <w:r>
-        <w:rPr>
-          <w:b/>
-          <w:bCs/>
-        </w:rPr>
-        <w:t xml:space="preserve">retorno de lo reprimido</w:t>
-      </w:r>
-      <w:r>
-        <w:t xml:space="preserve">, que difiere en la histeria (conversión) y en la obsesión (enlace falso). Lo importante de este primer modelo es que la neurosis aparece como</w:t>
-      </w:r>
-      <w:r>
-        <w:t xml:space="preserve"> </w:t>
-      </w:r>
-      <w:r>
-        <w:rPr>
-          <w:b/>
-          <w:bCs/>
-        </w:rPr>
-        <w:t xml:space="preserve">una secuencia temporal</w:t>
-      </w:r>
-      <w:r>
-        <w:t xml:space="preserve">, con un momento en que no hay síntoma aunque la condición ya esté.</w:t>
+        <w:t xml:space="preserve">Versagung</w:t>
+      </w:r>
+      <w:r>
+        <w:t xml:space="preserve">, y obliga a una</w:t>
+      </w:r>
+      <w:r>
+        <w:t xml:space="preserve"> </w:t>
+      </w:r>
+      <w:r>
+        <w:rPr>
+          <w:b/>
+          <w:bCs/>
+        </w:rPr>
+        <w:t xml:space="preserve">regresión</w:t>
+      </w:r>
+      <w:r>
+        <w:t xml:space="preserve">. Esto «traduce» la historia anterior: la salud aparente es la condición sin padecimiento; el retorno de lo reprimido es el padecimiento.</w:t>
       </w:r>
     </w:p>
     <w:p>
@@ -532,171 +685,6 @@
         <w:pStyle w:val="BodyText"/>
       </w:pPr>
       <w:r>
-        <w:t xml:space="preserve">En 1917 Freud cambia la lógica (pregunta 2): ya no una secuencia sino un</w:t>
-      </w:r>
-      <w:r>
-        <w:t xml:space="preserve"> </w:t>
-      </w:r>
-      <w:r>
-        <w:rPr>
-          <w:b/>
-          <w:bCs/>
-        </w:rPr>
-        <w:t xml:space="preserve">encadenamiento de causas</w:t>
-      </w:r>
-      <w:r>
-        <w:t xml:space="preserve">, las</w:t>
-      </w:r>
-      <w:r>
-        <w:t xml:space="preserve"> </w:t>
-      </w:r>
-      <w:r>
-        <w:rPr>
-          <w:b/>
-          <w:bCs/>
-        </w:rPr>
-        <w:t xml:space="preserve">series complementarias</w:t>
-      </w:r>
-      <w:r>
-        <w:t xml:space="preserve">. La neurosis resulta de una</w:t>
-      </w:r>
-      <w:r>
-        <w:t xml:space="preserve"> </w:t>
-      </w:r>
-      <w:r>
-        <w:rPr>
-          <w:b/>
-          <w:bCs/>
-        </w:rPr>
-        <w:t xml:space="preserve">predisposición</w:t>
-      </w:r>
-      <w:r>
-        <w:t xml:space="preserve"> </w:t>
-      </w:r>
-      <w:r>
-        <w:t xml:space="preserve">(por</w:t>
-      </w:r>
-      <w:r>
-        <w:t xml:space="preserve"> </w:t>
-      </w:r>
-      <w:r>
-        <w:rPr>
-          <w:b/>
-          <w:bCs/>
-        </w:rPr>
-        <w:t xml:space="preserve">fijación</w:t>
-      </w:r>
-      <w:r>
-        <w:t xml:space="preserve"> </w:t>
-      </w:r>
-      <w:r>
-        <w:t xml:space="preserve">de la libido) más un</w:t>
-      </w:r>
-      <w:r>
-        <w:t xml:space="preserve"> </w:t>
-      </w:r>
-      <w:r>
-        <w:rPr>
-          <w:b/>
-          <w:bCs/>
-        </w:rPr>
-        <w:t xml:space="preserve">vivenciar accidental</w:t>
-      </w:r>
-      <w:r>
-        <w:t xml:space="preserve">; y la fijación, a su vez, resulta de la</w:t>
-      </w:r>
-      <w:r>
-        <w:t xml:space="preserve"> </w:t>
-      </w:r>
-      <w:r>
-        <w:rPr>
-          <w:b/>
-          <w:bCs/>
-        </w:rPr>
-        <w:t xml:space="preserve">constitución sexual</w:t>
-      </w:r>
-      <w:r>
-        <w:t xml:space="preserve"> </w:t>
-      </w:r>
-      <w:r>
-        <w:t xml:space="preserve">más el</w:t>
-      </w:r>
-      <w:r>
-        <w:t xml:space="preserve"> </w:t>
-      </w:r>
-      <w:r>
-        <w:rPr>
-          <w:b/>
-          <w:bCs/>
-        </w:rPr>
-        <w:t xml:space="preserve">vivenciar infantil</w:t>
-      </w:r>
-      <w:r>
-        <w:t xml:space="preserve">. Aquí aparece la distinción que ordena el resto de la clase: la</w:t>
-      </w:r>
-      <w:r>
-        <w:t xml:space="preserve"> </w:t>
-      </w:r>
-      <w:r>
-        <w:rPr>
-          <w:b/>
-          <w:bCs/>
-        </w:rPr>
-        <w:t xml:space="preserve">condición neurótica</w:t>
-      </w:r>
-      <w:r>
-        <w:t xml:space="preserve"> </w:t>
-      </w:r>
-      <w:r>
-        <w:t xml:space="preserve">(la estructura) no es lo mismo que el</w:t>
-      </w:r>
-      <w:r>
-        <w:t xml:space="preserve"> </w:t>
-      </w:r>
-      <w:r>
-        <w:rPr>
-          <w:b/>
-          <w:bCs/>
-        </w:rPr>
-        <w:t xml:space="preserve">padecimiento</w:t>
-      </w:r>
-      <w:r>
-        <w:t xml:space="preserve">, que se desencadena cuando algo hace fracasar las soluciones del sujeto, la</w:t>
-      </w:r>
-      <w:r>
-        <w:t xml:space="preserve"> </w:t>
-      </w:r>
-      <w:r>
-        <w:rPr>
-          <w:b/>
-          <w:bCs/>
-          <w:i/>
-          <w:iCs/>
-        </w:rPr>
-        <w:t xml:space="preserve">Versagung</w:t>
-      </w:r>
-      <w:r>
-        <w:t xml:space="preserve">, y obliga a una</w:t>
-      </w:r>
-      <w:r>
-        <w:t xml:space="preserve"> </w:t>
-      </w:r>
-      <w:r>
-        <w:rPr>
-          <w:b/>
-          <w:bCs/>
-        </w:rPr>
-        <w:t xml:space="preserve">regresión</w:t>
-      </w:r>
-      <w:r>
-        <w:t xml:space="preserve">. Esto «traduce» la historia anterior: la salud aparente es la condición sin padecimiento; el retorno de lo reprimido es el padecimiento.</w:t>
-      </w:r>
-    </w:p>
-    <w:p>
-      <w:pPr>
-        <w:pStyle w:val="BodyText"/>
-      </w:pPr>
-      <w:r>
         <w:t xml:space="preserve">El</w:t>
       </w:r>
       <w:r>
@@ -789,8 +777,14 @@
     </w:p>
     <w:p>
       <w:pPr>
-        <w:pStyle w:val="BodyText"/>
-      </w:pPr>
+        <w:pStyle w:val="RecuadroParcial"/>
+      </w:pPr>
+      <w:r>
+        <w:t xml:space="preserve">🎯</w:t>
+      </w:r>
+      <w:r>
+        <w:t xml:space="preserve"> </w:t>
+      </w:r>
       <w:r>
         <w:rPr>
           <w:b/>
@@ -907,7 +901,7 @@
           <w:b/>
           <w:bCs/>
         </w:rPr>
-        <w:t xml:space="preserve">Defensa y representación inconciliable (T02, 1894):</w:t>
+        <w:t xml:space="preserve">Defensa y representación inconciliable (Freud, 1894/1996):</w:t>
       </w:r>
       <w:r>
         <w:t xml:space="preserve"> </w:t>
@@ -951,7 +945,7 @@
           <w:b/>
           <w:bCs/>
         </w:rPr>
-        <w:t xml:space="preserve">La estructura y el padecimiento (T01 + T04):</w:t>
+        <w:t xml:space="preserve">La estructura y el padecimiento (Belucci, 2014b; Freud, 1917/1996b):</w:t>
       </w:r>
       <w:r>
         <w:t xml:space="preserve"> </w:t>
@@ -986,7 +980,7 @@
           <w:b/>
           <w:bCs/>
         </w:rPr>
-        <w:t xml:space="preserve">El síntoma y sus caminos de formación (T04 + T01 + T03):</w:t>
+        <w:t xml:space="preserve">El síntoma y sus caminos de formación (Freud, 1917/1996b; Belucci, 2014b; Belucci, s. f.-c):</w:t>
       </w:r>
       <w:r>
         <w:t xml:space="preserve"> </w:t>
@@ -1046,7 +1040,7 @@
         <w:t xml:space="preserve"> </w:t>
       </w:r>
       <w:r>
-        <w:t xml:space="preserve">→ defensa → separación entre representación y afecto → destino del afecto según la neurosis (T02, pp. 5-9).</w:t>
+        <w:t xml:space="preserve">→ defensa → separación entre representación y afecto → destino del afecto según la neurosis (Freud, 1894/1996, pp. 5-9).</w:t>
       </w:r>
     </w:p>
     <w:p>
@@ -1084,7 +1078,7 @@
         <w:t xml:space="preserve"> </w:t>
       </w:r>
       <w:r>
-        <w:t xml:space="preserve">(T02, pp. 6-9).</w:t>
+        <w:t xml:space="preserve">(Freud, 1894/1996, pp. 6-9).</w:t>
       </w:r>
     </w:p>
     <w:p>
@@ -1138,7 +1132,7 @@
         <w:t xml:space="preserve"> </w:t>
       </w:r>
       <w:r>
-        <w:t xml:space="preserve">y el esquema: causación de la neurosis = predisposición por fijación libidinal + vivenciar accidental; fijación = constitución sexual + vivenciar infantil (T04).</w:t>
+        <w:t xml:space="preserve">y el esquema: causación de la neurosis = predisposición por fijación libidinal + vivenciar accidental; fijación = constitución sexual + vivenciar infantil (Freud, 1917/1996b).</w:t>
       </w:r>
     </w:p>
     <w:p>
@@ -1173,7 +1167,7 @@
         <w:t xml:space="preserve"> </w:t>
       </w:r>
       <w:r>
-        <w:t xml:space="preserve">(«mal funcionamiento», no «frustración») desencadena regresión y conflicto (T03 p. 4; T01 pp. 35-39).</w:t>
+        <w:t xml:space="preserve">(«mal funcionamiento», no «frustración») desencadena regresión y conflicto (Belucci, s. f.-c, p. 4; Belucci, 2014b, pp. 35-39).</w:t>
       </w:r>
     </w:p>
     <w:p>
@@ -1236,39 +1230,77 @@
     </w:p>
     <w:p>
       <w:pPr>
-        <w:pStyle w:val="FirstParagraph"/>
-      </w:pPr>
-      <w:r>
-        <w:t xml:space="preserve">La primera formulación freudiana sobre la neurosis la piensa como una</w:t>
-      </w:r>
-      <w:r>
-        <w:t xml:space="preserve"> </w:t>
-      </w:r>
-      <w:r>
-        <w:rPr>
-          <w:b/>
-          <w:bCs/>
-        </w:rPr>
-        <w:t xml:space="preserve">historia en tiempos</w:t>
-      </w:r>
-      <w:r>
-        <w:t xml:space="preserve"> </w:t>
-      </w:r>
-      <w:r>
-        <w:t xml:space="preserve">cuyo motor es la</w:t>
-      </w:r>
-      <w:r>
-        <w:t xml:space="preserve"> </w:t>
-      </w:r>
-      <w:r>
-        <w:rPr>
-          <w:b/>
-          <w:bCs/>
-        </w:rPr>
-        <w:t xml:space="preserve">defensa</w:t>
-      </w:r>
-      <w:r>
-        <w:t xml:space="preserve">. Freud parte (1894) de pacientes que gozaron de salud psíquica «hasta el momento en que sobrevino un caso de</w:t>
+        <w:pStyle w:val="RecuadroEsqueleto"/>
+      </w:pPr>
+      <w:r>
+        <w:rPr>
+          <w:b/>
+          <w:bCs/>
+        </w:rPr>
+        <w:t xml:space="preserve">Esqueleto de la respuesta:</w:t>
+      </w:r>
+    </w:p>
+    <w:p>
+      <w:pPr>
+        <w:pStyle w:val="RecuadroEsqueleto"/>
+      </w:pPr>
+      <w:r>
+        <w:t xml:space="preserve">1. </w:t>
+      </w:r>
+      <w:r>
+        <w:rPr>
+          <w:b/>
+          <w:bCs/>
+        </w:rPr>
+        <w:t xml:space="preserve">Tesis:</w:t>
+      </w:r>
+      <w:r>
+        <w:t xml:space="preserve"> </w:t>
+      </w:r>
+      <w:r>
+        <w:t xml:space="preserve">la primera teoría piensa la neurosis como una historia en tiempos cuyo motor es la defensa (Freud, 1894/1996, p. 5).</w:t>
+      </w:r>
+    </w:p>
+    <w:p>
+      <w:pPr>
+        <w:pStyle w:val="RecuadroEsqueleto"/>
+      </w:pPr>
+      <w:r>
+        <w:t xml:space="preserve">2. </w:t>
+      </w:r>
+      <w:r>
+        <w:rPr>
+          <w:b/>
+          <w:bCs/>
+        </w:rPr>
+        <w:t xml:space="preserve">Defensa:</w:t>
+      </w:r>
+      <w:r>
+        <w:t xml:space="preserve"> </w:t>
+      </w:r>
+      <w:r>
+        <w:t xml:space="preserve">representación inconciliable → el yo le arranca el afecto; la representación queda reprimida (Freud, 1894/1996, p. 6).</w:t>
+      </w:r>
+    </w:p>
+    <w:p>
+      <w:pPr>
+        <w:pStyle w:val="RecuadroEsqueleto"/>
+      </w:pPr>
+      <w:r>
+        <w:t xml:space="preserve">3. </w:t>
+      </w:r>
+      <w:r>
+        <w:rPr>
+          <w:b/>
+          <w:bCs/>
+        </w:rPr>
+        <w:t xml:space="preserve">Dos escenas:</w:t>
+      </w:r>
+      <w:r>
+        <w:t xml:space="preserve"> </w:t>
+      </w:r>
+      <w:r>
+        <w:t xml:space="preserve">primera escena infantil sin efecto patógeno → latencia → segunda escena que la despierta: trauma</w:t>
       </w:r>
       <w:r>
         <w:t xml:space="preserve"> </w:t>
@@ -1278,39 +1310,86 @@
           <w:i/>
           <w:iCs/>
         </w:rPr>
-        <w:t xml:space="preserve">inconciliabilidad</w:t>
-      </w:r>
-      <w:r>
-        <w:t xml:space="preserve"> </w:t>
-      </w:r>
-      <w:r>
-        <w:t xml:space="preserve">en su vida de representaciones», es decir, hasta que se presentó a su yo «una vivencia, una representación, una sensación que despertó un afecto tan penoso que la persona decidió olvidarla, no confiando en poder solucionar con su yo, mediante un trabajo de pensamiento, la contradicción» (T02, p. 5). Como la representación no puede ser tratada como «no acontecida» (</w:t>
+        <w:t xml:space="preserve">a posteriori</w:t>
+      </w:r>
+      <w:r>
+        <w:t xml:space="preserve"> </w:t>
+      </w:r>
+      <w:r>
+        <w:t xml:space="preserve">(</w:t>
       </w:r>
       <w:r>
         <w:rPr>
           <w:i/>
           <w:iCs/>
         </w:rPr>
-        <w:t xml:space="preserve">non arrivée</w:t>
-      </w:r>
-      <w:r>
-        <w:t xml:space="preserve">), el yo hace una solución aproximada:</w:t>
-      </w:r>
-      <w:r>
-        <w:t xml:space="preserve"> </w:t>
-      </w:r>
-      <w:r>
-        <w:rPr>
-          <w:b/>
-          <w:bCs/>
-        </w:rPr>
-        <w:t xml:space="preserve">arrancarle a la representación su afecto</w:t>
-      </w:r>
-      <w:r>
-        <w:t xml:space="preserve"> </w:t>
-      </w:r>
-      <w:r>
-        <w:t xml:space="preserve">(la suma de excitación), de modo que la representación debilitada «deje de plantear exigencias al trabajo asociativo» —queda reprimida— mientras el afecto divorciado tiene que ser aplicado a otro empleo (T02, p. 6). Ese es el tiempo de la defensa.</w:t>
+        <w:t xml:space="preserve">Nachträglichkeit</w:t>
+      </w:r>
+      <w:r>
+        <w:t xml:space="preserve">) (▸ Complemento; Belucci, 2014b, p. 4).</w:t>
+      </w:r>
+    </w:p>
+    <w:p>
+      <w:pPr>
+        <w:pStyle w:val="RecuadroEsqueleto"/>
+      </w:pPr>
+      <w:r>
+        <w:t xml:space="preserve">4. </w:t>
+      </w:r>
+      <w:r>
+        <w:rPr>
+          <w:b/>
+          <w:bCs/>
+        </w:rPr>
+        <w:t xml:space="preserve">Síntoma defensivo primario:</w:t>
+      </w:r>
+      <w:r>
+        <w:t xml:space="preserve"> </w:t>
+      </w:r>
+      <w:r>
+        <w:t xml:space="preserve">asco (histeria), escrupulosidad moral (obsesión), vergüenza (fobia): los diques (Belucci, 2014b, p. 4).</w:t>
+      </w:r>
+    </w:p>
+    <w:p>
+      <w:pPr>
+        <w:pStyle w:val="RecuadroEsqueleto"/>
+      </w:pPr>
+      <w:r>
+        <w:t xml:space="preserve">5. </w:t>
+      </w:r>
+      <w:r>
+        <w:rPr>
+          <w:b/>
+          <w:bCs/>
+        </w:rPr>
+        <w:t xml:space="preserve">Salud aparente → retorno de lo reprimido</w:t>
+      </w:r>
+      <w:r>
+        <w:t xml:space="preserve"> </w:t>
+      </w:r>
+      <w:r>
+        <w:t xml:space="preserve">cuando falla la contrainvestidura (Belucci, s. f.-c, p. 3).</w:t>
+      </w:r>
+    </w:p>
+    <w:p>
+      <w:pPr>
+        <w:pStyle w:val="RecuadroEsqueleto"/>
+      </w:pPr>
+      <w:r>
+        <w:t xml:space="preserve">6. </w:t>
+      </w:r>
+      <w:r>
+        <w:rPr>
+          <w:b/>
+          <w:bCs/>
+        </w:rPr>
+        <w:t xml:space="preserve">Cierre:</w:t>
+      </w:r>
+      <w:r>
+        <w:t xml:space="preserve"> </w:t>
+      </w:r>
+      <w:r>
+        <w:t xml:space="preserve">histeria → conversión (símbolo mnémico); obsesión → enlace falso del afecto con otra representación (Freud, 1894/1996, pp. 6-9).</w:t>
       </w:r>
     </w:p>
     <w:p>
@@ -1318,220 +1397,196 @@
         <w:pStyle w:val="BodyText"/>
       </w:pPr>
       <w:r>
-        <w:t xml:space="preserve">La</w:t>
-      </w:r>
-      <w:r>
-        <w:t xml:space="preserve"> </w:t>
-      </w:r>
-      <w:r>
-        <w:rPr>
-          <w:b/>
-          <w:bCs/>
-        </w:rPr>
-        <w:t xml:space="preserve">fórmula canónica</w:t>
-      </w:r>
-      <w:r>
-        <w:t xml:space="preserve"> </w:t>
-      </w:r>
-      <w:r>
-        <w:t xml:space="preserve">ordena el proceso en una secuencia.</w:t>
-      </w:r>
-      <w:r>
-        <w:t xml:space="preserve"> </w:t>
-      </w:r>
-      <w:r>
-        <w:rPr>
-          <w:b/>
-          <w:bCs/>
-        </w:rPr>
-        <w:t xml:space="preserve">▸ Complemento (Freud, Manuscrito K y</w:t>
-      </w:r>
-      <w:r>
-        <w:rPr>
-          <w:b/>
-          <w:bCs/>
-        </w:rPr>
-        <w:t xml:space="preserve"> </w:t>
-      </w:r>
-      <w:r>
-        <w:rPr>
-          <w:b/>
-          <w:bCs/>
+        <w:t xml:space="preserve">La primera formulación freudiana sobre la neurosis la piensa como una</w:t>
+      </w:r>
+      <w:r>
+        <w:t xml:space="preserve"> </w:t>
+      </w:r>
+      <w:r>
+        <w:rPr>
+          <w:b/>
+          <w:bCs/>
+        </w:rPr>
+        <w:t xml:space="preserve">historia en tiempos</w:t>
+      </w:r>
+      <w:r>
+        <w:t xml:space="preserve"> </w:t>
+      </w:r>
+      <w:r>
+        <w:t xml:space="preserve">cuyo motor es la</w:t>
+      </w:r>
+      <w:r>
+        <w:t xml:space="preserve"> </w:t>
+      </w:r>
+      <w:r>
+        <w:rPr>
+          <w:b/>
+          <w:bCs/>
+        </w:rPr>
+        <w:t xml:space="preserve">defensa</w:t>
+      </w:r>
+      <w:r>
+        <w:t xml:space="preserve">. Freud parte (1894) de pacientes que gozaron de salud psíquica «hasta el momento en que sobrevino un caso de</w:t>
+      </w:r>
+      <w:r>
+        <w:t xml:space="preserve"> </w:t>
+      </w:r>
+      <w:r>
+        <w:rPr>
           <w:i/>
           <w:iCs/>
         </w:rPr>
-        <w:t xml:space="preserve">Nuevas puntualizaciones</w:t>
-      </w:r>
-      <w:r>
-        <w:rPr>
-          <w:b/>
-          <w:bCs/>
-        </w:rPr>
-        <w:t xml:space="preserve">, 1896; Belucci lo cita en T01, p. 4):</w:t>
-      </w:r>
-      <w:r>
-        <w:t xml:space="preserve"> </w:t>
-      </w:r>
-      <w:r>
-        <w:t xml:space="preserve">hay una</w:t>
-      </w:r>
-      <w:r>
-        <w:t xml:space="preserve"> </w:t>
-      </w:r>
-      <w:r>
-        <w:rPr>
-          <w:b/>
-          <w:bCs/>
-        </w:rPr>
-        <w:t xml:space="preserve">primera escena</w:t>
-      </w:r>
-      <w:r>
-        <w:t xml:space="preserve">, experiencia sexual infantil prematura (pasiva y displacentera en la histeria; activa y con placer, luego recordada con culpa, en la neurosis obsesiva, T01 p. 8); en el momento en que ocurre</w:t>
-      </w:r>
-      <w:r>
-        <w:t xml:space="preserve"> </w:t>
-      </w:r>
-      <w:r>
-        <w:rPr>
-          <w:b/>
-          <w:bCs/>
-        </w:rPr>
-        <w:t xml:space="preserve">no produce efecto patógeno</w:t>
-      </w:r>
-      <w:r>
-        <w:t xml:space="preserve">, porque el niño no tiene todavía los medios para darle sentido sexual; sigue un período de</w:t>
-      </w:r>
-      <w:r>
-        <w:t xml:space="preserve"> </w:t>
-      </w:r>
-      <w:r>
-        <w:rPr>
-          <w:b/>
-          <w:bCs/>
-        </w:rPr>
-        <w:t xml:space="preserve">latencia</w:t>
-      </w:r>
-      <w:r>
-        <w:t xml:space="preserve"> </w:t>
-      </w:r>
-      <w:r>
-        <w:t xml:space="preserve">de salud aparente; en la pubertad, una</w:t>
-      </w:r>
-      <w:r>
-        <w:t xml:space="preserve"> </w:t>
-      </w:r>
-      <w:r>
-        <w:rPr>
-          <w:b/>
-          <w:bCs/>
-        </w:rPr>
-        <w:t xml:space="preserve">segunda escena</w:t>
-      </w:r>
-      <w:r>
-        <w:t xml:space="preserve">, en sí misma inocua pero asociativamente ligada a la primera, despierta la huella mnémica y produce</w:t>
-      </w:r>
-      <w:r>
-        <w:t xml:space="preserve"> </w:t>
+        <w:t xml:space="preserve">inconciliabilidad</w:t>
+      </w:r>
+      <w:r>
+        <w:t xml:space="preserve"> </w:t>
+      </w:r>
+      <w:r>
+        <w:t xml:space="preserve">en su vida de representaciones», es decir, hasta que se presentó a su yo «una vivencia, una representación, una sensación que despertó un afecto tan penoso que la persona decidió olvidarla, no confiando en poder solucionar con su yo, mediante un trabajo de pensamiento, la contradicción» (Freud, 1894/1996, p. 5). Como la representación no puede ser tratada como «no acontecida» (</w:t>
       </w:r>
       <w:r>
         <w:rPr>
           <w:i/>
           <w:iCs/>
         </w:rPr>
-        <w:t xml:space="preserve">a posteriori</w:t>
-      </w:r>
-      <w:r>
-        <w:t xml:space="preserve"> </w:t>
-      </w:r>
-      <w:r>
-        <w:t xml:space="preserve">un afecto sexual que no pudo producir en su momento: recién ahí la primera escena se vuelve traumática (</w:t>
-      </w:r>
-      <w:r>
-        <w:rPr>
+        <w:t xml:space="preserve">non arrivée</w:t>
+      </w:r>
+      <w:r>
+        <w:t xml:space="preserve">), el yo hace una solución aproximada:</w:t>
+      </w:r>
+      <w:r>
+        <w:t xml:space="preserve"> </w:t>
+      </w:r>
+      <w:r>
+        <w:rPr>
+          <w:b/>
+          <w:bCs/>
+        </w:rPr>
+        <w:t xml:space="preserve">arrancarle a la representación su afecto</w:t>
+      </w:r>
+      <w:r>
+        <w:t xml:space="preserve"> </w:t>
+      </w:r>
+      <w:r>
+        <w:t xml:space="preserve">(la suma de excitación), de modo que la representación debilitada «deje de plantear exigencias al trabajo asociativo» —queda reprimida— mientras el afecto divorciado tiene que ser aplicado a otro empleo (Freud, 1894/1996, p. 6). Ese es el tiempo de la defensa.</w:t>
+      </w:r>
+    </w:p>
+    <w:p>
+      <w:pPr>
+        <w:pStyle w:val="BodyText"/>
+      </w:pPr>
+      <w:r>
+        <w:t xml:space="preserve">La</w:t>
+      </w:r>
+      <w:r>
+        <w:t xml:space="preserve"> </w:t>
+      </w:r>
+      <w:r>
+        <w:rPr>
+          <w:b/>
+          <w:bCs/>
+        </w:rPr>
+        <w:t xml:space="preserve">fórmula canónica</w:t>
+      </w:r>
+      <w:r>
+        <w:t xml:space="preserve"> </w:t>
+      </w:r>
+      <w:r>
+        <w:t xml:space="preserve">ordena el proceso en una secuencia.</w:t>
+      </w:r>
+      <w:r>
+        <w:t xml:space="preserve"> </w:t>
+      </w:r>
+      <w:r>
+        <w:rPr>
+          <w:b/>
+          <w:bCs/>
+        </w:rPr>
+        <w:t xml:space="preserve">▸ Complemento (Freud, Manuscrito K y</w:t>
+      </w:r>
+      <w:r>
+        <w:rPr>
+          <w:b/>
+          <w:bCs/>
+        </w:rPr>
+        <w:t xml:space="preserve"> </w:t>
+      </w:r>
+      <w:r>
+        <w:rPr>
+          <w:b/>
+          <w:bCs/>
           <w:i/>
           <w:iCs/>
         </w:rPr>
-        <w:t xml:space="preserve">Nachträglichkeit</w:t>
-      </w:r>
-      <w:r>
-        <w:t xml:space="preserve">). El yo responde entonces con la</w:t>
-      </w:r>
-      <w:r>
-        <w:t xml:space="preserve"> </w:t>
-      </w:r>
-      <w:r>
-        <w:rPr>
-          <w:b/>
-          <w:bCs/>
-        </w:rPr>
-        <w:t xml:space="preserve">defensa</w:t>
-      </w:r>
-      <w:r>
-        <w:t xml:space="preserve"> </w:t>
-      </w:r>
-      <w:r>
-        <w:t xml:space="preserve">(represión) y esta deja una marca constitutiva: el</w:t>
-      </w:r>
-      <w:r>
-        <w:t xml:space="preserve"> </w:t>
-      </w:r>
-      <w:r>
-        <w:rPr>
-          <w:b/>
-          <w:bCs/>
-        </w:rPr>
-        <w:t xml:space="preserve">síntoma defensivo primario</w:t>
-      </w:r>
-      <w:r>
-        <w:t xml:space="preserve"> </w:t>
-      </w:r>
-      <w:r>
-        <w:t xml:space="preserve">(«síntoma primario» del Manuscrito K), que «atestigua la operación de la represión, y el sentido en el que ella ha operado, independientemente de la presencia de síntomas clínicos» (T01, p. 4) y permite leer «retroactivamente la “elección de neurosis”». Para la obsesión es «un matiz de escrupulosidad de la conciencia moral»; para la histeria, la conversión de la excitación sexual en</w:t>
-      </w:r>
-      <w:r>
-        <w:t xml:space="preserve"> </w:t>
-      </w:r>
-      <w:r>
-        <w:rPr>
-          <w:b/>
-          <w:bCs/>
-        </w:rPr>
-        <w:t xml:space="preserve">displacer —en particular el asco—</w:t>
-      </w:r>
-      <w:r>
-        <w:t xml:space="preserve">: «yo llamaría “histérica”, sin vacilar, a toda persona, sea o no capaz de producir síntomas somáticos, en quien una ocasión de excitación sexual provoca predominante o exclusivamente sentimientos de displacer» (T01, p. 4); en las fobias aparece algo del orden de la</w:t>
-      </w:r>
-      <w:r>
-        <w:t xml:space="preserve"> </w:t>
-      </w:r>
-      <w:r>
-        <w:rPr>
-          <w:b/>
-          <w:bCs/>
-        </w:rPr>
-        <w:t xml:space="preserve">vergüenza</w:t>
-      </w:r>
-      <w:r>
-        <w:t xml:space="preserve"> </w:t>
-      </w:r>
-      <w:r>
-        <w:t xml:space="preserve">(T01, p. 4). Estos tres —moral, asco, vergüenza— son los</w:t>
-      </w:r>
-      <w:r>
-        <w:t xml:space="preserve"> </w:t>
-      </w:r>
-      <w:r>
-        <w:rPr>
-          <w:b/>
-          <w:bCs/>
-        </w:rPr>
-        <w:t xml:space="preserve">diques</w:t>
-      </w:r>
-      <w:r>
-        <w:t xml:space="preserve"> </w:t>
-      </w:r>
-      <w:r>
-        <w:t xml:space="preserve">de los</w:t>
+        <w:t xml:space="preserve">Nuevas puntualizaciones</w:t>
+      </w:r>
+      <w:r>
+        <w:rPr>
+          <w:b/>
+          <w:bCs/>
+        </w:rPr>
+        <w:t xml:space="preserve">, 1896; citado en Belucci, 2014b, p. 4):</w:t>
+      </w:r>
+      <w:r>
+        <w:t xml:space="preserve"> </w:t>
+      </w:r>
+      <w:r>
+        <w:t xml:space="preserve">hay una</w:t>
+      </w:r>
+      <w:r>
+        <w:t xml:space="preserve"> </w:t>
+      </w:r>
+      <w:r>
+        <w:rPr>
+          <w:b/>
+          <w:bCs/>
+        </w:rPr>
+        <w:t xml:space="preserve">primera escena</w:t>
+      </w:r>
+      <w:r>
+        <w:t xml:space="preserve">, experiencia sexual infantil prematura (pasiva y displacentera en la histeria; activa y con placer, luego recordada con culpa, en la neurosis obsesiva, Belucci, 2014b, p. 8); en el momento en que ocurre</w:t>
+      </w:r>
+      <w:r>
+        <w:t xml:space="preserve"> </w:t>
+      </w:r>
+      <w:r>
+        <w:rPr>
+          <w:b/>
+          <w:bCs/>
+        </w:rPr>
+        <w:t xml:space="preserve">no produce efecto patógeno</w:t>
+      </w:r>
+      <w:r>
+        <w:t xml:space="preserve">, porque el niño no tiene todavía los medios para darle sentido sexual; sigue un período de</w:t>
+      </w:r>
+      <w:r>
+        <w:t xml:space="preserve"> </w:t>
+      </w:r>
+      <w:r>
+        <w:rPr>
+          <w:b/>
+          <w:bCs/>
+        </w:rPr>
+        <w:t xml:space="preserve">latencia</w:t>
+      </w:r>
+      <w:r>
+        <w:t xml:space="preserve"> </w:t>
+      </w:r>
+      <w:r>
+        <w:t xml:space="preserve">de salud aparente; en la pubertad, una</w:t>
+      </w:r>
+      <w:r>
+        <w:t xml:space="preserve"> </w:t>
+      </w:r>
+      <w:r>
+        <w:rPr>
+          <w:b/>
+          <w:bCs/>
+        </w:rPr>
+        <w:t xml:space="preserve">segunda escena</w:t>
+      </w:r>
+      <w:r>
+        <w:t xml:space="preserve">, en sí misma inocua pero asociativamente ligada a la primera, despierta la huella mnémica y produce</w:t>
       </w:r>
       <w:r>
         <w:t xml:space="preserve"> </w:t>
@@ -1541,13 +1596,116 @@
           <w:i/>
           <w:iCs/>
         </w:rPr>
+        <w:t xml:space="preserve">a posteriori</w:t>
+      </w:r>
+      <w:r>
+        <w:t xml:space="preserve"> </w:t>
+      </w:r>
+      <w:r>
+        <w:t xml:space="preserve">un afecto sexual que no pudo producir en su momento: recién ahí la primera escena se vuelve traumática (</w:t>
+      </w:r>
+      <w:r>
+        <w:rPr>
+          <w:i/>
+          <w:iCs/>
+        </w:rPr>
+        <w:t xml:space="preserve">Nachträglichkeit</w:t>
+      </w:r>
+      <w:r>
+        <w:t xml:space="preserve">). El yo responde entonces con la</w:t>
+      </w:r>
+      <w:r>
+        <w:t xml:space="preserve"> </w:t>
+      </w:r>
+      <w:r>
+        <w:rPr>
+          <w:b/>
+          <w:bCs/>
+        </w:rPr>
+        <w:t xml:space="preserve">defensa</w:t>
+      </w:r>
+      <w:r>
+        <w:t xml:space="preserve"> </w:t>
+      </w:r>
+      <w:r>
+        <w:t xml:space="preserve">(represión) y esta deja una marca constitutiva: el</w:t>
+      </w:r>
+      <w:r>
+        <w:t xml:space="preserve"> </w:t>
+      </w:r>
+      <w:r>
+        <w:rPr>
+          <w:b/>
+          <w:bCs/>
+        </w:rPr>
+        <w:t xml:space="preserve">síntoma defensivo primario</w:t>
+      </w:r>
+      <w:r>
+        <w:t xml:space="preserve"> </w:t>
+      </w:r>
+      <w:r>
+        <w:t xml:space="preserve">(«síntoma primario» del Manuscrito K), que «atestigua la operación de la represión, y el sentido en el que ella ha operado, independientemente de la presencia de síntomas clínicos» (Belucci, 2014b, p. 4) y permite leer «retroactivamente la “elección de neurosis”». Para la obsesión es «un matiz de escrupulosidad de la conciencia moral»; para la histeria, la conversión de la excitación sexual en</w:t>
+      </w:r>
+      <w:r>
+        <w:t xml:space="preserve"> </w:t>
+      </w:r>
+      <w:r>
+        <w:rPr>
+          <w:b/>
+          <w:bCs/>
+        </w:rPr>
+        <w:t xml:space="preserve">displacer —en particular el asco—</w:t>
+      </w:r>
+      <w:r>
+        <w:t xml:space="preserve">: «yo llamaría “histérica”, sin vacilar, a toda persona, sea o no capaz de producir síntomas somáticos, en quien una ocasión de excitación sexual provoca predominante o exclusivamente sentimientos de displacer» (Belucci, 2014b, p. 4); en las fobias aparece algo del orden de la</w:t>
+      </w:r>
+      <w:r>
+        <w:t xml:space="preserve"> </w:t>
+      </w:r>
+      <w:r>
+        <w:rPr>
+          <w:b/>
+          <w:bCs/>
+        </w:rPr>
+        <w:t xml:space="preserve">vergüenza</w:t>
+      </w:r>
+      <w:r>
+        <w:t xml:space="preserve"> </w:t>
+      </w:r>
+      <w:r>
+        <w:t xml:space="preserve">(Belucci, 2014b, p. 4). Estos tres —moral, asco, vergüenza— son los</w:t>
+      </w:r>
+      <w:r>
+        <w:t xml:space="preserve"> </w:t>
+      </w:r>
+      <w:r>
+        <w:rPr>
+          <w:b/>
+          <w:bCs/>
+        </w:rPr>
+        <w:t xml:space="preserve">diques</w:t>
+      </w:r>
+      <w:r>
+        <w:t xml:space="preserve"> </w:t>
+      </w:r>
+      <w:r>
+        <w:t xml:space="preserve">de los</w:t>
+      </w:r>
+      <w:r>
+        <w:t xml:space="preserve"> </w:t>
+      </w:r>
+      <w:r>
+        <w:rPr>
+          <w:i/>
+          <w:iCs/>
+        </w:rPr>
         <w:t xml:space="preserve">Tres ensayos</w:t>
       </w:r>
       <w:r>
         <w:t xml:space="preserve"> </w:t>
       </w:r>
       <w:r>
-        <w:t xml:space="preserve">(T01, p. 4).</w:t>
+        <w:t xml:space="preserve">(Belucci, 2014b, p. 4).</w:t>
       </w:r>
     </w:p>
     <w:p>
@@ -1600,7 +1758,7 @@
         <w:t xml:space="preserve"> </w:t>
       </w:r>
       <w:r>
-        <w:t xml:space="preserve">(T03, p. 3): lo reprimido logra acceder a la conciencia «por medio de su conexión con algún elemento sustitutivo». Y aquí el destino difiere según la neurosis (T02, pp. 6-9): en la</w:t>
+        <w:t xml:space="preserve">(Belucci, s. f.-c, p. 3): lo reprimido logra acceder a la conciencia «por medio de su conexión con algún elemento sustitutivo». Y aquí el destino difiere según la neurosis (Freud, 1894/1996, pp. 6-9): en la</w:t>
       </w:r>
       <w:r>
         <w:t xml:space="preserve"> </w:t>
@@ -1674,7 +1832,60 @@
         <w:t xml:space="preserve"> </w:t>
       </w:r>
       <w:r>
-        <w:t xml:space="preserve">de ahí que en la obsesión lo que retorna lo haga como autorreproche transformado, con afectos de culpa, vergüenza, angustia. En ambos casos el síntoma es el retorno disfrazado de la representación sexual inconciliable, y la representación reprimida pasa a formar «el núcleo de un grupo psíquico segundo» (T02, p. 7 y p. 12).</w:t>
+        <w:t xml:space="preserve">de ahí que en la obsesión lo que retorna lo haga como autorreproche transformado, con afectos de culpa, vergüenza, angustia. En ambos casos el síntoma es el retorno disfrazado de la representación sexual inconciliable, y la representación reprimida pasa a formar «el núcleo de un grupo psíquico segundo» (Freud, 1894/1996, p. 7 y p. 12).</w:t>
+      </w:r>
+    </w:p>
+    <w:p>
+      <w:pPr>
+        <w:pStyle w:val="RecuadroAtencion"/>
+      </w:pPr>
+      <w:r>
+        <w:t xml:space="preserve">⚠</w:t>
+      </w:r>
+      <w:r>
+        <w:t xml:space="preserve"> </w:t>
+      </w:r>
+      <w:r>
+        <w:rPr>
+          <w:b/>
+          <w:bCs/>
+        </w:rPr>
+        <w:t xml:space="preserve">No confundir:</w:t>
+      </w:r>
+      <w:r>
+        <w:t xml:space="preserve"> </w:t>
+      </w:r>
+      <w:r>
+        <w:t xml:space="preserve">la primera escena</w:t>
+      </w:r>
+      <w:r>
+        <w:t xml:space="preserve"> </w:t>
+      </w:r>
+      <w:r>
+        <w:rPr>
+          <w:b/>
+          <w:bCs/>
+        </w:rPr>
+        <w:t xml:space="preserve">no</w:t>
+      </w:r>
+      <w:r>
+        <w:t xml:space="preserve"> </w:t>
+      </w:r>
+      <w:r>
+        <w:t xml:space="preserve">es traumática cuando ocurre: lo es</w:t>
+      </w:r>
+      <w:r>
+        <w:t xml:space="preserve"> </w:t>
+      </w:r>
+      <w:r>
+        <w:rPr>
+          <w:i/>
+          <w:iCs/>
+        </w:rPr>
+        <w:t xml:space="preserve">a posteriori</w:t>
+      </w:r>
+      <w:r>
+        <w:t xml:space="preserve">, por la segunda. Y el síntoma defensivo primario no es un síntoma clínico: es la marca de la represión.</w:t>
       </w:r>
     </w:p>
     <w:bookmarkEnd w:id="12"/>
@@ -1687,13 +1898,13 @@
         <w:t xml:space="preserve">1.2 Desarrollo ampliado (todo lo que dice la fuente)</w:t>
       </w:r>
     </w:p>
-    <w:bookmarkStart w:id="13" w:name="X82ba969e0df2142e0a12f08f75c094595007b85"/>
+    <w:bookmarkStart w:id="13" w:name="X1bf9949522980abb659cd93dc2f52230412dc33"/>
     <w:p>
       <w:pPr>
         <w:pStyle w:val="Heading4"/>
       </w:pPr>
       <w:r>
-        <w:t xml:space="preserve">a) El punto de partida: la inconciliabilidad y el empeño voluntario (T02, pp. 3-6)</w:t>
+        <w:t xml:space="preserve">a) El punto de partida: la inconciliabilidad y el empeño voluntario (Freud, 1894/1996, pp. 3-6)</w:t>
       </w:r>
     </w:p>
     <w:p>
@@ -1705,7 +1916,7 @@
         </w:numPr>
       </w:pPr>
       <w:r>
-        <w:t xml:space="preserve">Freud dice que su teoría surge del estudio de «fobias y representaciones obsesivas» y que luego la extiende a la histeria y a ciertas psicosis alucinatorias (T02, p. 3). El título completo:</w:t>
+        <w:t xml:space="preserve">Freud dice que su teoría surge del estudio de «fobias y representaciones obsesivas» y que luego la extiende a la histeria y a ciertas psicosis alucinatorias (Freud, 1894/1996, p. 3). El título completo:</w:t>
       </w:r>
       <w:r>
         <w:t xml:space="preserve"> </w:t>
@@ -1866,7 +2077,7 @@
         <w:t xml:space="preserve">histeria de defensa</w:t>
       </w:r>
       <w:r>
-        <w:t xml:space="preserve">, que es la que le interesa, también llamada provisoriamente «adquirida» porque en ella no cabe hablar de tara hereditaria grave (T02, pp. 4-5).</w:t>
+        <w:t xml:space="preserve">, que es la que le interesa, también llamada provisoriamente «adquirida» porque en ella no cabe hablar de tara hereditaria grave (Freud, 1894/1996, pp. 4-5).</w:t>
       </w:r>
     </w:p>
     <w:p>
@@ -1894,7 +2105,7 @@
         <w:t xml:space="preserve"> </w:t>
       </w:r>
       <w:r>
-        <w:t xml:space="preserve">del enfermo, «cuyo motivo es posible indicar». El paciente no se propone escindir su conciencia; «su propósito es otro, pero él no alcanza su meta, sino que genera una escisión de conciencia» (T02, p. 4).</w:t>
+        <w:t xml:space="preserve">del enfermo, «cuyo motivo es posible indicar». El paciente no se propone escindir su conciencia; «su propósito es otro, pero él no alcanza su meta, sino que genera una escisión de conciencia» (Freud, 1894/1996, p. 4).</w:t>
       </w:r>
     </w:p>
     <w:p>
@@ -1916,7 +2127,7 @@
         <w:t xml:space="preserve"> </w:t>
       </w:r>
       <w:r>
-        <w:t xml:space="preserve">(T02, p. 5): una joven que se reprocha, mientras cuida a su padre enfermo, pensar en un joven que le dejó una leve impresión erótica; una gobernanta enamorada de su patrón que resuelve quitarse esa simpatía porque la juzga inconciliable con su orgullo. En las mujeres, estas representaciones inconciliables nacen «las más de las veces sobre el suelo del vivenciar y el sentir sexuales»; las afectadas recuerdan con precisión sus empeños defensivos: «ahuyentar» la cosa, no pensar, sofocarla.</w:t>
+        <w:t xml:space="preserve">(Freud, 1894/1996, p. 5): una joven que se reprocha, mientras cuida a su padre enfermo, pensar en un joven que le dejó una leve impresión erótica; una gobernanta enamorada de su patrón que resuelve quitarse esa simpatía porque la juzga inconciliable con su orgullo. En las mujeres, estas representaciones inconciliables nacen «las más de las veces sobre el suelo del vivenciar y el sentir sexuales»; las afectadas recuerdan con precisión sus empeños defensivos: «ahuyentar» la cosa, no pensar, sofocarla.</w:t>
       </w:r>
     </w:p>
     <w:p>
@@ -1957,17 +2168,17 @@
         <w:t xml:space="preserve">predisposición patológica</w:t>
       </w:r>
       <w:r>
-        <w:t xml:space="preserve">, no necesariamente idéntica a una «degeneración» (T02, p. 6).</w:t>
+        <w:t xml:space="preserve">, no necesariamente idéntica a una «degeneración» (Freud, 1894/1996, p. 6).</w:t>
       </w:r>
     </w:p>
     <w:bookmarkEnd w:id="13"/>
-    <w:bookmarkStart w:id="14" w:name="Xb4374a0994c03f6425805b9a002d74a4d98e5bf"/>
+    <w:bookmarkStart w:id="14" w:name="X4831f06448bb30f8b26d737c4026871a6816e78"/>
     <w:p>
       <w:pPr>
         <w:pStyle w:val="Heading4"/>
       </w:pPr>
       <w:r>
-        <w:t xml:space="preserve">b) La operación defensiva: dividir representación y afecto (T02, p. 6)</w:t>
+        <w:t xml:space="preserve">b) La operación defensiva: dividir representación y afecto (Freud, 1894/1996, p. 6)</w:t>
       </w:r>
     </w:p>
     <w:p>
@@ -2067,7 +2278,7 @@
         <w:t xml:space="preserve"> </w:t>
       </w:r>
       <w:r>
-        <w:t xml:space="preserve">(T02, p. 17): en las funciones psíquicas hay algo (monto de afecto, suma de excitación) que tiene propiedades de una</w:t>
+        <w:t xml:space="preserve">(Freud, 1894/1996, p. 17): en las funciones psíquicas hay algo (monto de afecto, suma de excitación) que tiene propiedades de una</w:t>
       </w:r>
       <w:r>
         <w:t xml:space="preserve"> </w:t>
@@ -2103,13 +2314,13 @@
       </w:r>
     </w:p>
     <w:bookmarkEnd w:id="14"/>
-    <w:bookmarkStart w:id="15" w:name="Xda1b4f6717d1a17ea3e59ca86283735e6cd5a3a"/>
+    <w:bookmarkStart w:id="15" w:name="X06844264eaa1b9e9e4bec9d7b03c1372f75efa3"/>
     <w:p>
       <w:pPr>
         <w:pStyle w:val="Heading4"/>
       </w:pPr>
       <w:r>
-        <w:t xml:space="preserve">c) Los tres destinos del afecto (T02, pp. 6-17)</w:t>
+        <w:t xml:space="preserve">c) Los tres destinos del afecto (Freud, 1894/1996, pp. 6-17)</w:t>
       </w:r>
     </w:p>
     <w:tbl>
@@ -2553,13 +2764,13 @@
       </w:tr>
     </w:tbl>
     <w:bookmarkEnd w:id="15"/>
-    <w:bookmarkStart w:id="16" w:name="X7d18d8e55d3c955251da8220ba11ec5f81d5059"/>
+    <w:bookmarkStart w:id="16" w:name="X07390119b7a12773c642bdefc53c62033b29605"/>
     <w:p>
       <w:pPr>
         <w:pStyle w:val="Heading4"/>
       </w:pPr>
       <w:r>
-        <w:t xml:space="preserve">d) El momento traumático y los «traumáticos auxiliares» (T02, p. 7)</w:t>
+        <w:t xml:space="preserve">d) El momento traumático y los «traumáticos auxiliares» (Freud, 1894/1996, p. 7)</w:t>
       </w:r>
     </w:p>
     <w:p>
@@ -2643,17 +2854,17 @@
         <w:t xml:space="preserve"> </w:t>
       </w:r>
       <w:r>
-        <w:t xml:space="preserve">consiste en «volver a guiar la excitación, con conciencia de la meta, de lo corporal a lo psíquico», para forzar a reequilibrar la contradicción mediante un trabajo de pensamiento y descargar la excitación por el habla (T02, p. 7).</w:t>
+        <w:t xml:space="preserve">consiste en «volver a guiar la excitación, con conciencia de la meta, de lo corporal a lo psíquico», para forzar a reequilibrar la contradicción mediante un trabajo de pensamiento y descargar la excitación por el habla (Freud, 1894/1996, p. 7).</w:t>
       </w:r>
     </w:p>
     <w:bookmarkEnd w:id="16"/>
-    <w:bookmarkStart w:id="17" w:name="X75e5df4139fee866d3c1f8ea7c18d0f5c01b964"/>
+    <w:bookmarkStart w:id="17" w:name="X0267f82cdcd7cea67e944cab38696b5b7d1ea82"/>
     <w:p>
       <w:pPr>
         <w:pStyle w:val="Heading4"/>
       </w:pPr>
       <w:r>
-        <w:t xml:space="preserve">e) La causa sexual y la «retraducción» (T02, pp. 9-14)</w:t>
+        <w:t xml:space="preserve">e) La causa sexual y la «retraducción» (Freud, 1894/1996, pp. 9-14)</w:t>
       </w:r>
     </w:p>
     <w:p>
@@ -2801,13 +3012,13 @@
       </w:r>
     </w:p>
     <w:bookmarkEnd w:id="17"/>
-    <w:bookmarkStart w:id="18" w:name="X82029bc22084be42d40a567995c34875411165d"/>
+    <w:bookmarkStart w:id="18" w:name="X2fade61ce3dac175dfd13a56cfeb2a205c5c6af"/>
     <w:p>
       <w:pPr>
         <w:pStyle w:val="Heading4"/>
       </w:pPr>
       <w:r>
-        <w:t xml:space="preserve">f) Los tres ejemplos clínicos de obsesión/fobia (T02, pp. 12-14)</w:t>
+        <w:t xml:space="preserve">f) Los tres ejemplos clínicos de obsesión/fobia (Freud, 1894/1996, pp. 12-14)</w:t>
       </w:r>
     </w:p>
     <w:p>
@@ -2967,13 +3178,13 @@
       </w:r>
     </w:p>
     <w:bookmarkEnd w:id="18"/>
-    <w:bookmarkStart w:id="19" w:name="Xd8c145b75cb89748bf716c3872e9faa3c113ca5"/>
+    <w:bookmarkStart w:id="19" w:name="X8c2befb1d53fc56be43f9ea1b5b4abb2f301104"/>
     <w:p>
       <w:pPr>
         <w:pStyle w:val="Heading4"/>
       </w:pPr>
       <w:r>
-        <w:t xml:space="preserve">g) La tercera modalidad: la desestimación y la psicosis (T02, pp. 15-17)</w:t>
+        <w:t xml:space="preserve">g) La tercera modalidad: la desestimación y la psicosis (Freud, 1894/1996, pp. 15-17)</w:t>
       </w:r>
     </w:p>
     <w:p>
@@ -3153,13 +3364,13 @@
       </w:r>
     </w:p>
     <w:bookmarkEnd w:id="19"/>
-    <w:bookmarkStart w:id="20" w:name="X4bea896997fe32d8d3d0de74f680895aa83f555"/>
+    <w:bookmarkStart w:id="20" w:name="Xf3bf20715b31ddc72bb2bc0c9d8dc6698947cc7"/>
     <w:p>
       <w:pPr>
         <w:pStyle w:val="Heading4"/>
       </w:pPr>
       <w:r>
-        <w:t xml:space="preserve">h) El retorno de lo reprimido en Belucci (T03, p. 3)</w:t>
+        <w:t xml:space="preserve">h) El retorno de lo reprimido en Belucci (s. f.-c, p. 3)</w:t>
       </w:r>
     </w:p>
     <w:p>
@@ -3291,7 +3502,7 @@
         </w:numPr>
       </w:pPr>
       <w:r>
-        <w:t xml:space="preserve">La represión es «individual y móvil» (T03, p. 3). La consecuencia registrable de la represión propiamente dicha es la</w:t>
+        <w:t xml:space="preserve">La represión es «individual y móvil» (Belucci, s. f.-c, p. 3). La consecuencia registrable de la represión propiamente dicha es la</w:t>
       </w:r>
       <w:r>
         <w:t xml:space="preserve"> </w:t>
@@ -3307,7 +3518,7 @@
         <w:t xml:space="preserve"> </w:t>
       </w:r>
       <w:r>
-        <w:t xml:space="preserve">(el olvido de Dora de la fuente de sus conocimientos sexuales, T03, pp. 2-3). Hay</w:t>
+        <w:t xml:space="preserve">(el olvido de Dora de la fuente de sus conocimientos sexuales, Belucci, s. f.-c, pp. 2-3). Hay</w:t>
       </w:r>
       <w:r>
         <w:t xml:space="preserve"> </w:t>
@@ -3339,7 +3550,7 @@
         <w:t xml:space="preserve"> </w:t>
       </w:r>
       <w:r>
-        <w:t xml:space="preserve">(constatable) (T03, p. 2).</w:t>
+        <w:t xml:space="preserve">(constatable) (Belucci, s. f.-c, p. 2).</w:t>
       </w:r>
     </w:p>
     <w:p>
@@ -3441,84 +3652,98 @@
     </w:p>
     <w:p>
       <w:pPr>
-        <w:pStyle w:val="FirstParagraph"/>
-      </w:pPr>
-      <w:r>
-        <w:t xml:space="preserve">Con las</w:t>
-      </w:r>
-      <w:r>
-        <w:t xml:space="preserve"> </w:t>
-      </w:r>
-      <w:r>
-        <w:rPr>
-          <w:b/>
-          <w:bCs/>
-        </w:rPr>
-        <w:t xml:space="preserve">series complementarias</w:t>
-      </w:r>
-      <w:r>
-        <w:t xml:space="preserve"> </w:t>
-      </w:r>
-      <w:r>
-        <w:t xml:space="preserve">(23.ª Conferencia, 1917) Freud abandona la idea de una causa única y piensa la neurosis como el resultado de la</w:t>
-      </w:r>
-      <w:r>
-        <w:t xml:space="preserve"> </w:t>
-      </w:r>
-      <w:r>
-        <w:rPr>
-          <w:b/>
-          <w:bCs/>
-        </w:rPr>
-        <w:t xml:space="preserve">conjugación proporcional de factores</w:t>
-      </w:r>
-      <w:r>
-        <w:t xml:space="preserve">. La</w:t>
-      </w:r>
-      <w:r>
-        <w:t xml:space="preserve"> </w:t>
-      </w:r>
-      <w:r>
-        <w:rPr>
-          <w:b/>
-          <w:bCs/>
-        </w:rPr>
-        <w:t xml:space="preserve">causación de la neurosis</w:t>
-      </w:r>
-      <w:r>
-        <w:t xml:space="preserve"> </w:t>
-      </w:r>
-      <w:r>
-        <w:t xml:space="preserve">del adulto es igual a</w:t>
-      </w:r>
-      <w:r>
-        <w:t xml:space="preserve"> </w:t>
-      </w:r>
-      <w:r>
-        <w:rPr>
-          <w:b/>
-          <w:bCs/>
-        </w:rPr>
-        <w:t xml:space="preserve">predisposición por fijación libidinal + vivenciar accidental (traumático)</w:t>
-      </w:r>
-      <w:r>
-        <w:t xml:space="preserve">. A su vez, la fijación libidinal del adulto «se nos descompone en otros dos factores»: la</w:t>
-      </w:r>
-      <w:r>
-        <w:t xml:space="preserve"> </w:t>
-      </w:r>
-      <w:r>
-        <w:rPr>
-          <w:b/>
-          <w:bCs/>
-        </w:rPr>
-        <w:t xml:space="preserve">constitución sexual</w:t>
-      </w:r>
-      <w:r>
-        <w:t xml:space="preserve"> </w:t>
-      </w:r>
-      <w:r>
-        <w:t xml:space="preserve">hereditaria («vivenciar prehistórico»,</w:t>
+        <w:pStyle w:val="RecuadroEsqueleto"/>
+      </w:pPr>
+      <w:r>
+        <w:rPr>
+          <w:b/>
+          <w:bCs/>
+        </w:rPr>
+        <w:t xml:space="preserve">Esqueleto de la respuesta:</w:t>
+      </w:r>
+    </w:p>
+    <w:p>
+      <w:pPr>
+        <w:pStyle w:val="RecuadroEsqueleto"/>
+      </w:pPr>
+      <w:r>
+        <w:t xml:space="preserve">1. </w:t>
+      </w:r>
+      <w:r>
+        <w:rPr>
+          <w:b/>
+          <w:bCs/>
+        </w:rPr>
+        <w:t xml:space="preserve">Tesis:</w:t>
+      </w:r>
+      <w:r>
+        <w:t xml:space="preserve"> </w:t>
+      </w:r>
+      <w:r>
+        <w:t xml:space="preserve">con las series complementarias (1917) la neurosis resulta de una conjugación proporcional de factores, no de una causa única (Freud, 1917/1996b).</w:t>
+      </w:r>
+    </w:p>
+    <w:p>
+      <w:pPr>
+        <w:pStyle w:val="RecuadroEsqueleto"/>
+      </w:pPr>
+      <w:r>
+        <w:t xml:space="preserve">2. </w:t>
+      </w:r>
+      <w:r>
+        <w:rPr>
+          <w:b/>
+          <w:bCs/>
+        </w:rPr>
+        <w:t xml:space="preserve">Esquema:</w:t>
+      </w:r>
+      <w:r>
+        <w:t xml:space="preserve"> </w:t>
+      </w:r>
+      <w:r>
+        <w:t xml:space="preserve">neurosis = predisposición por fijación + vivenciar accidental; fijación = constitución sexual + vivenciar infantil.</w:t>
+      </w:r>
+    </w:p>
+    <w:p>
+      <w:pPr>
+        <w:pStyle w:val="RecuadroEsqueleto"/>
+      </w:pPr>
+      <w:r>
+        <w:t xml:space="preserve">3. </w:t>
+      </w:r>
+      <w:r>
+        <w:rPr>
+          <w:b/>
+          <w:bCs/>
+        </w:rPr>
+        <w:t xml:space="preserve">Complementarias:</w:t>
+      </w:r>
+      <w:r>
+        <w:t xml:space="preserve"> </w:t>
+      </w:r>
+      <w:r>
+        <w:t xml:space="preserve">los factores se compensan (constitución fuerte + vivencia mínima, o al revés).</w:t>
+      </w:r>
+    </w:p>
+    <w:p>
+      <w:pPr>
+        <w:pStyle w:val="RecuadroEsqueleto"/>
+      </w:pPr>
+      <w:r>
+        <w:t xml:space="preserve">4. </w:t>
+      </w:r>
+      <w:r>
+        <w:rPr>
+          <w:b/>
+          <w:bCs/>
+        </w:rPr>
+        <w:t xml:space="preserve">Condición vs. padecimiento:</w:t>
+      </w:r>
+      <w:r>
+        <w:t xml:space="preserve"> </w:t>
+      </w:r>
+      <w:r>
+        <w:t xml:space="preserve">la fijación es la condición neurótica; el padecimiento empieza con la</w:t>
       </w:r>
       <w:r>
         <w:t xml:space="preserve"> </w:t>
@@ -3528,26 +3753,28 @@
           <w:i/>
           <w:iCs/>
         </w:rPr>
-        <w:t xml:space="preserve">Anlage</w:t>
-      </w:r>
-      <w:r>
-        <w:t xml:space="preserve">) y el</w:t>
-      </w:r>
-      <w:r>
-        <w:t xml:space="preserve"> </w:t>
-      </w:r>
-      <w:r>
-        <w:rPr>
-          <w:b/>
-          <w:bCs/>
-        </w:rPr>
-        <w:t xml:space="preserve">vivenciar infantil</w:t>
-      </w:r>
-      <w:r>
-        <w:t xml:space="preserve"> </w:t>
-      </w:r>
-      <w:r>
-        <w:t xml:space="preserve">(la predisposición adquirida en la primera infancia,</w:t>
+        <w:t xml:space="preserve">Versagung</w:t>
+      </w:r>
+      <w:r>
+        <w:t xml:space="preserve"> </w:t>
+      </w:r>
+      <w:r>
+        <w:t xml:space="preserve">(Belucci, 2014b, p. 36).</w:t>
+      </w:r>
+    </w:p>
+    <w:p>
+      <w:pPr>
+        <w:pStyle w:val="RecuadroEsqueleto"/>
+      </w:pPr>
+      <w:r>
+        <w:t xml:space="preserve">5. </w:t>
+      </w:r>
+      <w:r>
+        <w:rPr>
+          <w:b/>
+          <w:bCs/>
+        </w:rPr>
+        <w:t xml:space="preserve">Pasos:</w:t>
       </w:r>
       <w:r>
         <w:t xml:space="preserve"> </w:t>
@@ -3557,10 +3784,34 @@
           <w:i/>
           <w:iCs/>
         </w:rPr>
-        <w:t xml:space="preserve">Disposition</w:t>
-      </w:r>
-      <w:r>
-        <w:t xml:space="preserve">): estos dos forman «otra serie complementaria, en un todo semejante a la que ya conocimos entre predisposición y vivenciar accidental del adulto. Aquí como allí hallamos los mismos casos extremos y las mismas relaciones de subrogación» (T04). Son series</w:t>
+        <w:t xml:space="preserve">Versagung</w:t>
+      </w:r>
+      <w:r>
+        <w:t xml:space="preserve"> </w:t>
+      </w:r>
+      <w:r>
+        <w:t xml:space="preserve">→ regresión a las fijaciones → conflicto con el yo → introversión en la fantasía → inconsciente → contrainvestidura → síntoma de compromiso; más el factor cuantitativo.</w:t>
+      </w:r>
+    </w:p>
+    <w:p>
+      <w:pPr>
+        <w:pStyle w:val="RecuadroEsqueleto"/>
+      </w:pPr>
+      <w:r>
+        <w:t xml:space="preserve">6. </w:t>
+      </w:r>
+      <w:r>
+        <w:rPr>
+          <w:b/>
+          <w:bCs/>
+        </w:rPr>
+        <w:t xml:space="preserve">Cierre:</w:t>
+      </w:r>
+      <w:r>
+        <w:t xml:space="preserve"> </w:t>
+      </w:r>
+      <w:r>
+        <w:t xml:space="preserve">la</w:t>
       </w:r>
       <w:r>
         <w:t xml:space="preserve"> </w:t>
@@ -3570,61 +3821,13 @@
           <w:i/>
           <w:iCs/>
         </w:rPr>
-        <w:t xml:space="preserve">complementarias</w:t>
-      </w:r>
-      <w:r>
-        <w:t xml:space="preserve"> </w:t>
-      </w:r>
-      <w:r>
-        <w:t xml:space="preserve">porque los factores se compensan: donde la constitución es poderosa basta un vivenciar mínimo; donde el vivenciar es muy intenso, una constitución promedio es suficiente. La</w:t>
-      </w:r>
-      <w:r>
-        <w:t xml:space="preserve"> </w:t>
-      </w:r>
-      <w:r>
-        <w:rPr>
-          <w:b/>
-          <w:bCs/>
-        </w:rPr>
-        <w:t xml:space="preserve">fijación</w:t>
-      </w:r>
-      <w:r>
-        <w:t xml:space="preserve"> </w:t>
-      </w:r>
-      <w:r>
-        <w:t xml:space="preserve">es entonces la</w:t>
-      </w:r>
-      <w:r>
-        <w:t xml:space="preserve"> </w:t>
-      </w:r>
-      <w:r>
-        <w:rPr>
-          <w:b/>
-          <w:bCs/>
-        </w:rPr>
-        <w:t xml:space="preserve">condición neurótica</w:t>
-      </w:r>
-      <w:r>
-        <w:t xml:space="preserve"> </w:t>
-      </w:r>
-      <w:r>
-        <w:t xml:space="preserve">—un punto de anclaje en la estructura del sujeto—; el</w:t>
-      </w:r>
-      <w:r>
-        <w:t xml:space="preserve"> </w:t>
-      </w:r>
-      <w:r>
-        <w:rPr>
-          <w:b/>
-          <w:bCs/>
-        </w:rPr>
-        <w:t xml:space="preserve">vivenciar accidental</w:t>
-      </w:r>
-      <w:r>
-        <w:t xml:space="preserve"> </w:t>
-      </w:r>
-      <w:r>
-        <w:t xml:space="preserve">(los «anudamientos vitales» de T01, p. 37) la pone a prueba.</w:t>
+        <w:t xml:space="preserve">Versagung</w:t>
+      </w:r>
+      <w:r>
+        <w:t xml:space="preserve"> </w:t>
+      </w:r>
+      <w:r>
+        <w:t xml:space="preserve">es la bisagra, «el grado cero de lo sintomático» (Belucci, 2014b, p. 36).</w:t>
       </w:r>
     </w:p>
     <w:p>
@@ -3632,77 +3835,265 @@
         <w:pStyle w:val="BodyText"/>
       </w:pPr>
       <w:r>
-        <w:t xml:space="preserve">Para que se constituya la neurosis y se pase de la condición al</w:t>
-      </w:r>
-      <w:r>
-        <w:t xml:space="preserve"> </w:t>
-      </w:r>
-      <w:r>
-        <w:rPr>
-          <w:b/>
-          <w:bCs/>
-        </w:rPr>
-        <w:t xml:space="preserve">padecimiento</w:t>
-      </w:r>
-      <w:r>
-        <w:t xml:space="preserve"> </w:t>
-      </w:r>
-      <w:r>
-        <w:t xml:space="preserve">se requieren, en orden lógico: (1) la</w:t>
-      </w:r>
-      <w:r>
-        <w:t xml:space="preserve"> </w:t>
-      </w:r>
-      <w:r>
-        <w:rPr>
-          <w:b/>
-          <w:bCs/>
-        </w:rPr>
-        <w:t xml:space="preserve">fijación</w:t>
-      </w:r>
-      <w:r>
-        <w:t xml:space="preserve"> </w:t>
-      </w:r>
-      <w:r>
-        <w:t xml:space="preserve">de la libido en puntos del desarrollo (prácticas y objetos de la sexualidad infantil, en parte por disposición innata y en parte por vivencias contingentes); (2) un</w:t>
-      </w:r>
-      <w:r>
-        <w:t xml:space="preserve"> </w:t>
-      </w:r>
-      <w:r>
-        <w:rPr>
-          <w:b/>
-          <w:bCs/>
-        </w:rPr>
-        <w:t xml:space="preserve">vivenciar accidental</w:t>
-      </w:r>
-      <w:r>
-        <w:t xml:space="preserve"> </w:t>
-      </w:r>
-      <w:r>
-        <w:t xml:space="preserve">que produzca una</w:t>
-      </w:r>
-      <w:r>
-        <w:t xml:space="preserve"> </w:t>
-      </w:r>
-      <w:r>
-        <w:rPr>
-          <w:b/>
-          <w:bCs/>
-        </w:rPr>
-        <w:t xml:space="preserve">frustración/denegación</w:t>
-      </w:r>
-      <w:r>
-        <w:t xml:space="preserve"> </w:t>
-      </w:r>
-      <w:r>
-        <w:t xml:space="preserve">(</w:t>
+        <w:t xml:space="preserve">Con las</w:t>
+      </w:r>
+      <w:r>
+        <w:t xml:space="preserve"> </w:t>
+      </w:r>
+      <w:r>
+        <w:rPr>
+          <w:b/>
+          <w:bCs/>
+        </w:rPr>
+        <w:t xml:space="preserve">series complementarias</w:t>
+      </w:r>
+      <w:r>
+        <w:t xml:space="preserve"> </w:t>
+      </w:r>
+      <w:r>
+        <w:t xml:space="preserve">(23.ª Conferencia, 1917) Freud abandona la idea de una causa única y piensa la neurosis como el resultado de la</w:t>
+      </w:r>
+      <w:r>
+        <w:t xml:space="preserve"> </w:t>
+      </w:r>
+      <w:r>
+        <w:rPr>
+          <w:b/>
+          <w:bCs/>
+        </w:rPr>
+        <w:t xml:space="preserve">conjugación proporcional de factores</w:t>
+      </w:r>
+      <w:r>
+        <w:t xml:space="preserve">. La</w:t>
+      </w:r>
+      <w:r>
+        <w:t xml:space="preserve"> </w:t>
+      </w:r>
+      <w:r>
+        <w:rPr>
+          <w:b/>
+          <w:bCs/>
+        </w:rPr>
+        <w:t xml:space="preserve">causación de la neurosis</w:t>
+      </w:r>
+      <w:r>
+        <w:t xml:space="preserve"> </w:t>
+      </w:r>
+      <w:r>
+        <w:t xml:space="preserve">del adulto es igual a</w:t>
+      </w:r>
+      <w:r>
+        <w:t xml:space="preserve"> </w:t>
+      </w:r>
+      <w:r>
+        <w:rPr>
+          <w:b/>
+          <w:bCs/>
+        </w:rPr>
+        <w:t xml:space="preserve">predisposición por fijación libidinal + vivenciar accidental (traumático)</w:t>
+      </w:r>
+      <w:r>
+        <w:t xml:space="preserve">. A su vez, la fijación libidinal del adulto «se nos descompone en otros dos factores»: la</w:t>
+      </w:r>
+      <w:r>
+        <w:t xml:space="preserve"> </w:t>
+      </w:r>
+      <w:r>
+        <w:rPr>
+          <w:b/>
+          <w:bCs/>
+        </w:rPr>
+        <w:t xml:space="preserve">constitución sexual</w:t>
+      </w:r>
+      <w:r>
+        <w:t xml:space="preserve"> </w:t>
+      </w:r>
+      <w:r>
+        <w:t xml:space="preserve">hereditaria («vivenciar prehistórico»,</w:t>
+      </w:r>
+      <w:r>
+        <w:t xml:space="preserve"> </w:t>
       </w:r>
       <w:r>
         <w:rPr>
           <w:i/>
           <w:iCs/>
         </w:rPr>
+        <w:t xml:space="preserve">Anlage</w:t>
+      </w:r>
+      <w:r>
+        <w:t xml:space="preserve">) y el</w:t>
+      </w:r>
+      <w:r>
+        <w:t xml:space="preserve"> </w:t>
+      </w:r>
+      <w:r>
+        <w:rPr>
+          <w:b/>
+          <w:bCs/>
+        </w:rPr>
+        <w:t xml:space="preserve">vivenciar infantil</w:t>
+      </w:r>
+      <w:r>
+        <w:t xml:space="preserve"> </w:t>
+      </w:r>
+      <w:r>
+        <w:t xml:space="preserve">(la predisposición adquirida en la primera infancia,</w:t>
+      </w:r>
+      <w:r>
+        <w:t xml:space="preserve"> </w:t>
+      </w:r>
+      <w:r>
+        <w:rPr>
+          <w:i/>
+          <w:iCs/>
+        </w:rPr>
+        <w:t xml:space="preserve">Disposition</w:t>
+      </w:r>
+      <w:r>
+        <w:t xml:space="preserve">): estos dos forman «otra serie complementaria, en un todo semejante a la que ya conocimos entre predisposición y vivenciar accidental del adulto. Aquí como allí hallamos los mismos casos extremos y las mismas relaciones de subrogación» (Freud, 1917/1996b). Son series</w:t>
+      </w:r>
+      <w:r>
+        <w:t xml:space="preserve"> </w:t>
+      </w:r>
+      <w:r>
+        <w:rPr>
+          <w:i/>
+          <w:iCs/>
+        </w:rPr>
+        <w:t xml:space="preserve">complementarias</w:t>
+      </w:r>
+      <w:r>
+        <w:t xml:space="preserve"> </w:t>
+      </w:r>
+      <w:r>
+        <w:t xml:space="preserve">porque los factores se compensan: donde la constitución es poderosa basta un vivenciar mínimo; donde el vivenciar es muy intenso, una constitución promedio es suficiente. La</w:t>
+      </w:r>
+      <w:r>
+        <w:t xml:space="preserve"> </w:t>
+      </w:r>
+      <w:r>
+        <w:rPr>
+          <w:b/>
+          <w:bCs/>
+        </w:rPr>
+        <w:t xml:space="preserve">fijación</w:t>
+      </w:r>
+      <w:r>
+        <w:t xml:space="preserve"> </w:t>
+      </w:r>
+      <w:r>
+        <w:t xml:space="preserve">es entonces la</w:t>
+      </w:r>
+      <w:r>
+        <w:t xml:space="preserve"> </w:t>
+      </w:r>
+      <w:r>
+        <w:rPr>
+          <w:b/>
+          <w:bCs/>
+        </w:rPr>
+        <w:t xml:space="preserve">condición neurótica</w:t>
+      </w:r>
+      <w:r>
+        <w:t xml:space="preserve"> </w:t>
+      </w:r>
+      <w:r>
+        <w:t xml:space="preserve">—un punto de anclaje en la estructura del sujeto—; el</w:t>
+      </w:r>
+      <w:r>
+        <w:t xml:space="preserve"> </w:t>
+      </w:r>
+      <w:r>
+        <w:rPr>
+          <w:b/>
+          <w:bCs/>
+        </w:rPr>
+        <w:t xml:space="preserve">vivenciar accidental</w:t>
+      </w:r>
+      <w:r>
+        <w:t xml:space="preserve"> </w:t>
+      </w:r>
+      <w:r>
+        <w:t xml:space="preserve">(los «anudamientos vitales» de Belucci, 2014b, p. 37) la pone a prueba.</w:t>
+      </w:r>
+    </w:p>
+    <w:p>
+      <w:pPr>
+        <w:pStyle w:val="BodyText"/>
+      </w:pPr>
+      <w:r>
+        <w:t xml:space="preserve">Para que se constituya la neurosis y se pase de la condición al</w:t>
+      </w:r>
+      <w:r>
+        <w:t xml:space="preserve"> </w:t>
+      </w:r>
+      <w:r>
+        <w:rPr>
+          <w:b/>
+          <w:bCs/>
+        </w:rPr>
+        <w:t xml:space="preserve">padecimiento</w:t>
+      </w:r>
+      <w:r>
+        <w:t xml:space="preserve"> </w:t>
+      </w:r>
+      <w:r>
+        <w:t xml:space="preserve">se requieren, en orden lógico: (1) la</w:t>
+      </w:r>
+      <w:r>
+        <w:t xml:space="preserve"> </w:t>
+      </w:r>
+      <w:r>
+        <w:rPr>
+          <w:b/>
+          <w:bCs/>
+        </w:rPr>
+        <w:t xml:space="preserve">fijación</w:t>
+      </w:r>
+      <w:r>
+        <w:t xml:space="preserve"> </w:t>
+      </w:r>
+      <w:r>
+        <w:t xml:space="preserve">de la libido en puntos del desarrollo (prácticas y objetos de la sexualidad infantil, en parte por disposición innata y en parte por vivencias contingentes); (2) un</w:t>
+      </w:r>
+      <w:r>
+        <w:t xml:space="preserve"> </w:t>
+      </w:r>
+      <w:r>
+        <w:rPr>
+          <w:b/>
+          <w:bCs/>
+        </w:rPr>
+        <w:t xml:space="preserve">vivenciar accidental</w:t>
+      </w:r>
+      <w:r>
+        <w:t xml:space="preserve"> </w:t>
+      </w:r>
+      <w:r>
+        <w:t xml:space="preserve">que produzca una</w:t>
+      </w:r>
+      <w:r>
+        <w:t xml:space="preserve"> </w:t>
+      </w:r>
+      <w:r>
+        <w:rPr>
+          <w:b/>
+          <w:bCs/>
+        </w:rPr>
+        <w:t xml:space="preserve">frustración/denegación</w:t>
+      </w:r>
+      <w:r>
+        <w:t xml:space="preserve"> </w:t>
+      </w:r>
+      <w:r>
+        <w:t xml:space="preserve">(</w:t>
+      </w:r>
+      <w:r>
+        <w:rPr>
+          <w:i/>
+          <w:iCs/>
+        </w:rPr>
         <w:t xml:space="preserve">Versagung</w:t>
       </w:r>
       <w:r>
@@ -3806,7 +4197,7 @@
         <w:t xml:space="preserve">factor cuantitativo</w:t>
       </w:r>
       <w:r>
-        <w:t xml:space="preserve">: el conflicto no estalla antes de que las investiduras alcancen cierta intensidad (T04). La</w:t>
+        <w:t xml:space="preserve">: el conflicto no estalla antes de que las investiduras alcancen cierta intensidad (Freud, 1917/1996b). La</w:t>
       </w:r>
       <w:r>
         <w:t xml:space="preserve"> </w:t>
@@ -3822,7 +4213,41 @@
         <w:t xml:space="preserve"> </w:t>
       </w:r>
       <w:r>
-        <w:t xml:space="preserve">es, entonces, la bisagra: «el grado cero de lo sintomático» (T01, p. 36).</w:t>
+        <w:t xml:space="preserve">es, entonces, la bisagra: «el grado cero de lo sintomático» (Belucci, 2014b, p. 36).</w:t>
+      </w:r>
+    </w:p>
+    <w:p>
+      <w:pPr>
+        <w:pStyle w:val="RecuadroAtencion"/>
+      </w:pPr>
+      <w:r>
+        <w:t xml:space="preserve">⚠</w:t>
+      </w:r>
+      <w:r>
+        <w:t xml:space="preserve"> </w:t>
+      </w:r>
+      <w:r>
+        <w:rPr>
+          <w:b/>
+          <w:bCs/>
+        </w:rPr>
+        <w:t xml:space="preserve">No confundir:</w:t>
+      </w:r>
+      <w:r>
+        <w:t xml:space="preserve"> </w:t>
+      </w:r>
+      <w:r>
+        <w:rPr>
+          <w:i/>
+          <w:iCs/>
+        </w:rPr>
+        <w:t xml:space="preserve">Versagung</w:t>
+      </w:r>
+      <w:r>
+        <w:t xml:space="preserve"> </w:t>
+      </w:r>
+      <w:r>
+        <w:t xml:space="preserve">no es «frustración» en sentido común: es el fracaso de las soluciones del sujeto. Y ser neurótico (condición) no es lo mismo que padecer una neurosis.</w:t>
       </w:r>
     </w:p>
     <w:bookmarkEnd w:id="23"/>
@@ -3835,7 +4260,7 @@
         <w:t xml:space="preserve">2.2 Desarrollo ampliado</w:t>
       </w:r>
     </w:p>
-    <w:bookmarkStart w:id="24" w:name="X231392fd9170727716eb4c451982360ced7f01b"/>
+    <w:bookmarkStart w:id="24" w:name="X34eabcec96b39887b0fd711ffd8c31069756420"/>
     <w:p>
       <w:pPr>
         <w:pStyle w:val="Heading4"/>
@@ -3854,7 +4279,7 @@
         <w:t xml:space="preserve">Versagung</w:t>
       </w:r>
       <w:r>
-        <w:t xml:space="preserve">: ni «frustración» ni castigo (T01, pp. 36-38; T03, p. 4)</w:t>
+        <w:t xml:space="preserve">: ni «frustración» ni castigo (Belucci, 2014b, pp. 36-38; Belucci, s. f.-c, p. 4)</w:t>
       </w:r>
     </w:p>
     <w:p>
@@ -3866,7 +4291,7 @@
         </w:numPr>
       </w:pPr>
       <w:r>
-        <w:t xml:space="preserve">T03 (p. 4): el término alemán</w:t>
+        <w:t xml:space="preserve">Belucci (s. f.-c, p. 4): el término alemán</w:t>
       </w:r>
       <w:r>
         <w:t xml:space="preserve"> </w:t>
@@ -3920,7 +4345,7 @@
         </w:numPr>
       </w:pPr>
       <w:r>
-        <w:t xml:space="preserve">T01 (p. 36): en alemán</w:t>
+        <w:t xml:space="preserve">Belucci (2014b, p. 36): en alemán</w:t>
       </w:r>
       <w:r>
         <w:t xml:space="preserve"> </w:t>
@@ -4003,7 +4428,7 @@
         <w:t xml:space="preserve"> </w:t>
       </w:r>
       <w:r>
-        <w:t xml:space="preserve">(T01, pp. 36-38):</w:t>
+        <w:t xml:space="preserve">(Belucci, 2014b, pp. 36-38):</w:t>
       </w:r>
       <w:r>
         <w:t xml:space="preserve"> </w:t>
@@ -4045,7 +4470,7 @@
         <w:t xml:space="preserve">anudamientos vitales</w:t>
       </w:r>
       <w:r>
-        <w:t xml:space="preserve">» y los ubicó en las series complementarias del lado del vivenciar accidental del adulto (T01, p. 37, nota). Lacan evoca la</w:t>
+        <w:t xml:space="preserve">» y los ubicó en las series complementarias del lado del vivenciar accidental del adulto (Belucci, 2014b, p. 37, nota). Lacan evoca la</w:t>
       </w:r>
       <w:r>
         <w:t xml:space="preserve"> </w:t>
@@ -4061,7 +4486,7 @@
         <w:t xml:space="preserve"> </w:t>
       </w:r>
       <w:r>
-        <w:t xml:space="preserve">aristotélica como encuentro siempre fallido con lo real (T01, p. 37).</w:t>
+        <w:t xml:space="preserve">aristotélica como encuentro siempre fallido con lo real (Belucci, 2014b, p. 37).</w:t>
       </w:r>
     </w:p>
     <w:p>
@@ -4073,7 +4498,7 @@
         </w:numPr>
       </w:pPr>
       <w:r>
-        <w:t xml:space="preserve">La realidad no es un campo autoevidente: es un montaje simbólico-imaginario («esquema R») que entrama y vela un real; «lo real es aquello que, cada tanto, nos recuerda que la escena que habitamos no es una ficción pura» (T01, p. 37). Freud señala que la alteración de la economía libidinal puede llevar a un</w:t>
+        <w:t xml:space="preserve">La realidad no es un campo autoevidente: es un montaje simbólico-imaginario («esquema R») que entrama y vela un real; «lo real es aquello que, cada tanto, nos recuerda que la escena que habitamos no es una ficción pura» (Belucci, 2014b, p. 37). Freud señala que la alteración de la economía libidinal puede llevar a un</w:t>
       </w:r>
       <w:r>
         <w:t xml:space="preserve"> </w:t>
@@ -4105,7 +4530,7 @@
         <w:t xml:space="preserve"> </w:t>
       </w:r>
       <w:r>
-        <w:t xml:space="preserve">de la libido, condición necesaria aunque no suficiente de la neurosis (T01, p. 38).</w:t>
+        <w:t xml:space="preserve">de la libido, condición necesaria aunque no suficiente de la neurosis (Belucci, 2014b, p. 38).</w:t>
       </w:r>
     </w:p>
     <w:p>
@@ -4186,13 +4611,13 @@
       </w:r>
     </w:p>
     <w:bookmarkEnd w:id="24"/>
-    <w:bookmarkStart w:id="25" w:name="b-regresión-y-fijación-t03-pp.-3-4"/>
+    <w:bookmarkStart w:id="25" w:name="X4d994a6161bd9ea59d1168757cad208680e01be"/>
     <w:p>
       <w:pPr>
         <w:pStyle w:val="Heading4"/>
       </w:pPr>
       <w:r>
-        <w:t xml:space="preserve">b) Regresión y fijación (T03, pp. 3-4)</w:t>
+        <w:t xml:space="preserve">b) Regresión y fijación (Belucci, s. f.-c, pp. 3-4)</w:t>
       </w:r>
     </w:p>
     <w:p>
@@ -4252,7 +4677,7 @@
         <w:t xml:space="preserve"> </w:t>
       </w:r>
       <w:r>
-        <w:t xml:space="preserve">supone particular significatividad de la boca y de todas las actividades de incorporación, y un modo de relación con el otro en el que importa lo que el otro da y lo que el sujeto le demanda. Bajo ciertas circunstancias puede reactivarse: alguien intensifica sus demandas a otros significativos buscando incorporar (dinero, regalos, atenciones), o en situaciones de angustia aumentan comer, beber o fumar (T03, p. 3).</w:t>
+        <w:t xml:space="preserve">supone particular significatividad de la boca y de todas las actividades de incorporación, y un modo de relación con el otro en el que importa lo que el otro da y lo que el sujeto le demanda. Bajo ciertas circunstancias puede reactivarse: alguien intensifica sus demandas a otros significativos buscando incorporar (dinero, regalos, atenciones), o en situaciones de angustia aumentan comer, beber o fumar (Belucci, s. f.-c, p. 3).</w:t>
       </w:r>
     </w:p>
     <w:p>
@@ -4287,7 +4712,7 @@
         <w:t xml:space="preserve">su intensidad y los componentes varían</w:t>
       </w:r>
       <w:r>
-        <w:t xml:space="preserve">, y eso condiciona la aparición del padecimiento: «cuanto más rígido es el modo de obtener satisfacción, más fácilmente da paso a lo patológico» (T03, p. 4).</w:t>
+        <w:t xml:space="preserve">, y eso condiciona la aparición del padecimiento: «cuanto más rígido es el modo de obtener satisfacción, más fácilmente da paso a lo patológico» (Belucci, s. f.-c, p. 4).</w:t>
       </w:r>
     </w:p>
     <w:p>
@@ -4299,7 +4724,7 @@
         </w:numPr>
       </w:pPr>
       <w:r>
-        <w:t xml:space="preserve">En T04 se aclara el valor de la fijación: «la fijación que suponemos en determinados puntos de la vía del desarrollo sólo cobra valor si la hacemos consistir en la</w:t>
+        <w:t xml:space="preserve">En Freud (1917/1996b) se aclara el valor de la fijación: «la fijación que suponemos en determinados puntos de la vía del desarrollo sólo cobra valor si la hacemos consistir en la</w:t>
       </w:r>
       <w:r>
         <w:t xml:space="preserve"> </w:t>
@@ -4316,13 +4741,13 @@
       </w:r>
     </w:p>
     <w:bookmarkEnd w:id="25"/>
-    <w:bookmarkStart w:id="26" w:name="c-el-esquema-de-las-series-t04"/>
+    <w:bookmarkStart w:id="26" w:name="Xdc529483529ed77263bc9ed17c37fa13e9000a4"/>
     <w:p>
       <w:pPr>
         <w:pStyle w:val="Heading4"/>
       </w:pPr>
       <w:r>
-        <w:t xml:space="preserve">c) El esquema de las series (T04)</w:t>
+        <w:t xml:space="preserve">c) El esquema de las series (Freud, 1917/1996b)</w:t>
       </w:r>
     </w:p>
     <w:p>
@@ -4413,7 +4838,7 @@
         <w:t xml:space="preserve"> </w:t>
       </w:r>
       <w:r>
-        <w:t xml:space="preserve">lo adquirido en la primera infancia (nota del traductor en T04).</w:t>
+        <w:t xml:space="preserve">lo adquirido en la primera infancia (nota del traductor en Freud, 1917/1996b).</w:t>
       </w:r>
     </w:p>
     <w:p>
@@ -4438,7 +4863,7 @@
         <w:t xml:space="preserve">pulsión parcial</w:t>
       </w:r>
       <w:r>
-        <w:t xml:space="preserve">, por sí sola o en unión con otras, posea una fuerza particular». Las constituciones podrían ser cualitativamente iguales en todos los seres humanos y diferenciarse solo por proporciones cuantitativas (T04, factor económico).</w:t>
+        <w:t xml:space="preserve">, por sí sola o en unión con otras, posea una fuerza particular». Las constituciones podrían ser cualitativamente iguales en todos los seres humanos y diferenciarse solo por proporciones cuantitativas (Freud, 1917/1996b, factor económico).</w:t>
       </w:r>
     </w:p>
     <w:p>
@@ -4460,7 +4885,7 @@
         <w:t xml:space="preserve"> </w:t>
       </w:r>
       <w:r>
-        <w:t xml:space="preserve">(T04): las disposiciones constitucionales son «la secuela que dejaron las vivencias de nuestros antepasados; también ellas se adquirieron una vez: sin tal adquisición no habría herencia alguna». Por eso no debe restarse importancia a las vivencias infantiles: acontecen en períodos en que el desarrollo no está completo, lo que agrava sus consecuencias y las habilita para tener efectos traumáticos.</w:t>
+        <w:t xml:space="preserve">(Freud, 1917/1996b): las disposiciones constitucionales son «la secuela que dejaron las vivencias de nuestros antepasados; también ellas se adquirieron una vez: sin tal adquisición no habría herencia alguna». Por eso no debe restarse importancia a las vivencias infantiles: acontecen en períodos en que el desarrollo no está completo, lo que agrava sus consecuencias y las habilita para tener efectos traumáticos.</w:t>
       </w:r>
       <w:r>
         <w:t xml:space="preserve"> </w:t>
@@ -4480,13 +4905,13 @@
       </w:r>
     </w:p>
     <w:bookmarkEnd w:id="26"/>
-    <w:bookmarkStart w:id="27" w:name="Xdaac89caa16af5463141511d6709f83f047733f"/>
+    <w:bookmarkStart w:id="27" w:name="X57135437579b036574a19f2fc27e5ec552a56bc"/>
     <w:p>
       <w:pPr>
         <w:pStyle w:val="Heading4"/>
       </w:pPr>
       <w:r>
-        <w:t xml:space="preserve">d) ¿Importancia real de lo infantil o efecto de la regresión? (T04)</w:t>
+        <w:t xml:space="preserve">d) ¿Importancia real de lo infantil o efecto de la regresión? (Freud, 1917/1996b)</w:t>
       </w:r>
     </w:p>
     <w:p>
@@ -4626,7 +5051,7 @@
         <w:t xml:space="preserve"> </w:t>
       </w:r>
       <w:r>
-        <w:t xml:space="preserve">(T04): para entender el conflicto no basta lo dinámico; hace falta el</w:t>
+        <w:t xml:space="preserve">(Freud, 1917/1996b): para entender el conflicto no basta lo dinámico; hace falta el</w:t>
       </w:r>
       <w:r>
         <w:t xml:space="preserve"> </w:t>
@@ -4672,13 +5097,13 @@
       </w:r>
     </w:p>
     <w:bookmarkEnd w:id="27"/>
-    <w:bookmarkStart w:id="28" w:name="Xfd8ce4483e44641db120708070e9347cf1bb838"/>
+    <w:bookmarkStart w:id="28" w:name="X436e84d645c83f94f53ed25977d2b3adeb5fee3"/>
     <w:p>
       <w:pPr>
         <w:pStyle w:val="Heading4"/>
       </w:pPr>
       <w:r>
-        <w:t xml:space="preserve">e) Condición neurótica y padecimiento (T01, pp. 2-3, 35; T04; apuntes)</w:t>
+        <w:t xml:space="preserve">e) Condición neurótica y padecimiento (Belucci, 2014b, pp. 2-3, 35; Freud, 1917/1996b; apuntes)</w:t>
       </w:r>
     </w:p>
     <w:p>
@@ -4690,7 +5115,7 @@
         </w:numPr>
       </w:pPr>
       <w:r>
-        <w:t xml:space="preserve">T04 (inicio): «estar enfermo» es «en esencia un concepto práctico»; desde el punto de vista teórico «todos estamos enfermos, o sea, todos somos neuróticos», pues las condiciones para formar síntomas se pesquisan también en los normales. Lo que define el padecimiento es la</w:t>
+        <w:t xml:space="preserve">Freud (1917/1996b, inicio): «estar enfermo» es «en esencia un concepto práctico»; desde el punto de vista teórico «todos estamos enfermos, o sea, todos somos neuróticos», pues las condiciones para formar síntomas se pesquisan también en los normales. Lo que define el padecimiento es la</w:t>
       </w:r>
       <w:r>
         <w:t xml:space="preserve"> </w:t>
@@ -4718,7 +5143,7 @@
         </w:numPr>
       </w:pPr>
       <w:r>
-        <w:t xml:space="preserve">T03 (p. 2): para Freud la diferencia entre la «normalidad» y la neurosis es</w:t>
+        <w:t xml:space="preserve">Belucci (s. f.-c, p. 2): para Freud la diferencia entre la «normalidad» y la neurosis es</w:t>
       </w:r>
       <w:r>
         <w:t xml:space="preserve"> </w:t>
@@ -4775,7 +5200,7 @@
         </w:numPr>
       </w:pPr>
       <w:r>
-        <w:t xml:space="preserve">T01 (p. 3): la neurosis es una condición de estructura en la que la inconsistencia del Otro se inscribe como</w:t>
+        <w:t xml:space="preserve">Belucci (2014b, p. 3): la neurosis es una condición de estructura en la que la inconsistencia del Otro se inscribe como</w:t>
       </w:r>
       <w:r>
         <w:t xml:space="preserve"> </w:t>
@@ -4807,7 +5232,7 @@
         <w:t xml:space="preserve"> </w:t>
       </w:r>
       <w:r>
-        <w:t xml:space="preserve">y la posibilidad de que alguna pregunta se formule. (T01, p. 35): la psicopatología es «una lógica del padecimiento subjetivo».</w:t>
+        <w:t xml:space="preserve">y la posibilidad de que alguna pregunta se formule. (Belucci, 2014b, p. 35): la psicopatología es «una lógica del padecimiento subjetivo».</w:t>
       </w:r>
     </w:p>
     <w:p>
@@ -4823,7 +5248,7 @@
           <w:b/>
           <w:bCs/>
         </w:rPr>
-        <w:t xml:space="preserve">Un caso (T01, p. 3):</w:t>
+        <w:t xml:space="preserve">Un caso (Belucci, 2014b, p. 3):</w:t>
       </w:r>
       <w:r>
         <w:t xml:space="preserve"> </w:t>
@@ -5014,68 +5439,92 @@
     </w:p>
     <w:p>
       <w:pPr>
-        <w:pStyle w:val="FirstParagraph"/>
-      </w:pPr>
-      <w:r>
-        <w:t xml:space="preserve">El síntoma ocupa en la neurosis el lugar de</w:t>
-      </w:r>
-      <w:r>
-        <w:t xml:space="preserve"> </w:t>
-      </w:r>
-      <w:r>
-        <w:rPr>
-          <w:b/>
-          <w:bCs/>
-        </w:rPr>
-        <w:t xml:space="preserve">solución de compromiso</w:t>
-      </w:r>
-      <w:r>
-        <w:t xml:space="preserve"> </w:t>
-      </w:r>
-      <w:r>
-        <w:t xml:space="preserve">frente a un conflicto: es la «</w:t>
-      </w:r>
-      <w:r>
-        <w:rPr>
-          <w:b/>
-          <w:bCs/>
-        </w:rPr>
-        <w:t xml:space="preserve">práctica sexual de los neuróticos</w:t>
-      </w:r>
-      <w:r>
-        <w:t xml:space="preserve">» (la satisfacción pulsional en su cara pulsional) y, a la vez,</w:t>
-      </w:r>
-      <w:r>
-        <w:t xml:space="preserve"> </w:t>
-      </w:r>
-      <w:r>
-        <w:rPr>
-          <w:b/>
-          <w:bCs/>
-        </w:rPr>
-        <w:t xml:space="preserve">retorno de lo reprimido</w:t>
-      </w:r>
-      <w:r>
-        <w:t xml:space="preserve"> </w:t>
-      </w:r>
-      <w:r>
-        <w:t xml:space="preserve">(su cara defensiva) (T01, p. 3). Los síntomas psíquicos son «actos perjudiciales o, al menos, inútiles para la vida en su conjunto», que la persona realiza a menudo contra su voluntad y que cuestan displacer y un gasto enorme de energía; pero son «el resultado de un conflicto que se libra en torno de una nueva modalidad de la satisfacción pulsional»: las dos fuerzas enemistadas «vuelven a coincidir en el síntoma; se reconcilian, por así decir, gracias al compromiso de la formación de síntoma. Por eso el síntoma es tan resistente; está sostenido desde ambos lados» (T04). En la estructura de la neurosis el síntoma es una</w:t>
-      </w:r>
-      <w:r>
-        <w:t xml:space="preserve"> </w:t>
-      </w:r>
-      <w:r>
-        <w:rPr>
-          <w:b/>
-          <w:bCs/>
-        </w:rPr>
-        <w:t xml:space="preserve">respuesta</w:t>
-      </w:r>
-      <w:r>
-        <w:t xml:space="preserve"> </w:t>
-      </w:r>
-      <w:r>
-        <w:t xml:space="preserve">del sujeto (fantasía e identificación lo anclan a lo psíquico; en la etapa de</w:t>
+        <w:pStyle w:val="RecuadroEsqueleto"/>
+      </w:pPr>
+      <w:r>
+        <w:rPr>
+          <w:b/>
+          <w:bCs/>
+        </w:rPr>
+        <w:t xml:space="preserve">Esqueleto de la respuesta:</w:t>
+      </w:r>
+    </w:p>
+    <w:p>
+      <w:pPr>
+        <w:pStyle w:val="RecuadroEsqueleto"/>
+      </w:pPr>
+      <w:r>
+        <w:t xml:space="preserve">1. </w:t>
+      </w:r>
+      <w:r>
+        <w:rPr>
+          <w:b/>
+          <w:bCs/>
+        </w:rPr>
+        <w:t xml:space="preserve">Tesis:</w:t>
+      </w:r>
+      <w:r>
+        <w:t xml:space="preserve"> </w:t>
+      </w:r>
+      <w:r>
+        <w:t xml:space="preserve">el síntoma es una solución de compromiso: práctica sexual de los neuróticos y retorno de lo reprimido a la vez (Belucci, 2014b, p. 3).</w:t>
+      </w:r>
+    </w:p>
+    <w:p>
+      <w:pPr>
+        <w:pStyle w:val="RecuadroEsqueleto"/>
+      </w:pPr>
+      <w:r>
+        <w:t xml:space="preserve">2. </w:t>
+      </w:r>
+      <w:r>
+        <w:rPr>
+          <w:b/>
+          <w:bCs/>
+        </w:rPr>
+        <w:t xml:space="preserve">Doble cara:</w:t>
+      </w:r>
+      <w:r>
+        <w:t xml:space="preserve"> </w:t>
+      </w:r>
+      <w:r>
+        <w:t xml:space="preserve">satisfacción pulsional + defensa; «está sostenido desde ambos lados» (Freud, 1917/1996b).</w:t>
+      </w:r>
+    </w:p>
+    <w:p>
+      <w:pPr>
+        <w:pStyle w:val="RecuadroEsqueleto"/>
+      </w:pPr>
+      <w:r>
+        <w:t xml:space="preserve">3. </w:t>
+      </w:r>
+      <w:r>
+        <w:rPr>
+          <w:b/>
+          <w:bCs/>
+        </w:rPr>
+        <w:t xml:space="preserve">Lugar en la estructura:</w:t>
+      </w:r>
+      <w:r>
+        <w:t xml:space="preserve"> </w:t>
+      </w:r>
+      <w:r>
+        <w:t xml:space="preserve">respuesta del sujeto (anclado por fantasía e identificación) y coordenada diagnóstica, no la única (Belucci, 2014b, p. 3).</w:t>
+      </w:r>
+    </w:p>
+    <w:p>
+      <w:pPr>
+        <w:pStyle w:val="RecuadroEsqueleto"/>
+      </w:pPr>
+      <w:r>
+        <w:t xml:space="preserve">4. </w:t>
+      </w:r>
+      <w:r>
+        <w:rPr>
+          <w:b/>
+          <w:bCs/>
+        </w:rPr>
+        <w:t xml:space="preserve">Caminos:</w:t>
       </w:r>
       <w:r>
         <w:t xml:space="preserve"> </w:t>
@@ -5085,6 +5534,130 @@
           <w:i/>
           <w:iCs/>
         </w:rPr>
+        <w:t xml:space="preserve">Versagung</w:t>
+      </w:r>
+      <w:r>
+        <w:t xml:space="preserve"> </w:t>
+      </w:r>
+      <w:r>
+        <w:t xml:space="preserve">→ regresión a las fijaciones → el yo no consiente → introversión en la fantasía → inconsciente (condensación y desplazamiento) → contrainvestidura.</w:t>
+      </w:r>
+    </w:p>
+    <w:p>
+      <w:pPr>
+        <w:pStyle w:val="RecuadroEsqueleto"/>
+      </w:pPr>
+      <w:r>
+        <w:t xml:space="preserve">5. </w:t>
+      </w:r>
+      <w:r>
+        <w:rPr>
+          <w:b/>
+          <w:bCs/>
+        </w:rPr>
+        <w:t xml:space="preserve">Resultado:</w:t>
+      </w:r>
+      <w:r>
+        <w:t xml:space="preserve"> </w:t>
+      </w:r>
+      <w:r>
+        <w:t xml:space="preserve">satisfacción sustitutiva, desfigurada y ambigua, con dos significados contradictorios.</w:t>
+      </w:r>
+    </w:p>
+    <w:p>
+      <w:pPr>
+        <w:pStyle w:val="RecuadroEsqueleto"/>
+      </w:pPr>
+      <w:r>
+        <w:t xml:space="preserve">6. </w:t>
+      </w:r>
+      <w:r>
+        <w:rPr>
+          <w:b/>
+          <w:bCs/>
+        </w:rPr>
+        <w:t xml:space="preserve">Cierre:</w:t>
+      </w:r>
+      <w:r>
+        <w:t xml:space="preserve"> </w:t>
+      </w:r>
+      <w:r>
+        <w:t xml:space="preserve">por eso el síntoma es tan resistente y repite la satisfacción infantil con elementos de la ocasión actual.</w:t>
+      </w:r>
+    </w:p>
+    <w:p>
+      <w:pPr>
+        <w:pStyle w:val="BodyText"/>
+      </w:pPr>
+      <w:r>
+        <w:t xml:space="preserve">El síntoma ocupa en la neurosis el lugar de</w:t>
+      </w:r>
+      <w:r>
+        <w:t xml:space="preserve"> </w:t>
+      </w:r>
+      <w:r>
+        <w:rPr>
+          <w:b/>
+          <w:bCs/>
+        </w:rPr>
+        <w:t xml:space="preserve">solución de compromiso</w:t>
+      </w:r>
+      <w:r>
+        <w:t xml:space="preserve"> </w:t>
+      </w:r>
+      <w:r>
+        <w:t xml:space="preserve">frente a un conflicto: es la «</w:t>
+      </w:r>
+      <w:r>
+        <w:rPr>
+          <w:b/>
+          <w:bCs/>
+        </w:rPr>
+        <w:t xml:space="preserve">práctica sexual de los neuróticos</w:t>
+      </w:r>
+      <w:r>
+        <w:t xml:space="preserve">» (la satisfacción pulsional en su cara pulsional) y, a la vez,</w:t>
+      </w:r>
+      <w:r>
+        <w:t xml:space="preserve"> </w:t>
+      </w:r>
+      <w:r>
+        <w:rPr>
+          <w:b/>
+          <w:bCs/>
+        </w:rPr>
+        <w:t xml:space="preserve">retorno de lo reprimido</w:t>
+      </w:r>
+      <w:r>
+        <w:t xml:space="preserve"> </w:t>
+      </w:r>
+      <w:r>
+        <w:t xml:space="preserve">(su cara defensiva) (Belucci, 2014b, p. 3). Los síntomas psíquicos son «actos perjudiciales o, al menos, inútiles para la vida en su conjunto», que la persona realiza a menudo contra su voluntad y que cuestan displacer y un gasto enorme de energía; pero son «el resultado de un conflicto que se libra en torno de una nueva modalidad de la satisfacción pulsional»: las dos fuerzas enemistadas «vuelven a coincidir en el síntoma; se reconcilian, por así decir, gracias al compromiso de la formación de síntoma. Por eso el síntoma es tan resistente; está sostenido desde ambos lados» (Freud, 1917/1996b). En la estructura de la neurosis el síntoma es una</w:t>
+      </w:r>
+      <w:r>
+        <w:t xml:space="preserve"> </w:t>
+      </w:r>
+      <w:r>
+        <w:rPr>
+          <w:b/>
+          <w:bCs/>
+        </w:rPr>
+        <w:t xml:space="preserve">respuesta</w:t>
+      </w:r>
+      <w:r>
+        <w:t xml:space="preserve"> </w:t>
+      </w:r>
+      <w:r>
+        <w:t xml:space="preserve">del sujeto (fantasía e identificación lo anclan a lo psíquico; en la etapa de</w:t>
+      </w:r>
+      <w:r>
+        <w:t xml:space="preserve"> </w:t>
+      </w:r>
+      <w:r>
+        <w:rPr>
+          <w:i/>
+          <w:iCs/>
+        </w:rPr>
         <w:t xml:space="preserve">Inhibición, síntoma y angustia</w:t>
       </w:r>
       <w:r>
@@ -5107,7 +5680,7 @@
         <w:t xml:space="preserve"> </w:t>
       </w:r>
       <w:r>
-        <w:t xml:space="preserve">(T01, p. 3), aunque no la única: la defensa y el síntoma primario permiten leer la «elección de neurosis».</w:t>
+        <w:t xml:space="preserve">(Belucci, 2014b, p. 3), aunque no la única: la defensa y el síntoma primario permiten leer la «elección de neurosis».</w:t>
       </w:r>
     </w:p>
     <w:p>
@@ -5282,23 +5855,63 @@
         <w:t xml:space="preserve">, con dos significados contradictorios, que repite la satisfacción infantil con elementos de la ocasión que llevó a contraer la enfermedad.</w:t>
       </w:r>
     </w:p>
+    <w:p>
+      <w:pPr>
+        <w:pStyle w:val="RecuadroAtencion"/>
+      </w:pPr>
+      <w:r>
+        <w:t xml:space="preserve">⚠</w:t>
+      </w:r>
+      <w:r>
+        <w:t xml:space="preserve"> </w:t>
+      </w:r>
+      <w:r>
+        <w:rPr>
+          <w:b/>
+          <w:bCs/>
+        </w:rPr>
+        <w:t xml:space="preserve">No confundir:</w:t>
+      </w:r>
+      <w:r>
+        <w:t xml:space="preserve"> </w:t>
+      </w:r>
+      <w:r>
+        <w:t xml:space="preserve">el síntoma no es solo defensa ni solo satisfacción: es el</w:t>
+      </w:r>
+      <w:r>
+        <w:t xml:space="preserve"> </w:t>
+      </w:r>
+      <w:r>
+        <w:rPr>
+          <w:b/>
+          <w:bCs/>
+        </w:rPr>
+        <w:t xml:space="preserve">compromiso</w:t>
+      </w:r>
+      <w:r>
+        <w:t xml:space="preserve"> </w:t>
+      </w:r>
+      <w:r>
+        <w:t xml:space="preserve">entre ambas. Y la fantasía (introversión) es el eslabón intermedio, no el síntoma mismo.</w:t>
+      </w:r>
+    </w:p>
     <w:bookmarkEnd w:id="31"/>
-    <w:bookmarkStart w:id="37" w:name="desarrollo-ampliado-t04-y-t01"/>
+    <w:bookmarkStart w:id="37" w:name="Xd17acf5cdb3e55c9496c71cefd34e5c39f8d8fb"/>
     <w:p>
       <w:pPr>
         <w:pStyle w:val="Heading3"/>
       </w:pPr>
       <w:r>
-        <w:t xml:space="preserve">3.2 Desarrollo ampliado (T04 y T01)</w:t>
-      </w:r>
-    </w:p>
-    <w:bookmarkStart w:id="32" w:name="Xfa092a25cb661e8e793cca9f743007575b3aede"/>
+        <w:t xml:space="preserve">3.2 Desarrollo ampliado (Freud, 1917/1996b; Belucci, 2014b)</w:t>
+      </w:r>
+    </w:p>
+    <w:bookmarkStart w:id="32" w:name="X3daa0cc66f456eedc8beb625f1c1fcea6183c03"/>
     <w:p>
       <w:pPr>
         <w:pStyle w:val="Heading4"/>
       </w:pPr>
       <w:r>
-        <w:t xml:space="preserve">a) El síntoma como compromiso y el sueño como modelo (T04)</w:t>
+        <w:t xml:space="preserve">a) El síntoma como compromiso y el sueño como modelo (Freud, 1917/1996b)</w:t>
       </w:r>
     </w:p>
     <w:p>
@@ -5495,13 +6108,13 @@
       </w:r>
     </w:p>
     <w:bookmarkEnd w:id="32"/>
-    <w:bookmarkStart w:id="33" w:name="X0435f6435f75e2d5b0e71382c96af336bea7003"/>
+    <w:bookmarkStart w:id="33" w:name="X89cffe4a6a4b5c92e8ec10290c33d61efb9648a"/>
     <w:p>
       <w:pPr>
         <w:pStyle w:val="Heading4"/>
       </w:pPr>
       <w:r>
-        <w:t xml:space="preserve">b) Dónde halla la libido sus fijaciones (T04)</w:t>
+        <w:t xml:space="preserve">b) Dónde halla la libido sus fijaciones (Freud, 1917/1996b)</w:t>
       </w:r>
     </w:p>
     <w:p>
@@ -5554,7 +6167,7 @@
         <w:t xml:space="preserve"> </w:t>
       </w:r>
       <w:r>
-        <w:t xml:space="preserve">(T04): el niño que mamó con avidez después muestra renuencia a beber leche, que crece hasta la repugnancia cuando tiene nata; la nata convocaría el recuerdo del pecho materno antaño ardientemente anhelado, y el destete tuvo efecto traumático. Ilustra cómo lo que fue satisfacción provoca hoy resistencia o repugnancia (parte del conflicto bajo cuya presión se formó el síntoma).</w:t>
+        <w:t xml:space="preserve">(Freud, 1917/1996b): el niño que mamó con avidez después muestra renuencia a beber leche, que crece hasta la repugnancia cuando tiene nata; la nata convocaría el recuerdo del pecho materno antaño ardientemente anhelado, y el destete tuvo efecto traumático. Ilustra cómo lo que fue satisfacción provoca hoy resistencia o repugnancia (parte del conflicto bajo cuya presión se formó el síntoma).</w:t>
       </w:r>
     </w:p>
     <w:p>
@@ -5576,7 +6189,7 @@
         <w:t xml:space="preserve"> </w:t>
       </w:r>
       <w:r>
-        <w:t xml:space="preserve">(T04): es irreconocible para la persona, que siente la presunta satisfacción como sufrimiento; casi siempre</w:t>
+        <w:t xml:space="preserve">(Freud, 1917/1996b): es irreconocible para la persona, que siente la presunta satisfacción como sufrimiento; casi siempre</w:t>
       </w:r>
       <w:r>
         <w:t xml:space="preserve"> </w:t>
@@ -5654,13 +6267,13 @@
       </w:r>
     </w:p>
     <w:bookmarkEnd w:id="33"/>
-    <w:bookmarkStart w:id="34" w:name="X7a81d951392bffef80becb5a47a755839edc418"/>
+    <w:bookmarkStart w:id="34" w:name="X597a0803da21eba832d8bbfd18a1ccec4fc45a4"/>
     <w:p>
       <w:pPr>
         <w:pStyle w:val="Heading4"/>
       </w:pPr>
       <w:r>
-        <w:t xml:space="preserve">c) Escenas infantiles: realidad material y realidad psíquica (T04)</w:t>
+        <w:t xml:space="preserve">c) Escenas infantiles: realidad material y realidad psíquica (Freud, 1917/1996b)</w:t>
       </w:r>
     </w:p>
     <w:p>
@@ -5784,7 +6397,7 @@
         <w:t xml:space="preserve"> </w:t>
       </w:r>
       <w:r>
-        <w:t xml:space="preserve">en la historia juvenil de los neuróticos (T04):</w:t>
+        <w:t xml:space="preserve">en la historia juvenil de los neuróticos (Freud, 1917/1996b):</w:t>
       </w:r>
       <w:r>
         <w:t xml:space="preserve"> </w:t>
@@ -5899,7 +6512,7 @@
         <w:t xml:space="preserve"> </w:t>
       </w:r>
       <w:r>
-        <w:t xml:space="preserve">«a menudo no es una fantasía, sino un recuerdo real», pero menos frecuente de lo que sugiere el análisis; la seducción por niños mayores o de la misma edad es más frecuente que la de adultos; en las niñas que acusan al padre es dudosa la naturaleza fantástica de esa inculpación y el motivo que la constriñe (T04). Con la fantasía de seducción</w:t>
+        <w:t xml:space="preserve">«a menudo no es una fantasía, sino un recuerdo real», pero menos frecuente de lo que sugiere el análisis; la seducción por niños mayores o de la misma edad es más frecuente que la de adultos; en las niñas que acusan al padre es dudosa la naturaleza fantástica de esa inculpación y el motivo que la constriñe (Freud, 1917/1996b). Con la fantasía de seducción</w:t>
       </w:r>
       <w:r>
         <w:t xml:space="preserve"> </w:t>
@@ -5934,7 +6547,7 @@
         <w:t xml:space="preserve"> </w:t>
       </w:r>
       <w:r>
-        <w:t xml:space="preserve">(T04): las mismas fantasías con idéntico contenido en todos los casos; su fuente está en las pulsiones, pero la uniformidad se explica porque son</w:t>
+        <w:t xml:space="preserve">(Freud, 1917/1996b): las mismas fantasías con idéntico contenido en todos los casos; su fuente está en las pulsiones, pero la uniformidad se explica porque son</w:t>
       </w:r>
       <w:r>
         <w:t xml:space="preserve"> </w:t>
@@ -5951,13 +6564,13 @@
       </w:r>
     </w:p>
     <w:bookmarkEnd w:id="34"/>
-    <w:bookmarkStart w:id="35" w:name="d-la-fantasía-y-la-introversión-t04"/>
+    <w:bookmarkStart w:id="35" w:name="X54cf9dbdeb717c14b01896347602849cb1758da"/>
     <w:p>
       <w:pPr>
         <w:pStyle w:val="Heading4"/>
       </w:pPr>
       <w:r>
-        <w:t xml:space="preserve">d) La fantasía y la introversión (T04)</w:t>
+        <w:t xml:space="preserve">d) La fantasía y la introversión (Freud, 1917/1996b)</w:t>
       </w:r>
     </w:p>
     <w:p>
@@ -6119,7 +6732,7 @@
         <w:t xml:space="preserve"> </w:t>
       </w:r>
       <w:r>
-        <w:t xml:space="preserve">y libradas a la atracción del inconsciente (T04).</w:t>
+        <w:t xml:space="preserve">y libradas a la atracción del inconsciente (Freud, 1917/1996b).</w:t>
       </w:r>
     </w:p>
     <w:p>
@@ -6163,17 +6776,17 @@
         <w:t xml:space="preserve"> </w:t>
       </w:r>
       <w:r>
-        <w:t xml:space="preserve">(T04): el artista es también un introvertido, cercano a la neurosis, con necesidades pulsionales hiperintensas (honores, riqueza, fama, amor); su constitución incluye una vigorosa facultad de sublimación y cierta flojedad de las represiones decisivas. Se las ingenia para elaborar sus sueños diurnos de modo que pierdan lo excesivamente personal y chocante, los atenúa para que no dejen traslucir su proveniencia de fuentes prohibidas, da forma a un material hasta hacerlo copia fiel de su fantasía y anuda a esa figuración una ganancia de placer tan grande que las represiones son doblegadas, al menos temporariamente. Así obtiene honor, poder y el amor de las mujeres.</w:t>
+        <w:t xml:space="preserve">(Freud, 1917/1996b): el artista es también un introvertido, cercano a la neurosis, con necesidades pulsionales hiperintensas (honores, riqueza, fama, amor); su constitución incluye una vigorosa facultad de sublimación y cierta flojedad de las represiones decisivas. Se las ingenia para elaborar sus sueños diurnos de modo que pierdan lo excesivamente personal y chocante, los atenúa para que no dejen traslucir su proveniencia de fuentes prohibidas, da forma a un material hasta hacerlo copia fiel de su fantasía y anuda a esa figuración una ganancia de placer tan grande que las represiones son doblegadas, al menos temporariamente. Así obtiene honor, poder y el amor de las mujeres.</w:t>
       </w:r>
     </w:p>
     <w:bookmarkEnd w:id="35"/>
-    <w:bookmarkStart w:id="36" w:name="X0badde2ead335d74f8641567cee372530e61c97"/>
+    <w:bookmarkStart w:id="36" w:name="X23c9ee9d175483f191bd704f693bbb2921f1ab9"/>
     <w:p>
       <w:pPr>
         <w:pStyle w:val="Heading4"/>
       </w:pPr>
       <w:r>
-        <w:t xml:space="preserve">e) El síntoma en la lectura de Belucci (T01, pp. 3-4, 39)</w:t>
+        <w:t xml:space="preserve">e) El síntoma en la lectura de Belucci (2014b, pp. 3-4, 39)</w:t>
       </w:r>
     </w:p>
     <w:p>
@@ -6282,7 +6895,7 @@
         <w:t xml:space="preserve"> </w:t>
       </w:r>
       <w:r>
-        <w:t xml:space="preserve">(T01, p. 3).</w:t>
+        <w:t xml:space="preserve">(Belucci, 2014b, p. 3).</w:t>
       </w:r>
     </w:p>
     <w:p>
@@ -6320,7 +6933,7 @@
         <w:t xml:space="preserve"> </w:t>
       </w:r>
       <w:r>
-        <w:t xml:space="preserve">hace al síntoma mucho más eficaz como respuesta; sin ese anclaje el quantum queda libre y hace síntoma del pensamiento o de la acción, y debe renovarse la lucha defensiva; en las fobias el estatuto del síntoma es más problemático, pues no logra relevar el desarrollo de angustia, de ahí la importancia de la respuesta inhibitoria (T01, p. 3).</w:t>
+        <w:t xml:space="preserve">hace al síntoma mucho más eficaz como respuesta; sin ese anclaje el quantum queda libre y hace síntoma del pensamiento o de la acción, y debe renovarse la lucha defensiva; en las fobias el estatuto del síntoma es más problemático, pues no logra relevar el desarrollo de angustia, de ahí la importancia de la respuesta inhibitoria (Belucci, 2014b, p. 3).</w:t>
       </w:r>
     </w:p>
     <w:p>
@@ -6342,7 +6955,7 @@
         <w:t xml:space="preserve"> </w:t>
       </w:r>
       <w:r>
-        <w:t xml:space="preserve">Freud advirtió temprano que el síntoma no resolvía el diagnóstico de qué modalidad de neurosis era; por eso ubicó el «síntoma primario» (T01, pp. 3-4).</w:t>
+        <w:t xml:space="preserve">Freud advirtió temprano que el síntoma no resolvía el diagnóstico de qué modalidad de neurosis era; por eso ubicó el «síntoma primario» (Belucci, 2014b, pp. 3-4).</w:t>
       </w:r>
     </w:p>
     <w:p>
@@ -6364,7 +6977,7 @@
         <w:t xml:space="preserve"> </w:t>
       </w:r>
       <w:r>
-        <w:t xml:space="preserve">(T01, p. 4) con los diques (moral, asco, vergüenza).</w:t>
+        <w:t xml:space="preserve">(Belucci, 2014b, p. 4) con los diques (moral, asco, vergüenza).</w:t>
       </w:r>
     </w:p>
     <w:p>
@@ -6386,7 +6999,7 @@
         <w:t xml:space="preserve"> </w:t>
       </w:r>
       <w:r>
-        <w:t xml:space="preserve">(T01, p. 4): la</w:t>
+        <w:t xml:space="preserve">(Belucci, 2014b, p. 4): la</w:t>
       </w:r>
       <w:r>
         <w:t xml:space="preserve"> </w:t>
@@ -6488,7 +7101,7 @@
         <w:t xml:space="preserve"> </w:t>
       </w:r>
       <w:r>
-        <w:t xml:space="preserve">(T01, p. 39): presente el síntoma, la angustia solo aparece como señal (más claro en la histeria, menos en la obsesiva; el síntoma fóbico es el que menos se ajusta). Si el síntoma suspende el desarrollo de angustia, es soporte o supone el soporte fantasmático. El síntoma se recorta en una escena «como algo que no anda» y</w:t>
+        <w:t xml:space="preserve">(Belucci, 2014b, p. 39): presente el síntoma, la angustia solo aparece como señal (más claro en la histeria, menos en la obsesiva; el síntoma fóbico es el que menos se ajusta). Si el síntoma suspende el desarrollo de angustia, es soporte o supone el soporte fantasmático. El síntoma se recorta en una escena «como algo que no anda» y</w:t>
       </w:r>
       <w:r>
         <w:t xml:space="preserve"> </w:t>
@@ -6583,14 +7196,14 @@
     <w:bookmarkEnd w:id="36"/>
     <w:bookmarkEnd w:id="37"/>
     <w:bookmarkEnd w:id="38"/>
-    <w:bookmarkStart w:id="39" w:name="X70329eeb086e9fd42d8e7b74809cbeb9fd95187"/>
+    <w:bookmarkStart w:id="39" w:name="X6c0a224527072c2b361739f7206c3e79bf17b12"/>
     <w:p>
       <w:pPr>
         <w:pStyle w:val="Heading2"/>
         <w:pageBreakBefore/>
       </w:pPr>
       <w:r>
-        <w:t xml:space="preserve">4. Estructura, defensa y diagnóstico (marco de la clase, T01 pp. 1-4 y apuntes)</w:t>
+        <w:t xml:space="preserve">4. Estructura, defensa y diagnóstico (marco de la clase, Belucci, 2014b, pp. 1-4 y apuntes)</w:t>
       </w:r>
     </w:p>
     <w:p>
@@ -6644,7 +7257,7 @@
         <w:t xml:space="preserve"> </w:t>
       </w:r>
       <w:r>
-        <w:t xml:space="preserve">(T01, p. 1). «Decir que un caso es una neurosis, o más específicamente una fobia, es decir algo fundamental y al mismo tiempo decir muy poco.»</w:t>
+        <w:t xml:space="preserve">(Belucci, 2014b, p. 1). «Decir que un caso es una neurosis, o más específicamente una fobia, es decir algo fundamental y al mismo tiempo decir muy poco.»</w:t>
       </w:r>
     </w:p>
     <w:p>
@@ -6763,7 +7376,7 @@
         <w:t xml:space="preserve"> </w:t>
       </w:r>
       <w:r>
-        <w:t xml:space="preserve">(T01, pp. 1-2).</w:t>
+        <w:t xml:space="preserve">(Belucci, 2014b, pp. 1-2).</w:t>
       </w:r>
     </w:p>
     <w:p>
@@ -6785,7 +7398,7 @@
         <w:t xml:space="preserve"> </w:t>
       </w:r>
       <w:r>
-        <w:t xml:space="preserve">(T01, p. 2):</w:t>
+        <w:t xml:space="preserve">(Belucci, 2014b, p. 2):</w:t>
       </w:r>
       <w:r>
         <w:t xml:space="preserve"> </w:t>
@@ -6859,7 +7472,7 @@
         <w:t xml:space="preserve">no son reversibles</w:t>
       </w:r>
       <w:r>
-        <w:t xml:space="preserve">: la condición de estructura delimita los márgenes de la respuesta; otro es el caso del trabajo con niños pequeños (T01, p. 2).</w:t>
+        <w:t xml:space="preserve">: la condición de estructura delimita los márgenes de la respuesta; otro es el caso del trabajo con niños pequeños (Belucci, 2014b, p. 2).</w:t>
       </w:r>
     </w:p>
     <w:p>
@@ -6881,7 +7494,7 @@
         <w:t xml:space="preserve"> </w:t>
       </w:r>
       <w:r>
-        <w:t xml:space="preserve">(T01, p. 3): la falta tiene carácter necesario por la Ley paterna; el sujeto solo puede preguntarse «¿Qué soy ahí?» / «¿Qué me quiere?». La pregunta es implícita; el sujeto se da respuestas (fantasma, ideales, yo). Las tres variantes: histeria, neurosis obsesiva y fobias.</w:t>
+        <w:t xml:space="preserve">(Belucci, 2014b, p. 3): la falta tiene carácter necesario por la Ley paterna; el sujeto solo puede preguntarse «¿Qué soy ahí?» / «¿Qué me quiere?». La pregunta es implícita; el sujeto se da respuestas (fantasma, ideales, yo). Las tres variantes: histeria, neurosis obsesiva y fobias.</w:t>
       </w:r>
     </w:p>
     <w:p>
@@ -7410,7 +8023,7 @@
         <w:t xml:space="preserve"> </w:t>
       </w:r>
       <w:r>
-        <w:t xml:space="preserve">(T02, p. 8).</w:t>
+        <w:t xml:space="preserve">(Freud, 1894/1996, p. 8).</w:t>
       </w:r>
     </w:p>
     <w:p>
@@ -7432,7 +8045,7 @@
         <w:t xml:space="preserve"> </w:t>
       </w:r>
       <w:r>
-        <w:t xml:space="preserve">no se explica por este mecanismo (T02, p. 14, nota).</w:t>
+        <w:t xml:space="preserve">no se explica por este mecanismo (Freud, 1894/1996, p. 14, nota).</w:t>
       </w:r>
     </w:p>
     <w:p>
@@ -7586,7 +8199,7 @@
               <w:jc w:val="left"/>
             </w:pPr>
             <w:r>
-              <w:t xml:space="preserve">El síntoma como respuesta a la angustia; la fantasía como eslabón (T04) retomada por Lacan</w:t>
+              <w:t xml:space="preserve">El síntoma como respuesta a la angustia; la fantasía como eslabón (Freud, 1917/1996b) retomada por Lacan</w:t>
             </w:r>
           </w:p>
         </w:tc>
@@ -7786,7 +8399,7 @@
               <w:jc w:val="left"/>
             </w:pPr>
             <w:r>
-              <w:t xml:space="preserve">Carácter de una representación/vivencia que despierta un afecto tan penoso que el yo no puede conciliarla con su vida de representaciones (T02, p. 5)</w:t>
+              <w:t xml:space="preserve">Carácter de una representación/vivencia que despierta un afecto tan penoso que el yo no puede conciliarla con su vida de representaciones (Freud, 1894/1996, p. 5)</w:t>
             </w:r>
           </w:p>
         </w:tc>
@@ -7816,7 +8429,7 @@
               <w:jc w:val="left"/>
             </w:pPr>
             <w:r>
-              <w:t xml:space="preserve">Operación del yo contra la representación inconciliable; primero concepto freudiano (1894), luego equivalente a represión, ampliado en 1926 (T03, p. 1)</w:t>
+              <w:t xml:space="preserve">Operación del yo contra la representación inconciliable; primero concepto freudiano (1894), luego equivalente a represión, ampliado en 1926 (Belucci, s. f.-c, p. 1)</w:t>
             </w:r>
           </w:p>
         </w:tc>
@@ -7846,7 +8459,7 @@
               <w:jc w:val="left"/>
             </w:pPr>
             <w:r>
-              <w:t xml:space="preserve">Trasposición de la suma de excitación a lo corporal; rasgo característico de la histeria (T02, pp. 6-8)</w:t>
+              <w:t xml:space="preserve">Trasposición de la suma de excitación a lo corporal; rasgo característico de la histeria (Freud, 1894/1996, pp. 6-8)</w:t>
             </w:r>
           </w:p>
         </w:tc>
@@ -7876,7 +8489,7 @@
               <w:jc w:val="left"/>
             </w:pPr>
             <w:r>
-              <w:t xml:space="preserve">Adhesión del afecto liberado a otra representación no inconciliable; origen de la representación obsesiva (T02, p. 9)</w:t>
+              <w:t xml:space="preserve">Adhesión del afecto liberado a otra representación no inconciliable; origen de la representación obsesiva (Freud, 1894/1996, p. 9)</w:t>
             </w:r>
           </w:p>
         </w:tc>
@@ -7922,7 +8535,7 @@
               <w:jc w:val="left"/>
             </w:pPr>
             <w:r>
-              <w:t xml:space="preserve">Rechazo de la representación con su afecto; conduce a psicosis alucinatoria (T02, p. 15)</w:t>
+              <w:t xml:space="preserve">Rechazo de la representación con su afecto; conduce a psicosis alucinatoria (Freud, 1894/1996, p. 15)</w:t>
             </w:r>
           </w:p>
         </w:tc>
@@ -7952,7 +8565,7 @@
               <w:jc w:val="left"/>
             </w:pPr>
             <w:r>
-              <w:t xml:space="preserve">Marca constitutiva de la defensa (Manuscrito K), independiente de síntomas clínicos (T01, p. 4)</w:t>
+              <w:t xml:space="preserve">Marca constitutiva de la defensa (Manuscrito K), independiente de síntomas clínicos (Belucci, 2014b, p. 4)</w:t>
             </w:r>
           </w:p>
         </w:tc>
@@ -7982,7 +8595,7 @@
               <w:jc w:val="left"/>
             </w:pPr>
             <w:r>
-              <w:t xml:space="preserve">Acceso a la conciencia de lo reprimido por un sustituto (T03, p. 3)</w:t>
+              <w:t xml:space="preserve">Acceso a la conciencia de lo reprimido por un sustituto (Belucci, s. f.-c, p. 3)</w:t>
             </w:r>
           </w:p>
         </w:tc>
@@ -8012,7 +8625,7 @@
               <w:jc w:val="left"/>
             </w:pPr>
             <w:r>
-              <w:t xml:space="preserve">Esquema causal: constitución + vivenciar infantil → fijación; fijación + vivenciar accidental → neurosis (T04)</w:t>
+              <w:t xml:space="preserve">Esquema causal: constitución + vivenciar infantil → fijación; fijación + vivenciar accidental → neurosis (Freud, 1917/1996b)</w:t>
             </w:r>
           </w:p>
         </w:tc>
@@ -8042,7 +8655,7 @@
               <w:jc w:val="left"/>
             </w:pPr>
             <w:r>
-              <w:t xml:space="preserve">Inmovilización de un monto de libido en un punto del desarrollo (T03, p. 4; T04)</w:t>
+              <w:t xml:space="preserve">Inmovilización de un monto de libido en un punto del desarrollo (Belucci, s. f.-c, p. 4; Freud, 1917/1996b)</w:t>
             </w:r>
           </w:p>
         </w:tc>
@@ -8072,7 +8685,7 @@
               <w:jc w:val="left"/>
             </w:pPr>
             <w:r>
-              <w:t xml:space="preserve">«Mal funcionamiento»: una colocación libidinal antes posible deja de serlo (T01, p. 36)</w:t>
+              <w:t xml:space="preserve">«Mal funcionamiento»: una colocación libidinal antes posible deja de serlo (Belucci, 2014b, p. 36)</w:t>
             </w:r>
           </w:p>
         </w:tc>
@@ -8102,7 +8715,7 @@
               <w:jc w:val="left"/>
             </w:pPr>
             <w:r>
-              <w:t xml:space="preserve">Retorno a modos de funcionamiento y satisfacción anteriores (T03, p. 3)</w:t>
+              <w:t xml:space="preserve">Retorno a modos de funcionamiento y satisfacción anteriores (Belucci, s. f.-c, p. 3)</w:t>
             </w:r>
           </w:p>
         </w:tc>
@@ -8132,7 +8745,7 @@
               <w:jc w:val="left"/>
             </w:pPr>
             <w:r>
-              <w:t xml:space="preserve">Extrañamiento de la libido de la satisfacción real y sobreinvestidura de fantasías (T04)</w:t>
+              <w:t xml:space="preserve">Extrañamiento de la libido de la satisfacción real y sobreinvestidura de fantasías (Freud, 1917/1996b)</w:t>
             </w:r>
           </w:p>
         </w:tc>
@@ -8162,7 +8775,7 @@
               <w:jc w:val="left"/>
             </w:pPr>
             <w:r>
-              <w:t xml:space="preserve">Realidad de la fantasía, decisiva en el mundo de las neurosis (T04)</w:t>
+              <w:t xml:space="preserve">Realidad de la fantasía, decisiva en el mundo de las neurosis (Freud, 1917/1996b)</w:t>
             </w:r>
           </w:p>
         </w:tc>
@@ -8192,7 +8805,7 @@
               <w:jc w:val="left"/>
             </w:pPr>
             <w:r>
-              <w:t xml:space="preserve">Seducción, escena primordial, castración: patrimonio filogenético (T04)</w:t>
+              <w:t xml:space="preserve">Seducción, escena primordial, castración: patrimonio filogenético (Freud, 1917/1996b)</w:t>
             </w:r>
           </w:p>
         </w:tc>
@@ -8358,7 +8971,7 @@
         </w:numPr>
       </w:pPr>
       <w:r>
-        <w:t xml:space="preserve">Diferenciá, con T02, los tres destinos del afecto (histeria, obsesión/fobia, psicosis).</w:t>
+        <w:t xml:space="preserve">Diferenciá, con Freud (1894/1996), los tres destinos del afecto (histeria, obsesión/fobia, psicosis).</w:t>
       </w:r>
     </w:p>
     <w:bookmarkEnd w:id="47"/>

</xml_diff>